<commit_message>
(chore): minor report changes...
</commit_message>
<xml_diff>
--- a/Generative_AI_Analysis_Report.docx
+++ b/Generative_AI_Analysis_Report.docx
@@ -1,15 +1,13 @@
 
 <file path=word/document.xml><?xml version="1.0" encoding="utf-8"?>
-<w:document xmlns:o="urn:schemas-microsoft-com:office:office" xmlns:r="http://schemas.openxmlformats.org/officeDocument/2006/relationships" xmlns:v="urn:schemas-microsoft-com:vml" xmlns:w="http://schemas.openxmlformats.org/wordprocessingml/2006/main" xmlns:w10="urn:schemas-microsoft-com:office:word" xmlns:wp="http://schemas.openxmlformats.org/drawingml/2006/wordprocessingDrawing" xmlns:wps="http://schemas.microsoft.com/office/word/2010/wordprocessingShape" xmlns:wpg="http://schemas.microsoft.com/office/word/2010/wordprocessingGroup" xmlns:mc="http://schemas.openxmlformats.org/markup-compatibility/2006" xmlns:wp14="http://schemas.microsoft.com/office/word/2010/wordprocessingDrawing" xmlns:w14="http://schemas.microsoft.com/office/word/2010/wordml" xmlns:w15="http://schemas.microsoft.com/office/word/2012/wordml" mc:Ignorable="w14 wp14 w15">
+<w:document xmlns:wpc="http://schemas.microsoft.com/office/word/2010/wordprocessingCanvas" xmlns:cx="http://schemas.microsoft.com/office/drawing/2014/chartex" xmlns:cx1="http://schemas.microsoft.com/office/drawing/2015/9/8/chartex" xmlns:cx2="http://schemas.microsoft.com/office/drawing/2015/10/21/chartex" xmlns:cx3="http://schemas.microsoft.com/office/drawing/2016/5/9/chartex" xmlns:cx4="http://schemas.microsoft.com/office/drawing/2016/5/10/chartex" xmlns:cx5="http://schemas.microsoft.com/office/drawing/2016/5/11/chartex" xmlns:cx6="http://schemas.microsoft.com/office/drawing/2016/5/12/chartex" xmlns:cx7="http://schemas.microsoft.com/office/drawing/2016/5/13/chartex" xmlns:cx8="http://schemas.microsoft.com/office/drawing/2016/5/14/chartex" xmlns:mc="http://schemas.openxmlformats.org/markup-compatibility/2006" xmlns:aink="http://schemas.microsoft.com/office/drawing/2016/ink" xmlns:am3d="http://schemas.microsoft.com/office/drawing/2017/model3d" xmlns:o="urn:schemas-microsoft-com:office:office" xmlns:oel="http://schemas.microsoft.com/office/2019/extlst" xmlns:r="http://schemas.openxmlformats.org/officeDocument/2006/relationships" xmlns:m="http://schemas.openxmlformats.org/officeDocument/2006/math" xmlns:v="urn:schemas-microsoft-com:vml" xmlns:wp14="http://schemas.microsoft.com/office/word/2010/wordprocessingDrawing" xmlns:wp="http://schemas.openxmlformats.org/drawingml/2006/wordprocessingDrawing" xmlns:w10="urn:schemas-microsoft-com:office:word" xmlns:w="http://schemas.openxmlformats.org/wordprocessingml/2006/main" xmlns:w14="http://schemas.microsoft.com/office/word/2010/wordml" xmlns:w15="http://schemas.microsoft.com/office/word/2012/wordml" xmlns:w16cex="http://schemas.microsoft.com/office/word/2018/wordml/cex" xmlns:w16cid="http://schemas.microsoft.com/office/word/2016/wordml/cid" xmlns:w16="http://schemas.microsoft.com/office/word/2018/wordml" xmlns:w16du="http://schemas.microsoft.com/office/word/2023/wordml/word16du" xmlns:w16sdtdh="http://schemas.microsoft.com/office/word/2020/wordml/sdtdatahash" xmlns:w16sdtfl="http://schemas.microsoft.com/office/word/2024/wordml/sdtformatlock" xmlns:w16se="http://schemas.microsoft.com/office/word/2015/wordml/symex" xmlns:wpg="http://schemas.microsoft.com/office/word/2010/wordprocessingGroup" xmlns:wpi="http://schemas.microsoft.com/office/word/2010/wordprocessingInk" xmlns:wne="http://schemas.microsoft.com/office/word/2006/wordml" xmlns:wps="http://schemas.microsoft.com/office/word/2010/wordprocessingShape" mc:Ignorable="w14 w15 w16se w16cid w16 w16cex w16sdtdh w16sdtfl w16du wp14">
   <w:body>
     <w:p>
       <w:pPr>
-        <w:pStyle w:val="Normal"/>
         <w:tabs>
-          <w:tab w:val="clear" w:pos="720"/>
-          <w:tab w:val="left" w:pos="1440" w:leader="none"/>
+          <w:tab w:val="left" w:pos="1440"/>
         </w:tabs>
-        <w:spacing w:lineRule="auto" w:line="480" w:before="3600" w:after="0"/>
+        <w:spacing w:before="3600" w:line="480" w:lineRule="auto"/>
         <w:jc w:val="center"/>
         <w:rPr>
           <w:b/>
@@ -24,80 +22,55 @@
     </w:p>
     <w:p>
       <w:pPr>
-        <w:pStyle w:val="Normal"/>
-        <w:spacing w:lineRule="auto" w:line="480"/>
+        <w:spacing w:line="480" w:lineRule="auto"/>
         <w:jc w:val="center"/>
-        <w:rPr/>
-      </w:pPr>
-      <w:r>
-        <w:rPr/>
-      </w:r>
-    </w:p>
-    <w:p>
-      <w:pPr>
-        <w:pStyle w:val="Normal"/>
-        <w:spacing w:lineRule="auto" w:line="480"/>
+      </w:pPr>
+    </w:p>
+    <w:p>
+      <w:pPr>
+        <w:spacing w:line="480" w:lineRule="auto"/>
         <w:jc w:val="center"/>
-        <w:rPr/>
-      </w:pPr>
-      <w:r>
-        <w:rPr/>
+      </w:pPr>
+      <w:r>
         <w:t>Gene Foxwell</w:t>
       </w:r>
     </w:p>
     <w:p>
       <w:pPr>
-        <w:pStyle w:val="Normal"/>
-        <w:spacing w:lineRule="auto" w:line="480"/>
+        <w:spacing w:line="480" w:lineRule="auto"/>
         <w:jc w:val="center"/>
-        <w:rPr/>
-      </w:pPr>
-      <w:r>
-        <w:rPr/>
+      </w:pPr>
+      <w:r>
         <w:t>Woolf University / Udacity School of Artificial Intelligence</w:t>
       </w:r>
     </w:p>
     <w:p>
       <w:pPr>
-        <w:pStyle w:val="Normal"/>
-        <w:spacing w:lineRule="auto" w:line="480"/>
+        <w:spacing w:line="480" w:lineRule="auto"/>
         <w:jc w:val="center"/>
-        <w:rPr/>
-      </w:pPr>
-      <w:r>
-        <w:rPr/>
+      </w:pPr>
+      <w:r>
         <w:t>Generative AI Applications</w:t>
       </w:r>
     </w:p>
     <w:p>
       <w:pPr>
-        <w:pStyle w:val="Normal"/>
-        <w:spacing w:lineRule="auto" w:line="480"/>
+        <w:spacing w:line="480" w:lineRule="auto"/>
         <w:jc w:val="center"/>
-        <w:rPr/>
-      </w:pPr>
-      <w:r>
-        <w:rPr/>
-      </w:r>
-    </w:p>
-    <w:p>
-      <w:pPr>
-        <w:pStyle w:val="Normal"/>
-        <w:spacing w:lineRule="auto" w:line="480"/>
+      </w:pPr>
+    </w:p>
+    <w:p>
+      <w:pPr>
+        <w:spacing w:line="480" w:lineRule="auto"/>
         <w:jc w:val="center"/>
-        <w:rPr/>
-      </w:pPr>
-      <w:r>
-        <w:rPr/>
-      </w:r>
+      </w:pPr>
       <w:r>
         <w:br w:type="page"/>
       </w:r>
     </w:p>
     <w:p>
       <w:pPr>
-        <w:pStyle w:val="Normal"/>
-        <w:spacing w:lineRule="auto" w:line="480" w:before="0" w:after="0"/>
+        <w:spacing w:line="480" w:lineRule="auto"/>
         <w:jc w:val="center"/>
         <w:rPr>
           <w:b/>
@@ -107,13 +80,13 @@
         <w:rPr>
           <w:b/>
         </w:rPr>
+        <w:lastRenderedPageBreak/>
         <w:t xml:space="preserve"> </w:t>
       </w:r>
     </w:p>
     <w:p>
       <w:pPr>
-        <w:pStyle w:val="Normal"/>
-        <w:spacing w:lineRule="auto" w:line="480"/>
+        <w:spacing w:line="480" w:lineRule="auto"/>
         <w:jc w:val="center"/>
         <w:rPr>
           <w:b/>
@@ -128,31 +101,22 @@
     </w:p>
     <w:p>
       <w:pPr>
-        <w:pStyle w:val="Normal"/>
-        <w:spacing w:lineRule="auto" w:line="480"/>
-        <w:ind w:firstLine="720"/>
-        <w:rPr/>
-      </w:pPr>
-      <w:r>
-        <w:rPr/>
+        <w:spacing w:line="480" w:lineRule="auto"/>
+        <w:ind w:firstLine="720"/>
+      </w:pPr>
+      <w:r>
         <w:t>This project looks at applying Transformer architecture to generate trajectories to solve the ADROIT Hand Relocate Reinforcement Learning problem. We will approach this problem using the human generated trajectories in D4RL dataset. We’ll explain this dataset how our model design was done, as well as our training approach. We will also cover the various methods we employed to work around the limited number of trajectories available in the dataset. Finally, we’ll discuss ethical / bias considerations for this model and future steps for improvement.</w:t>
       </w:r>
     </w:p>
     <w:p>
       <w:pPr>
-        <w:pStyle w:val="Normal"/>
-        <w:spacing w:lineRule="auto" w:line="480"/>
-        <w:ind w:firstLine="720"/>
-        <w:rPr/>
-      </w:pPr>
-      <w:r>
-        <w:rPr/>
-      </w:r>
-    </w:p>
-    <w:p>
-      <w:pPr>
-        <w:pStyle w:val="Normal"/>
-        <w:spacing w:lineRule="auto" w:line="480"/>
+        <w:spacing w:line="480" w:lineRule="auto"/>
+        <w:ind w:firstLine="720"/>
+      </w:pPr>
+    </w:p>
+    <w:p>
+      <w:pPr>
+        <w:spacing w:line="480" w:lineRule="auto"/>
         <w:jc w:val="center"/>
         <w:rPr>
           <w:b/>
@@ -167,16 +131,13 @@
     </w:p>
     <w:p>
       <w:pPr>
-        <w:pStyle w:val="Normal"/>
-        <w:spacing w:lineRule="auto" w:line="480"/>
-        <w:ind w:firstLine="720"/>
-        <w:rPr/>
-      </w:pPr>
-      <w:r>
-        <w:rPr/>
+        <w:spacing w:line="480" w:lineRule="auto"/>
+        <w:ind w:firstLine="720"/>
+      </w:pPr>
+      <w:r>
         <w:t xml:space="preserve">We approached this problem using human data generated (reference D4RL) from the </w:t>
       </w:r>
-      <w:hyperlink r:id="rId2">
+      <w:hyperlink r:id="rId7">
         <w:r>
           <w:rPr>
             <w:rStyle w:val="Hyperlink"/>
@@ -185,91 +146,50 @@
         </w:r>
       </w:hyperlink>
       <w:r>
-        <w:rPr/>
-        <w:t xml:space="preserve"> (reference ADROIT PAPER). In the ADROIT Relocate problem, a 24 DoF robotic hand is tasked with picking up a small ball off a table and placing it down at a target location.  We control the hand by providing a sequence of joint angles for each of the actuators as well as positional / rotational angles for the hand’s overall location in the world. For this problem, the D4RL group collected 25 human generated trajectories using a virtual environment combined with a CyberGlove (FOOTNOTE) apparatus for input.</w:t>
-      </w:r>
-    </w:p>
-    <w:p>
-      <w:pPr>
-        <w:pStyle w:val="Normal"/>
-        <w:spacing w:lineRule="auto" w:line="480"/>
-        <w:ind w:firstLine="720"/>
-        <w:rPr/>
-      </w:pPr>
-      <w:r>
-        <w:rPr/>
+        <w:t xml:space="preserve"> (reference ADROIT PAPER). In the ADROIT Relocate problem, a 24 </w:t>
+      </w:r>
+      <w:proofErr w:type="spellStart"/>
+      <w:r>
+        <w:t>DoF</w:t>
+      </w:r>
+      <w:proofErr w:type="spellEnd"/>
+      <w:r>
+        <w:t xml:space="preserve"> robotic hand is tasked with picking up a small ball off a table and placing it down at a target location.  We control the hand by providing a sequence of joint angles for each of the actuators as well as positional / rotational angles for the hand’s overall location in the world. For this problem, the D4RL group collected 25 human generated trajectories using a virtual environment combined with a </w:t>
+      </w:r>
+      <w:proofErr w:type="spellStart"/>
+      <w:r>
+        <w:t>CyberGlove</w:t>
+      </w:r>
+      <w:proofErr w:type="spellEnd"/>
+      <w:r>
+        <w:t xml:space="preserve"> (FOOTNOTE) apparatus for input.</w:t>
+      </w:r>
+    </w:p>
+    <w:p>
+      <w:pPr>
+        <w:spacing w:line="480" w:lineRule="auto"/>
+        <w:ind w:firstLine="720"/>
+      </w:pPr>
+      <w:r>
         <w:t>Each trajectory in the dataset has three key pieces of information:</w:t>
       </w:r>
     </w:p>
     <w:p>
       <w:pPr>
-        <w:pStyle w:val="Normal"/>
-        <w:spacing w:lineRule="auto" w:line="480"/>
-        <w:ind w:firstLine="720"/>
-        <w:rPr/>
-      </w:pPr>
-      <w:r>
-        <w:rPr/>
-      </w:r>
-    </w:p>
-    <w:p>
-      <w:pPr>
-        <w:pStyle w:val="Normal"/>
-        <w:spacing w:lineRule="auto" w:line="480"/>
-        <w:ind w:firstLine="720"/>
-        <w:rPr>
-          <w:b/>
-          <w:bCs/>
-          <w:i/>
-          <w:i/>
-          <w:iCs/>
-        </w:rPr>
-      </w:pPr>
-      <w:r>
+        <w:spacing w:line="480" w:lineRule="auto"/>
+        <w:ind w:firstLine="720"/>
+      </w:pPr>
+    </w:p>
+    <w:p>
+      <w:pPr>
+        <w:spacing w:line="480" w:lineRule="auto"/>
+        <w:ind w:firstLine="720"/>
         <w:rPr>
           <w:b/>
           <w:bCs/>
           <w:i/>
           <w:iCs/>
         </w:rPr>
-        <w:t xml:space="preserve">Actions: </w:t>
-      </w:r>
-    </w:p>
-    <w:p>
-      <w:pPr>
-        <w:pStyle w:val="Normal"/>
-        <w:spacing w:lineRule="auto" w:line="480"/>
-        <w:ind w:firstLine="720"/>
-        <w:rPr/>
-      </w:pPr>
-      <w:r>
-        <w:rPr/>
-        <w:t>As mentioned earlier, actions represent joint angles for the ADROIT Hand. Our system will learn to generate sequences of actions using a Transformer model. Actions are represented as a 30-dimensional vector space. These represent the 24 DoF for the hands – 4 DoF for the First, Middle, and Ring Fings, 5 DoF for the Little Finger, Thumb, 2 DoF for the write, 3 values for the hand’s global location (centered at the palm) and 3 values for the hand’s global rotation. All inputs are clipped between [-1, 1].</w:t>
-      </w:r>
-    </w:p>
-    <w:p>
-      <w:pPr>
-        <w:pStyle w:val="Normal"/>
-        <w:spacing w:lineRule="auto" w:line="480"/>
-        <w:ind w:firstLine="720"/>
-        <w:rPr/>
-      </w:pPr>
-      <w:r>
-        <w:rPr/>
-      </w:r>
-    </w:p>
-    <w:p>
-      <w:pPr>
-        <w:pStyle w:val="Normal"/>
-        <w:spacing w:lineRule="auto" w:line="480"/>
-        <w:ind w:firstLine="720"/>
-        <w:rPr>
-          <w:b/>
-          <w:bCs/>
-          <w:i/>
-          <w:i/>
-          <w:iCs/>
-        </w:rPr>
       </w:pPr>
       <w:r>
         <w:rPr>
@@ -278,41 +198,103 @@
           <w:i/>
           <w:iCs/>
         </w:rPr>
-        <w:t>Observations:</w:t>
-      </w:r>
-    </w:p>
-    <w:p>
-      <w:pPr>
-        <w:pStyle w:val="Normal"/>
-        <w:spacing w:lineRule="auto" w:line="480"/>
-        <w:ind w:firstLine="720"/>
-        <w:rPr/>
-      </w:pPr>
-      <w:r>
-        <w:rPr/>
-        <w:t>Observations are represented as 39-dimensional vectors. This observation space contains information about the hands current state (the same states used to represent the hand for actions). In addition, it has 3 entries representing the difference in position between the palm of the hand and the target, 3 entries representing the difference in position between the palm of the hand and the target, and 3 entries representing the difference in position between the ball and the target.</w:t>
-      </w:r>
-    </w:p>
-    <w:p>
-      <w:pPr>
-        <w:pStyle w:val="Normal"/>
-        <w:spacing w:lineRule="auto" w:line="480"/>
-        <w:ind w:firstLine="720"/>
-        <w:rPr/>
-      </w:pPr>
-      <w:r>
-        <w:rPr/>
-      </w:r>
-    </w:p>
-    <w:p>
-      <w:pPr>
-        <w:pStyle w:val="Normal"/>
-        <w:spacing w:lineRule="auto" w:line="480"/>
+        <w:t xml:space="preserve">Actions: </w:t>
+      </w:r>
+    </w:p>
+    <w:p>
+      <w:pPr>
+        <w:spacing w:line="480" w:lineRule="auto"/>
+        <w:ind w:firstLine="720"/>
+      </w:pPr>
+      <w:r>
+        <w:t xml:space="preserve">As mentioned earlier, actions represent joint angles for the ADROIT Hand. Our system will learn to generate sequences of actions using a Transformer model. Actions are represented as a 30-dimensional vector space. These represent the 24 </w:t>
+      </w:r>
+      <w:proofErr w:type="spellStart"/>
+      <w:r>
+        <w:t>DoF</w:t>
+      </w:r>
+      <w:proofErr w:type="spellEnd"/>
+      <w:r>
+        <w:t xml:space="preserve"> for the hands – 4 </w:t>
+      </w:r>
+      <w:proofErr w:type="spellStart"/>
+      <w:r>
+        <w:t>DoF</w:t>
+      </w:r>
+      <w:proofErr w:type="spellEnd"/>
+      <w:r>
+        <w:t xml:space="preserve"> for the First, </w:t>
+      </w:r>
+      <w:r>
+        <w:lastRenderedPageBreak/>
+        <w:t xml:space="preserve">Middle, and Ring Fings, 5 </w:t>
+      </w:r>
+      <w:proofErr w:type="spellStart"/>
+      <w:r>
+        <w:t>DoF</w:t>
+      </w:r>
+      <w:proofErr w:type="spellEnd"/>
+      <w:r>
+        <w:t xml:space="preserve"> for the Little Finger, Thumb, 2 </w:t>
+      </w:r>
+      <w:proofErr w:type="spellStart"/>
+      <w:r>
+        <w:t>DoF</w:t>
+      </w:r>
+      <w:proofErr w:type="spellEnd"/>
+      <w:r>
+        <w:t xml:space="preserve"> for the write, 3 values for the hand’s global location (centered at the palm) and 3 values for the hand’s global rotation. All inputs are clipped between [-1, 1].</w:t>
+      </w:r>
+    </w:p>
+    <w:p>
+      <w:pPr>
+        <w:spacing w:line="480" w:lineRule="auto"/>
+        <w:ind w:firstLine="720"/>
+      </w:pPr>
+    </w:p>
+    <w:p>
+      <w:pPr>
+        <w:spacing w:line="480" w:lineRule="auto"/>
         <w:ind w:firstLine="720"/>
         <w:rPr>
           <w:b/>
           <w:bCs/>
           <w:i/>
+          <w:iCs/>
+        </w:rPr>
+      </w:pPr>
+      <w:r>
+        <w:rPr>
+          <w:b/>
+          <w:bCs/>
+          <w:i/>
+          <w:iCs/>
+        </w:rPr>
+        <w:t>Observations:</w:t>
+      </w:r>
+    </w:p>
+    <w:p>
+      <w:pPr>
+        <w:spacing w:line="480" w:lineRule="auto"/>
+        <w:ind w:firstLine="720"/>
+      </w:pPr>
+      <w:r>
+        <w:t>Observations are represented as 39-dimensional vectors. This observation space contains information about the hands current state (the same states used to represent the hand for actions). In addition, it has 3 entries representing the difference in position between the palm of the hand and the target, 3 entries representing the difference in position between the palm of the hand and the target, and 3 entries representing the difference in position between the ball and the target.</w:t>
+      </w:r>
+    </w:p>
+    <w:p>
+      <w:pPr>
+        <w:spacing w:line="480" w:lineRule="auto"/>
+        <w:ind w:firstLine="720"/>
+      </w:pPr>
+    </w:p>
+    <w:p>
+      <w:pPr>
+        <w:spacing w:line="480" w:lineRule="auto"/>
+        <w:ind w:firstLine="720"/>
+        <w:rPr>
+          <w:b/>
+          <w:bCs/>
           <w:i/>
           <w:iCs/>
         </w:rPr>
@@ -334,11 +316,9 @@
           <w:ilvl w:val="0"/>
           <w:numId w:val="1"/>
         </w:numPr>
-        <w:spacing w:lineRule="auto" w:line="480"/>
-        <w:rPr/>
-      </w:pPr>
-      <w:r>
-        <w:rPr/>
+        <w:spacing w:line="480" w:lineRule="auto"/>
+      </w:pPr>
+      <w:r>
         <w:t>Rewards offered by the Human generated dataset are heavily shaped. At each step, the environment provides the following rewards:</w:t>
       </w:r>
     </w:p>
@@ -349,11 +329,9 @@
           <w:ilvl w:val="0"/>
           <w:numId w:val="1"/>
         </w:numPr>
-        <w:spacing w:lineRule="auto" w:line="480"/>
-        <w:rPr/>
-      </w:pPr>
-      <w:r>
-        <w:rPr/>
+        <w:spacing w:line="480" w:lineRule="auto"/>
+      </w:pPr>
+      <w:r>
         <w:t>Increase negative reward the further the hand is from the ball.</w:t>
       </w:r>
     </w:p>
@@ -364,11 +342,9 @@
           <w:ilvl w:val="0"/>
           <w:numId w:val="1"/>
         </w:numPr>
-        <w:spacing w:lineRule="auto" w:line="480"/>
-        <w:rPr/>
-      </w:pPr>
-      <w:r>
-        <w:rPr/>
+        <w:spacing w:line="480" w:lineRule="auto"/>
+      </w:pPr>
+      <w:r>
         <w:t>A reward of 1 if the ball is off the table.</w:t>
       </w:r>
     </w:p>
@@ -379,11 +355,9 @@
           <w:ilvl w:val="0"/>
           <w:numId w:val="1"/>
         </w:numPr>
-        <w:spacing w:lineRule="auto" w:line="480"/>
-        <w:rPr/>
-      </w:pPr>
-      <w:r>
-        <w:rPr/>
+        <w:spacing w:line="480" w:lineRule="auto"/>
+      </w:pPr>
+      <w:r>
         <w:t>A negative reward representing how far the ball is from the target when the ball is in hand.</w:t>
       </w:r>
     </w:p>
@@ -394,46 +368,34 @@
           <w:ilvl w:val="0"/>
           <w:numId w:val="1"/>
         </w:numPr>
-        <w:spacing w:lineRule="auto" w:line="480"/>
-        <w:rPr/>
-      </w:pPr>
-      <w:r>
-        <w:rPr/>
+        <w:spacing w:line="480" w:lineRule="auto"/>
+      </w:pPr>
+      <w:r>
         <w:t>A reward of 10 when the ball is close to the target (less than 0.1 meters)</w:t>
       </w:r>
     </w:p>
     <w:p>
       <w:pPr>
-        <w:pStyle w:val="Normal"/>
-        <w:spacing w:lineRule="auto" w:line="480"/>
-        <w:ind w:firstLine="720"/>
-        <w:rPr/>
-      </w:pPr>
-      <w:r>
-        <w:rPr/>
-      </w:r>
-    </w:p>
-    <w:p>
-      <w:pPr>
-        <w:pStyle w:val="Normal"/>
-        <w:spacing w:lineRule="auto" w:line="480"/>
-        <w:ind w:firstLine="720"/>
-        <w:rPr/>
-      </w:pPr>
-      <w:r>
-        <w:rPr/>
+        <w:spacing w:line="480" w:lineRule="auto"/>
+        <w:ind w:firstLine="720"/>
+      </w:pPr>
+    </w:p>
+    <w:p>
+      <w:pPr>
+        <w:spacing w:line="480" w:lineRule="auto"/>
+        <w:ind w:firstLine="720"/>
+      </w:pPr>
+      <w:r>
         <w:t xml:space="preserve">Each trajectory had between [M, N] steps, for a total of K total recorded (observation, action, reward) triplets recorded from the humans’ interactions with the environment. </w:t>
       </w:r>
     </w:p>
     <w:p>
       <w:pPr>
-        <w:pStyle w:val="Normal"/>
-        <w:spacing w:lineRule="auto" w:line="480"/>
-        <w:ind w:firstLine="720"/>
-        <w:rPr/>
-      </w:pPr>
-      <w:r>
-        <w:rPr/>
+        <w:spacing w:line="480" w:lineRule="auto"/>
+        <w:ind w:firstLine="720"/>
+      </w:pPr>
+      <w:r>
+        <w:lastRenderedPageBreak/>
         <w:t>Before training our Transformer, we preprocessed the dataset. Our preprocessing involved the following steps:</w:t>
       </w:r>
     </w:p>
@@ -444,11 +406,9 @@
           <w:ilvl w:val="0"/>
           <w:numId w:val="2"/>
         </w:numPr>
-        <w:spacing w:lineRule="auto" w:line="480"/>
-        <w:rPr/>
-      </w:pPr>
-      <w:r>
-        <w:rPr/>
+        <w:spacing w:line="480" w:lineRule="auto"/>
+      </w:pPr>
+      <w:r>
         <w:t xml:space="preserve">Created a timestamp array for each trajectory. </w:t>
       </w:r>
     </w:p>
@@ -459,12 +419,18 @@
           <w:ilvl w:val="0"/>
           <w:numId w:val="2"/>
         </w:numPr>
-        <w:spacing w:lineRule="auto" w:line="480"/>
-        <w:rPr/>
-      </w:pPr>
-      <w:r>
-        <w:rPr/>
-        <w:t>Calculated “returns_to_go” – the cumulative reward for each timestep of a trajectory.</w:t>
+        <w:spacing w:line="480" w:lineRule="auto"/>
+      </w:pPr>
+      <w:r>
+        <w:t>Calculated “</w:t>
+      </w:r>
+      <w:proofErr w:type="spellStart"/>
+      <w:r>
+        <w:t>returns_to_go</w:t>
+      </w:r>
+      <w:proofErr w:type="spellEnd"/>
+      <w:r>
+        <w:t>” – the cumulative reward for each timestep of a trajectory.</w:t>
       </w:r>
     </w:p>
     <w:p>
@@ -474,38 +440,33 @@
           <w:ilvl w:val="0"/>
           <w:numId w:val="2"/>
         </w:numPr>
-        <w:spacing w:lineRule="auto" w:line="480"/>
-        <w:rPr/>
-      </w:pPr>
-      <w:r>
-        <w:rPr/>
-        <w:t>Scaled “returns_to_go” by 3600 – the average reward humans received when performing this task using the virtual environment.</w:t>
-      </w:r>
-    </w:p>
-    <w:p>
-      <w:pPr>
-        <w:pStyle w:val="Normal"/>
-        <w:spacing w:lineRule="auto" w:line="480"/>
-        <w:rPr/>
-      </w:pPr>
-      <w:r>
-        <w:rPr/>
-      </w:r>
-    </w:p>
-    <w:p>
-      <w:pPr>
-        <w:pStyle w:val="Normal"/>
-        <w:spacing w:lineRule="auto" w:line="480"/>
-        <w:rPr/>
-      </w:pPr>
-      <w:r>
-        <w:rPr/>
-      </w:r>
-    </w:p>
-    <w:p>
-      <w:pPr>
-        <w:pStyle w:val="Normal"/>
-        <w:spacing w:lineRule="auto" w:line="480"/>
+        <w:spacing w:line="480" w:lineRule="auto"/>
+      </w:pPr>
+      <w:r>
+        <w:t>Scaled “</w:t>
+      </w:r>
+      <w:proofErr w:type="spellStart"/>
+      <w:r>
+        <w:t>returns_to_go</w:t>
+      </w:r>
+      <w:proofErr w:type="spellEnd"/>
+      <w:r>
+        <w:t>” by 3600 – the average reward humans received when performing this task using the virtual environment.</w:t>
+      </w:r>
+    </w:p>
+    <w:p>
+      <w:pPr>
+        <w:spacing w:line="480" w:lineRule="auto"/>
+      </w:pPr>
+    </w:p>
+    <w:p>
+      <w:pPr>
+        <w:spacing w:line="480" w:lineRule="auto"/>
+      </w:pPr>
+    </w:p>
+    <w:p>
+      <w:pPr>
+        <w:spacing w:line="480" w:lineRule="auto"/>
         <w:jc w:val="center"/>
         <w:rPr>
           <w:b/>
@@ -520,79 +481,60 @@
     </w:p>
     <w:p>
       <w:pPr>
-        <w:pStyle w:val="Normal"/>
-        <w:spacing w:lineRule="auto" w:line="480"/>
-        <w:ind w:firstLine="720"/>
-        <w:rPr/>
-      </w:pPr>
-      <w:r>
-        <w:rPr/>
-        <w:t xml:space="preserve">For this task we based our model design on the Decision Transformer approach (reference). A Decision Transformer </w:t>
-      </w:r>
-      <w:r>
-        <w:rPr/>
-        <w:t>is a wrapper around the Transformer architecture introduced in (reference). The general idea is that we use a Transformer to generate trajectories for a Reinforcement Learning problem. More formally, given a trajectory:</w:t>
-      </w:r>
-    </w:p>
-    <w:p>
-      <w:pPr>
-        <w:pStyle w:val="Normal"/>
-        <w:spacing w:lineRule="auto" w:line="480"/>
-        <w:ind w:firstLine="720"/>
-        <w:rPr/>
-      </w:pPr>
-      <w:r>
-        <w:rPr/>
-        <w:t>&lt;</w:t>
-      </w:r>
-      <w:r>
-        <w:rPr/>
-        <w:t>EQUATION&gt;</w:t>
-      </w:r>
-    </w:p>
-    <w:p>
-      <w:pPr>
-        <w:pStyle w:val="Normal"/>
-        <w:spacing w:lineRule="auto" w:line="480"/>
-        <w:ind w:firstLine="720"/>
-        <w:rPr/>
-      </w:pPr>
-      <w:r>
-        <w:rPr/>
-        <w:t>The Decisions Transformer uses the underlying Transformer to predict the next action in the sequence. We then apply that action to the environment to get the next state and reward. These, along with the rest of the sequence generated so far, are fed back into the Decision Transformer to continue the process. Figure 1 provide a schematic illustration of how this works.</w:t>
-      </w:r>
-      <w:r>
-        <w:rPr/>
-        <w:t xml:space="preserve"> </w:t>
-      </w:r>
-    </w:p>
-    <w:p>
-      <w:pPr>
-        <w:pStyle w:val="Normal"/>
-        <w:spacing w:lineRule="auto" w:line="480"/>
-        <w:ind w:firstLine="720"/>
-        <w:rPr/>
-      </w:pPr>
-      <w:r>
-        <w:rPr/>
-      </w:r>
-    </w:p>
-    <w:p>
-      <w:pPr>
-        <w:pStyle w:val="Normal"/>
-        <w:keepNext w:val="true"/>
-        <w:spacing w:lineRule="auto" w:line="480"/>
+        <w:spacing w:line="480" w:lineRule="auto"/>
+        <w:ind w:firstLine="720"/>
+      </w:pPr>
+      <w:r>
+        <w:t>For this task we based our model design on the Decision Transformer approach (reference). A Decision Transformer is a wrapper around the Transformer architecture introduced in (reference). The general idea is that we use a Transformer to generate trajectories for a Reinforcement Learning problem. More formally, given a trajectory:</w:t>
+      </w:r>
+    </w:p>
+    <w:p>
+      <w:pPr>
+        <w:spacing w:line="480" w:lineRule="auto"/>
+        <w:ind w:firstLine="720"/>
+      </w:pPr>
+      <w:r>
+        <w:t>&lt;EQUATION&gt;</w:t>
+      </w:r>
+    </w:p>
+    <w:p>
+      <w:pPr>
+        <w:spacing w:line="480" w:lineRule="auto"/>
+        <w:ind w:firstLine="720"/>
+      </w:pPr>
+      <w:r>
+        <w:t xml:space="preserve">The Decisions Transformer uses the underlying Transformer to predict the next action in the sequence. We then apply that action to the environment to get the next state and reward. These, along with the rest of the sequence generated so far, are fed back into the Decision Transformer to continue the process. Figure 1 </w:t>
+      </w:r>
+      <w:r>
+        <w:t>provides</w:t>
+      </w:r>
+      <w:r>
+        <w:t xml:space="preserve"> a schematic illustration of how this works. </w:t>
+      </w:r>
+    </w:p>
+    <w:p>
+      <w:pPr>
+        <w:spacing w:line="480" w:lineRule="auto"/>
+        <w:ind w:firstLine="720"/>
+      </w:pPr>
+    </w:p>
+    <w:p>
+      <w:pPr>
+        <w:keepNext/>
+        <w:spacing w:line="480" w:lineRule="auto"/>
         <w:ind w:firstLine="720"/>
         <w:jc w:val="center"/>
-        <w:rPr/>
-      </w:pPr>
-      <w:r>
-        <w:rPr/>
+      </w:pPr>
+      <w:r>
+        <w:rPr>
+          <w:noProof/>
+        </w:rPr>
+        <w:lastRenderedPageBreak/>
         <w:drawing>
-          <wp:inline distT="0" distB="0" distL="0" distR="0">
+          <wp:inline distT="0" distB="0" distL="0" distR="0" wp14:anchorId="5FB54A85" wp14:editId="48F8C0C9">
             <wp:extent cx="1899920" cy="3094990"/>
             <wp:effectExtent l="0" t="0" r="0" b="0"/>
-            <wp:docPr id="1" name="Picture 1" descr=""/>
+            <wp:docPr id="1" name="Picture 1"/>
             <wp:cNvGraphicFramePr>
               <a:graphicFrameLocks xmlns:a="http://schemas.openxmlformats.org/drawingml/2006/main" noChangeAspect="1"/>
             </wp:cNvGraphicFramePr>
@@ -600,13 +542,13 @@
               <a:graphicData uri="http://schemas.openxmlformats.org/drawingml/2006/picture">
                 <pic:pic xmlns:pic="http://schemas.openxmlformats.org/drawingml/2006/picture">
                   <pic:nvPicPr>
-                    <pic:cNvPr id="1" name="Picture 1" descr=""/>
+                    <pic:cNvPr id="1" name="Picture 1"/>
                     <pic:cNvPicPr>
                       <a:picLocks noChangeAspect="1" noChangeArrowheads="1"/>
                     </pic:cNvPicPr>
                   </pic:nvPicPr>
                   <pic:blipFill>
-                    <a:blip r:embed="rId3"/>
+                    <a:blip r:embed="rId8"/>
                     <a:stretch>
                       <a:fillRect/>
                     </a:stretch>
@@ -631,121 +573,109 @@
       <w:pPr>
         <w:pStyle w:val="Caption"/>
         <w:jc w:val="center"/>
-        <w:rPr/>
-      </w:pPr>
-      <w:r>
-        <w:rPr/>
+      </w:pPr>
+      <w:r>
         <w:t xml:space="preserve">Figure </w:t>
       </w:r>
-      <w:r>
-        <w:rPr/>
-        <w:fldChar w:fldCharType="begin"/>
-      </w:r>
-      <w:r>
-        <w:rPr/>
-        <w:instrText xml:space="preserve"> SEQ Figure \* ARABIC </w:instrText>
-      </w:r>
-      <w:r>
-        <w:rPr/>
-        <w:fldChar w:fldCharType="separate"/>
-      </w:r>
-      <w:r>
-        <w:rPr/>
-        <w:t>1</w:t>
-      </w:r>
-      <w:r>
-        <w:rPr/>
-        <w:fldChar w:fldCharType="end"/>
-      </w:r>
-      <w:r>
-        <w:rPr/>
+      <w:fldSimple w:instr=" SEQ Figure \* ARABIC ">
+        <w:r>
+          <w:t>1</w:t>
+        </w:r>
+      </w:fldSimple>
+      <w:r>
         <w:t xml:space="preserve"> Decision Transformer Architecture</w:t>
       </w:r>
     </w:p>
     <w:p>
       <w:pPr>
-        <w:pStyle w:val="Normal"/>
-        <w:spacing w:lineRule="auto" w:line="480"/>
-        <w:ind w:firstLine="720"/>
-        <w:rPr/>
-      </w:pPr>
-      <w:r>
-        <w:rPr/>
-        <w:t>As we are restricting ourselves to only those training trajectories generated by human input, we are limited to 25 full training sessions to work with. In order to stretch this out further, we handled the data as follows:</w:t>
-      </w:r>
-    </w:p>
-    <w:p>
-      <w:pPr>
-        <w:pStyle w:val="Normal"/>
-        <w:spacing w:lineRule="auto" w:line="480"/>
-        <w:ind w:firstLine="720"/>
-        <w:rPr/>
-      </w:pPr>
-      <w:r>
-        <w:rPr/>
-        <w:t>We split the data into “sub-trajectories” each the length of the models context size.</w:t>
-      </w:r>
-    </w:p>
-    <w:p>
-      <w:pPr>
-        <w:pStyle w:val="Normal"/>
-        <w:spacing w:lineRule="auto" w:line="480"/>
-        <w:ind w:firstLine="720"/>
-        <w:rPr/>
-      </w:pPr>
-      <w:r>
-        <w:rPr/>
-        <w:t>We used Hindsight Experience Replay (reference) to relabel the rewards on those sub-trajectories. (EXPLAIN FURTHER!!!)</w:t>
-      </w:r>
-    </w:p>
-    <w:p>
-      <w:pPr>
-        <w:pStyle w:val="Normal"/>
-        <w:spacing w:lineRule="auto" w:line="480"/>
-        <w:ind w:firstLine="720"/>
-        <w:rPr/>
-      </w:pPr>
-      <w:r>
-        <w:rPr/>
-      </w:r>
-    </w:p>
-    <w:p>
-      <w:pPr>
-        <w:pStyle w:val="Normal"/>
-        <w:spacing w:lineRule="auto" w:line="480"/>
-        <w:ind w:firstLine="720"/>
-        <w:rPr/>
-      </w:pPr>
-      <w:r>
-        <w:rPr/>
-      </w:r>
-    </w:p>
-    <w:p>
-      <w:pPr>
-        <w:pStyle w:val="Normal"/>
-        <w:spacing w:lineRule="auto" w:line="480"/>
-        <w:ind w:firstLine="720"/>
-        <w:rPr/>
-      </w:pPr>
-      <w:r>
-        <w:rPr/>
-      </w:r>
-    </w:p>
-    <w:p>
-      <w:pPr>
-        <w:pStyle w:val="Normal"/>
-        <w:spacing w:lineRule="auto" w:line="480"/>
-        <w:ind w:firstLine="720"/>
-        <w:rPr/>
-      </w:pPr>
-      <w:r>
-        <w:rPr/>
-      </w:r>
-    </w:p>
-    <w:p>
-      <w:pPr>
-        <w:pStyle w:val="Normal"/>
-        <w:spacing w:lineRule="auto" w:line="480"/>
+        <w:spacing w:line="480" w:lineRule="auto"/>
+        <w:ind w:firstLine="720"/>
+      </w:pPr>
+      <w:r>
+        <w:t xml:space="preserve">As we are restricting ourselves to only those training trajectories generated by human input, we are limited to 25 full training sessions to work with. </w:t>
+      </w:r>
+      <w:r>
+        <w:t>To</w:t>
+      </w:r>
+      <w:r>
+        <w:t xml:space="preserve"> stretch this out further, we handled the data as follows:</w:t>
+      </w:r>
+    </w:p>
+    <w:p>
+      <w:pPr>
+        <w:spacing w:line="480" w:lineRule="auto"/>
+        <w:ind w:firstLine="720"/>
+      </w:pPr>
+      <w:r>
+        <w:t xml:space="preserve">We split the data into “sub-trajectories” each the length of the </w:t>
+      </w:r>
+      <w:r>
+        <w:t>model’s</w:t>
+      </w:r>
+      <w:r>
+        <w:t xml:space="preserve"> context size.</w:t>
+      </w:r>
+    </w:p>
+    <w:p>
+      <w:pPr>
+        <w:spacing w:line="480" w:lineRule="auto"/>
+        <w:ind w:firstLine="720"/>
+      </w:pPr>
+      <w:r>
+        <w:t xml:space="preserve">We used Hindsight Experience Replay </w:t>
+      </w:r>
+      <w:r>
+        <w:t xml:space="preserve">(HER) </w:t>
+      </w:r>
+      <w:r>
+        <w:t>(reference) to re</w:t>
+      </w:r>
+      <w:r>
+        <w:t>-</w:t>
+      </w:r>
+      <w:r>
+        <w:t>label the rewards on those sub-trajectories.</w:t>
+      </w:r>
+      <w:r>
+        <w:t xml:space="preserve"> HER was applied to sub-trajectories with 85% probability.</w:t>
+      </w:r>
+      <w:r>
+        <w:t xml:space="preserve"> </w:t>
+      </w:r>
+      <w:r>
+        <w:t xml:space="preserve">We do this in two stages. In stage 1 we extract milestones from the sub-trajectory: Is the ball near the hand? Is the ball near the target? In stage 2, </w:t>
+      </w:r>
+      <w:r>
+        <w:t xml:space="preserve">if a milestone was predicted in the previous stage, then </w:t>
+      </w:r>
+    </w:p>
+    <w:p>
+      <w:pPr>
+        <w:spacing w:line="480" w:lineRule="auto"/>
+        <w:ind w:firstLine="720"/>
+      </w:pPr>
+    </w:p>
+    <w:p>
+      <w:pPr>
+        <w:spacing w:line="480" w:lineRule="auto"/>
+        <w:ind w:firstLine="720"/>
+      </w:pPr>
+    </w:p>
+    <w:p>
+      <w:pPr>
+        <w:spacing w:line="480" w:lineRule="auto"/>
+        <w:ind w:firstLine="720"/>
+      </w:pPr>
+    </w:p>
+    <w:p>
+      <w:pPr>
+        <w:spacing w:line="480" w:lineRule="auto"/>
+        <w:ind w:firstLine="720"/>
+      </w:pPr>
+    </w:p>
+    <w:p>
+      <w:pPr>
+        <w:spacing w:line="480" w:lineRule="auto"/>
         <w:jc w:val="center"/>
         <w:rPr>
           <w:b/>
@@ -760,31 +690,23 @@
     </w:p>
     <w:p>
       <w:pPr>
-        <w:pStyle w:val="Normal"/>
-        <w:spacing w:lineRule="auto" w:line="480"/>
-        <w:ind w:firstLine="720"/>
-        <w:rPr/>
-      </w:pPr>
-      <w:r>
-        <w:rPr/>
+        <w:spacing w:line="480" w:lineRule="auto"/>
+        <w:ind w:firstLine="720"/>
+      </w:pPr>
+      <w:r>
+        <w:lastRenderedPageBreak/>
         <w:t>The main body of your paper goes here, starting on page 3. (Or starting on page 2, if you’re not required to include an abstract.)</w:t>
       </w:r>
     </w:p>
     <w:p>
       <w:pPr>
-        <w:pStyle w:val="Normal"/>
-        <w:spacing w:lineRule="auto" w:line="480"/>
-        <w:ind w:firstLine="720"/>
-        <w:rPr/>
-      </w:pPr>
-      <w:r>
-        <w:rPr/>
-      </w:r>
-    </w:p>
-    <w:p>
-      <w:pPr>
-        <w:pStyle w:val="Normal"/>
-        <w:spacing w:lineRule="auto" w:line="480"/>
+        <w:spacing w:line="480" w:lineRule="auto"/>
+        <w:ind w:firstLine="720"/>
+      </w:pPr>
+    </w:p>
+    <w:p>
+      <w:pPr>
+        <w:spacing w:line="480" w:lineRule="auto"/>
         <w:jc w:val="center"/>
         <w:rPr>
           <w:b/>
@@ -799,31 +721,22 @@
     </w:p>
     <w:p>
       <w:pPr>
-        <w:pStyle w:val="Normal"/>
-        <w:spacing w:lineRule="auto" w:line="480"/>
-        <w:ind w:firstLine="720"/>
-        <w:rPr/>
-      </w:pPr>
-      <w:r>
-        <w:rPr/>
+        <w:spacing w:line="480" w:lineRule="auto"/>
+        <w:ind w:firstLine="720"/>
+      </w:pPr>
+      <w:r>
         <w:t>The main body of your paper goes here, starting on page 3. (Or starting on page 2, if you’re not required to include an abstract.)</w:t>
       </w:r>
     </w:p>
     <w:p>
       <w:pPr>
-        <w:pStyle w:val="Normal"/>
-        <w:spacing w:lineRule="auto" w:line="480"/>
-        <w:ind w:firstLine="720"/>
-        <w:rPr/>
-      </w:pPr>
-      <w:r>
-        <w:rPr/>
-      </w:r>
-    </w:p>
-    <w:p>
-      <w:pPr>
-        <w:pStyle w:val="Normal"/>
-        <w:spacing w:lineRule="auto" w:line="480"/>
+        <w:spacing w:line="480" w:lineRule="auto"/>
+        <w:ind w:firstLine="720"/>
+      </w:pPr>
+    </w:p>
+    <w:p>
+      <w:pPr>
+        <w:spacing w:line="480" w:lineRule="auto"/>
         <w:jc w:val="center"/>
         <w:rPr>
           <w:b/>
@@ -838,209 +751,120 @@
     </w:p>
     <w:p>
       <w:pPr>
-        <w:pStyle w:val="Normal"/>
-        <w:spacing w:lineRule="auto" w:line="480"/>
-        <w:ind w:firstLine="720"/>
-        <w:rPr/>
-      </w:pPr>
-      <w:r>
-        <w:rPr/>
+        <w:spacing w:line="480" w:lineRule="auto"/>
+        <w:ind w:firstLine="720"/>
+      </w:pPr>
+      <w:r>
         <w:t>The main body of your paper goes here, starting on page 3. (Or starting on page 2, if you’re not required to include an abstract.)</w:t>
       </w:r>
     </w:p>
     <w:p>
       <w:pPr>
-        <w:pStyle w:val="Normal"/>
-        <w:spacing w:lineRule="auto" w:line="480"/>
-        <w:ind w:firstLine="720"/>
-        <w:rPr/>
-      </w:pPr>
-      <w:r>
-        <w:rPr/>
-      </w:r>
-    </w:p>
-    <w:p>
-      <w:pPr>
-        <w:pStyle w:val="Normal"/>
-        <w:spacing w:lineRule="auto" w:line="480"/>
-        <w:ind w:firstLine="720"/>
-        <w:rPr/>
-      </w:pPr>
-      <w:r>
-        <w:rPr/>
-      </w:r>
-    </w:p>
-    <w:p>
-      <w:pPr>
-        <w:pStyle w:val="Normal"/>
-        <w:spacing w:lineRule="auto" w:line="480"/>
-        <w:ind w:firstLine="720"/>
-        <w:rPr/>
-      </w:pPr>
-      <w:r>
-        <w:rPr/>
-      </w:r>
-    </w:p>
-    <w:p>
-      <w:pPr>
-        <w:pStyle w:val="Normal"/>
-        <w:spacing w:lineRule="auto" w:line="480"/>
-        <w:ind w:firstLine="720"/>
-        <w:rPr/>
-      </w:pPr>
-      <w:r>
-        <w:rPr/>
-      </w:r>
-    </w:p>
-    <w:p>
-      <w:pPr>
-        <w:pStyle w:val="Normal"/>
-        <w:spacing w:lineRule="auto" w:line="480"/>
+        <w:spacing w:line="480" w:lineRule="auto"/>
+        <w:ind w:firstLine="720"/>
+      </w:pPr>
+    </w:p>
+    <w:p>
+      <w:pPr>
+        <w:spacing w:line="480" w:lineRule="auto"/>
+        <w:ind w:firstLine="720"/>
+      </w:pPr>
+    </w:p>
+    <w:p>
+      <w:pPr>
+        <w:spacing w:line="480" w:lineRule="auto"/>
+        <w:ind w:firstLine="720"/>
+      </w:pPr>
+    </w:p>
+    <w:p>
+      <w:pPr>
+        <w:spacing w:line="480" w:lineRule="auto"/>
+        <w:ind w:firstLine="720"/>
+      </w:pPr>
+    </w:p>
+    <w:p>
+      <w:pPr>
+        <w:spacing w:line="480" w:lineRule="auto"/>
         <w:jc w:val="center"/>
-        <w:rPr/>
-      </w:pPr>
-      <w:r>
-        <w:rPr/>
-      </w:r>
-    </w:p>
-    <w:p>
-      <w:pPr>
-        <w:pStyle w:val="Normal"/>
-        <w:spacing w:lineRule="auto" w:line="480"/>
+      </w:pPr>
+    </w:p>
+    <w:p>
+      <w:pPr>
+        <w:spacing w:line="480" w:lineRule="auto"/>
         <w:jc w:val="center"/>
-        <w:rPr/>
-      </w:pPr>
-      <w:r>
-        <w:rPr/>
-      </w:r>
-    </w:p>
-    <w:p>
-      <w:pPr>
-        <w:pStyle w:val="Normal"/>
-        <w:spacing w:lineRule="auto" w:line="480"/>
+      </w:pPr>
+    </w:p>
+    <w:p>
+      <w:pPr>
+        <w:spacing w:line="480" w:lineRule="auto"/>
         <w:jc w:val="center"/>
-        <w:rPr/>
-      </w:pPr>
-      <w:r>
-        <w:rPr/>
-      </w:r>
-    </w:p>
-    <w:p>
-      <w:pPr>
-        <w:pStyle w:val="Normal"/>
-        <w:spacing w:lineRule="auto" w:line="480"/>
+      </w:pPr>
+    </w:p>
+    <w:p>
+      <w:pPr>
+        <w:spacing w:line="480" w:lineRule="auto"/>
         <w:jc w:val="center"/>
-        <w:rPr/>
-      </w:pPr>
-      <w:r>
-        <w:rPr/>
-      </w:r>
-    </w:p>
-    <w:p>
-      <w:pPr>
-        <w:pStyle w:val="Normal"/>
-        <w:spacing w:lineRule="auto" w:line="480"/>
+      </w:pPr>
+    </w:p>
+    <w:p>
+      <w:pPr>
+        <w:spacing w:line="480" w:lineRule="auto"/>
         <w:jc w:val="center"/>
-        <w:rPr/>
-      </w:pPr>
-      <w:r>
-        <w:rPr/>
-      </w:r>
-    </w:p>
-    <w:p>
-      <w:pPr>
-        <w:pStyle w:val="Normal"/>
-        <w:spacing w:lineRule="auto" w:line="480"/>
+      </w:pPr>
+    </w:p>
+    <w:p>
+      <w:pPr>
+        <w:spacing w:line="480" w:lineRule="auto"/>
         <w:jc w:val="center"/>
-        <w:rPr/>
-      </w:pPr>
-      <w:r>
-        <w:rPr/>
-      </w:r>
-    </w:p>
-    <w:p>
-      <w:pPr>
-        <w:pStyle w:val="Normal"/>
-        <w:spacing w:lineRule="auto" w:line="480"/>
+      </w:pPr>
+    </w:p>
+    <w:p>
+      <w:pPr>
+        <w:spacing w:line="480" w:lineRule="auto"/>
         <w:jc w:val="center"/>
-        <w:rPr/>
-      </w:pPr>
-      <w:r>
-        <w:rPr/>
-      </w:r>
-    </w:p>
-    <w:p>
-      <w:pPr>
-        <w:pStyle w:val="Normal"/>
-        <w:spacing w:lineRule="auto" w:line="480"/>
+      </w:pPr>
+    </w:p>
+    <w:p>
+      <w:pPr>
+        <w:spacing w:line="480" w:lineRule="auto"/>
         <w:jc w:val="center"/>
-        <w:rPr/>
-      </w:pPr>
-      <w:r>
-        <w:rPr/>
-      </w:r>
-    </w:p>
-    <w:p>
-      <w:pPr>
-        <w:pStyle w:val="Normal"/>
-        <w:spacing w:lineRule="auto" w:line="480"/>
+      </w:pPr>
+    </w:p>
+    <w:p>
+      <w:pPr>
+        <w:spacing w:line="480" w:lineRule="auto"/>
         <w:jc w:val="center"/>
-        <w:rPr/>
-      </w:pPr>
-      <w:r>
-        <w:rPr/>
-      </w:r>
-    </w:p>
-    <w:p>
-      <w:pPr>
-        <w:pStyle w:val="Normal"/>
-        <w:spacing w:lineRule="auto" w:line="480"/>
+      </w:pPr>
+    </w:p>
+    <w:p>
+      <w:pPr>
+        <w:spacing w:line="480" w:lineRule="auto"/>
         <w:jc w:val="center"/>
-        <w:rPr/>
-      </w:pPr>
-      <w:r>
-        <w:rPr/>
-      </w:r>
-    </w:p>
-    <w:p>
-      <w:pPr>
-        <w:pStyle w:val="Normal"/>
-        <w:spacing w:lineRule="auto" w:line="480"/>
+      </w:pPr>
+    </w:p>
+    <w:p>
+      <w:pPr>
+        <w:spacing w:line="480" w:lineRule="auto"/>
         <w:jc w:val="center"/>
-        <w:rPr/>
-      </w:pPr>
-      <w:r>
-        <w:rPr/>
-      </w:r>
-    </w:p>
-    <w:p>
-      <w:pPr>
-        <w:pStyle w:val="Normal"/>
-        <w:spacing w:lineRule="auto" w:line="480"/>
-        <w:rPr/>
-      </w:pPr>
-      <w:r>
-        <w:rPr/>
-      </w:r>
-    </w:p>
-    <w:p>
-      <w:pPr>
-        <w:pStyle w:val="Normal"/>
-        <w:spacing w:lineRule="auto" w:line="480"/>
+      </w:pPr>
+    </w:p>
+    <w:p>
+      <w:pPr>
+        <w:spacing w:line="480" w:lineRule="auto"/>
+      </w:pPr>
+    </w:p>
+    <w:p>
+      <w:pPr>
+        <w:spacing w:line="480" w:lineRule="auto"/>
         <w:jc w:val="center"/>
-        <w:rPr/>
-      </w:pPr>
-      <w:r>
-        <w:rPr/>
-      </w:r>
+      </w:pPr>
       <w:r>
         <w:br w:type="page"/>
       </w:r>
     </w:p>
     <w:p>
       <w:pPr>
-        <w:pStyle w:val="Normal"/>
-        <w:spacing w:lineRule="auto" w:line="480" w:before="0" w:after="0"/>
+        <w:spacing w:line="480" w:lineRule="auto"/>
         <w:jc w:val="center"/>
         <w:rPr>
           <w:b/>
@@ -1050,21 +874,48 @@
         <w:rPr>
           <w:b/>
         </w:rPr>
+        <w:lastRenderedPageBreak/>
         <w:t>References</w:t>
       </w:r>
     </w:p>
     <w:p>
       <w:pPr>
-        <w:pStyle w:val="Normal"/>
-        <w:spacing w:lineRule="auto" w:line="480"/>
+        <w:spacing w:line="480" w:lineRule="auto"/>
         <w:ind w:left="720"/>
-        <w:rPr/>
-      </w:pPr>
-      <w:r>
-        <w:rPr>
-          <w:lang w:val="en-CA"/>
-        </w:rPr>
-        <w:t xml:space="preserve">Andrychowicz, M., Wolski, F., Ray, A., Schneider, J., Fong, R., Welinder, P., McGrew, B., Tobin, J., Abbeel, P., &amp; Zaremba, W. (2017). </w:t>
+      </w:pPr>
+      <w:r>
+        <w:rPr>
+          <w:lang w:val="en-CA"/>
+        </w:rPr>
+        <w:t xml:space="preserve">Andrychowicz, M., Wolski, F., Ray, A., Schneider, J., Fong, R., </w:t>
+      </w:r>
+      <w:proofErr w:type="spellStart"/>
+      <w:r>
+        <w:rPr>
+          <w:lang w:val="en-CA"/>
+        </w:rPr>
+        <w:t>Welinder</w:t>
+      </w:r>
+      <w:proofErr w:type="spellEnd"/>
+      <w:r>
+        <w:rPr>
+          <w:lang w:val="en-CA"/>
+        </w:rPr>
+        <w:t xml:space="preserve">, P., McGrew, B., Tobin, J., </w:t>
+      </w:r>
+      <w:proofErr w:type="spellStart"/>
+      <w:r>
+        <w:rPr>
+          <w:lang w:val="en-CA"/>
+        </w:rPr>
+        <w:t>Abbeel</w:t>
+      </w:r>
+      <w:proofErr w:type="spellEnd"/>
+      <w:r>
+        <w:rPr>
+          <w:lang w:val="en-CA"/>
+        </w:rPr>
+        <w:t xml:space="preserve">, P., &amp; Zaremba, W. (2017). </w:t>
       </w:r>
       <w:r>
         <w:rPr>
@@ -1078,9 +929,23 @@
         <w:rPr>
           <w:lang w:val="en-CA"/>
         </w:rPr>
-        <w:t xml:space="preserve">. arXiv. </w:t>
-      </w:r>
-      <w:hyperlink r:id="rId4" w:tgtFrame="_blank">
+        <w:t xml:space="preserve">. </w:t>
+      </w:r>
+      <w:proofErr w:type="spellStart"/>
+      <w:r>
+        <w:rPr>
+          <w:lang w:val="en-CA"/>
+        </w:rPr>
+        <w:t>arXiv</w:t>
+      </w:r>
+      <w:proofErr w:type="spellEnd"/>
+      <w:r>
+        <w:rPr>
+          <w:lang w:val="en-CA"/>
+        </w:rPr>
+        <w:t xml:space="preserve">. </w:t>
+      </w:r>
+      <w:hyperlink r:id="rId9" w:tgtFrame="_blank">
         <w:r>
           <w:rPr>
             <w:rStyle w:val="Hyperlink"/>
@@ -1092,19 +957,13 @@
     </w:p>
     <w:p>
       <w:pPr>
-        <w:pStyle w:val="Normal"/>
-        <w:spacing w:lineRule="auto" w:line="480"/>
+        <w:spacing w:line="480" w:lineRule="auto"/>
         <w:ind w:left="720"/>
-        <w:rPr/>
-      </w:pPr>
-      <w:r>
-        <w:rPr/>
-      </w:r>
-    </w:p>
-    <w:p>
-      <w:pPr>
-        <w:pStyle w:val="Normal"/>
-        <w:spacing w:lineRule="auto" w:line="480"/>
+      </w:pPr>
+    </w:p>
+    <w:p>
+      <w:pPr>
+        <w:spacing w:line="480" w:lineRule="auto"/>
         <w:ind w:left="720"/>
         <w:rPr>
           <w:lang w:val="en-CA"/>
@@ -1114,7 +973,35 @@
         <w:rPr>
           <w:lang w:val="en-CA"/>
         </w:rPr>
-        <w:t xml:space="preserve">Chen, L., Lu, K., Rajeswaran, A., Lee, K., Grover, A., Laskin, M., Abbeel, P., Srinivas, A., &amp; Mordatch, I. (2021). </w:t>
+        <w:t xml:space="preserve">Chen, L., Lu, K., Rajeswaran, A., Lee, K., Grover, A., Laskin, M., </w:t>
+      </w:r>
+      <w:proofErr w:type="spellStart"/>
+      <w:r>
+        <w:rPr>
+          <w:lang w:val="en-CA"/>
+        </w:rPr>
+        <w:t>Abbeel</w:t>
+      </w:r>
+      <w:proofErr w:type="spellEnd"/>
+      <w:r>
+        <w:rPr>
+          <w:lang w:val="en-CA"/>
+        </w:rPr>
+        <w:t xml:space="preserve">, P., Srinivas, A., &amp; </w:t>
+      </w:r>
+      <w:proofErr w:type="spellStart"/>
+      <w:r>
+        <w:rPr>
+          <w:lang w:val="en-CA"/>
+        </w:rPr>
+        <w:t>Mordatch</w:t>
+      </w:r>
+      <w:proofErr w:type="spellEnd"/>
+      <w:r>
+        <w:rPr>
+          <w:lang w:val="en-CA"/>
+        </w:rPr>
+        <w:t xml:space="preserve">, I. (2021). </w:t>
       </w:r>
       <w:r>
         <w:rPr>
@@ -1128,28 +1015,35 @@
         <w:rPr>
           <w:lang w:val="en-CA"/>
         </w:rPr>
-        <w:t>. arXiv. https://doi.org/10.48550/arXiv.2106.01345</w:t>
-      </w:r>
-    </w:p>
-    <w:p>
-      <w:pPr>
-        <w:pStyle w:val="Normal"/>
-        <w:spacing w:lineRule="auto" w:line="480"/>
+        <w:t xml:space="preserve">. </w:t>
+      </w:r>
+      <w:proofErr w:type="spellStart"/>
+      <w:r>
+        <w:rPr>
+          <w:lang w:val="en-CA"/>
+        </w:rPr>
+        <w:t>arXiv</w:t>
+      </w:r>
+      <w:proofErr w:type="spellEnd"/>
+      <w:r>
+        <w:rPr>
+          <w:lang w:val="en-CA"/>
+        </w:rPr>
+        <w:t>. https://doi.org/10.48550/arXiv.2106.01345</w:t>
+      </w:r>
+    </w:p>
+    <w:p>
+      <w:pPr>
+        <w:spacing w:line="480" w:lineRule="auto"/>
         <w:ind w:left="720"/>
         <w:rPr>
           <w:lang w:val="en-CA"/>
         </w:rPr>
       </w:pPr>
-      <w:r>
-        <w:rPr>
-          <w:lang w:val="en-CA"/>
-        </w:rPr>
-      </w:r>
-    </w:p>
-    <w:p>
-      <w:pPr>
-        <w:pStyle w:val="Normal"/>
-        <w:spacing w:lineRule="auto" w:line="480"/>
+    </w:p>
+    <w:p>
+      <w:pPr>
+        <w:spacing w:line="480" w:lineRule="auto"/>
         <w:ind w:left="720"/>
         <w:rPr>
           <w:lang w:val="en-CA"/>
@@ -1173,38 +1067,81 @@
         <w:rPr>
           <w:lang w:val="en-CA"/>
         </w:rPr>
-        <w:t>. arXiv. https://doi.org/10.48550/arXiv.2004.07219</w:t>
-      </w:r>
-    </w:p>
-    <w:p>
-      <w:pPr>
-        <w:pStyle w:val="Normal"/>
-        <w:spacing w:lineRule="auto" w:line="480"/>
+        <w:t xml:space="preserve">. </w:t>
+      </w:r>
+      <w:proofErr w:type="spellStart"/>
+      <w:r>
+        <w:rPr>
+          <w:lang w:val="en-CA"/>
+        </w:rPr>
+        <w:t>arXiv</w:t>
+      </w:r>
+      <w:proofErr w:type="spellEnd"/>
+      <w:r>
+        <w:rPr>
+          <w:lang w:val="en-CA"/>
+        </w:rPr>
+        <w:t>. https://doi.org/10.48550/arXiv.2004.07219</w:t>
+      </w:r>
+    </w:p>
+    <w:p>
+      <w:pPr>
+        <w:spacing w:line="480" w:lineRule="auto"/>
         <w:ind w:left="720"/>
         <w:rPr>
           <w:lang w:val="en-CA"/>
         </w:rPr>
       </w:pPr>
-      <w:r>
-        <w:rPr>
-          <w:lang w:val="en-CA"/>
-        </w:rPr>
-      </w:r>
-    </w:p>
-    <w:p>
-      <w:pPr>
-        <w:pStyle w:val="Normal"/>
-        <w:spacing w:lineRule="auto" w:line="480"/>
+    </w:p>
+    <w:p>
+      <w:pPr>
+        <w:spacing w:line="480" w:lineRule="auto"/>
         <w:ind w:left="720"/>
         <w:rPr>
           <w:lang w:val="en-CA"/>
         </w:rPr>
       </w:pPr>
-      <w:r>
-        <w:rPr>
-          <w:lang w:val="en-CA"/>
-        </w:rPr>
-        <w:t xml:space="preserve">Mnih, V., Kavukcuoglu, K., Silver, D., Rusu, A. A., Veness, J., Bellemare, M. G., Graves, A., Riedmiller, M., Fidjeland, A. K., Ostrovski, G., Petersen, S., Beattie, C., Sadik, A., Antonoglou, I., King, H., Kumaran, D., Wierstra, D., Legg, S., &amp; Hassabis, D. (2015). Human-level control through deep reinforcement learning. </w:t>
+      <w:proofErr w:type="spellStart"/>
+      <w:r>
+        <w:rPr>
+          <w:lang w:val="en-CA"/>
+        </w:rPr>
+        <w:t>Mnih</w:t>
+      </w:r>
+      <w:proofErr w:type="spellEnd"/>
+      <w:r>
+        <w:rPr>
+          <w:lang w:val="en-CA"/>
+        </w:rPr>
+        <w:t xml:space="preserve">, V., Kavukcuoglu, K., Silver, D., Rusu, A. A., Veness, J., Bellemare, M. G., Graves, A., Riedmiller, M., Fidjeland, A. K., Ostrovski, G., Petersen, S., Beattie, C., Sadik, A., </w:t>
+      </w:r>
+      <w:proofErr w:type="spellStart"/>
+      <w:r>
+        <w:rPr>
+          <w:lang w:val="en-CA"/>
+        </w:rPr>
+        <w:t>Antonoglou</w:t>
+      </w:r>
+      <w:proofErr w:type="spellEnd"/>
+      <w:r>
+        <w:rPr>
+          <w:lang w:val="en-CA"/>
+        </w:rPr>
+        <w:t xml:space="preserve">, I., King, H., Kumaran, D., </w:t>
+      </w:r>
+      <w:proofErr w:type="spellStart"/>
+      <w:r>
+        <w:rPr>
+          <w:lang w:val="en-CA"/>
+        </w:rPr>
+        <w:t>Wierstra</w:t>
+      </w:r>
+      <w:proofErr w:type="spellEnd"/>
+      <w:r>
+        <w:rPr>
+          <w:lang w:val="en-CA"/>
+        </w:rPr>
+        <w:t xml:space="preserve">, D., Legg, S., &amp; Hassabis, D. (2015). Human-level control through deep reinforcement learning. </w:t>
       </w:r>
       <w:r>
         <w:rPr>
@@ -1234,7 +1171,7 @@
         </w:rPr>
         <w:t xml:space="preserve">(7540), 529–533. </w:t>
       </w:r>
-      <w:hyperlink r:id="rId5">
+      <w:hyperlink r:id="rId10">
         <w:r>
           <w:rPr>
             <w:rStyle w:val="Hyperlink"/>
@@ -1246,23 +1183,16 @@
     </w:p>
     <w:p>
       <w:pPr>
-        <w:pStyle w:val="Normal"/>
-        <w:spacing w:lineRule="auto" w:line="480"/>
+        <w:spacing w:line="480" w:lineRule="auto"/>
         <w:ind w:left="720"/>
         <w:rPr>
           <w:lang w:val="en-CA"/>
         </w:rPr>
       </w:pPr>
-      <w:r>
-        <w:rPr>
-          <w:lang w:val="en-CA"/>
-        </w:rPr>
-      </w:r>
-    </w:p>
-    <w:p>
-      <w:pPr>
-        <w:pStyle w:val="Normal"/>
-        <w:spacing w:lineRule="auto" w:line="480"/>
+    </w:p>
+    <w:p>
+      <w:pPr>
+        <w:spacing w:line="480" w:lineRule="auto"/>
         <w:ind w:left="720"/>
         <w:rPr>
           <w:lang w:val="en-CA"/>
@@ -1272,9 +1202,23 @@
         <w:rPr>
           <w:lang w:val="en-CA"/>
         </w:rPr>
-        <w:t xml:space="preserve">Rajeswaran, Aravind, et al. ‘Learning Complex Dexterous Manipulation with Deep Reinforcement Learning and Demonstrations’. CoRR, vol. abs/1709.10087, 2017, </w:t>
-      </w:r>
-      <w:hyperlink r:id="rId6">
+        <w:t xml:space="preserve">Rajeswaran, Aravind, et al. ‘Learning Complex Dexterous Manipulation with Deep Reinforcement Learning and Demonstrations’. </w:t>
+      </w:r>
+      <w:proofErr w:type="spellStart"/>
+      <w:r>
+        <w:rPr>
+          <w:lang w:val="en-CA"/>
+        </w:rPr>
+        <w:t>CoRR</w:t>
+      </w:r>
+      <w:proofErr w:type="spellEnd"/>
+      <w:r>
+        <w:rPr>
+          <w:lang w:val="en-CA"/>
+        </w:rPr>
+        <w:t xml:space="preserve">, vol. abs/1709.10087, 2017, </w:t>
+      </w:r>
+      <w:hyperlink r:id="rId11">
         <w:r>
           <w:rPr>
             <w:rStyle w:val="Hyperlink"/>
@@ -1286,23 +1230,16 @@
     </w:p>
     <w:p>
       <w:pPr>
-        <w:pStyle w:val="Normal"/>
-        <w:spacing w:lineRule="auto" w:line="480"/>
+        <w:spacing w:line="480" w:lineRule="auto"/>
         <w:ind w:left="720"/>
         <w:rPr>
           <w:lang w:val="en-CA"/>
         </w:rPr>
       </w:pPr>
-      <w:r>
-        <w:rPr>
-          <w:lang w:val="en-CA"/>
-        </w:rPr>
-      </w:r>
-    </w:p>
-    <w:p>
-      <w:pPr>
-        <w:pStyle w:val="Normal"/>
-        <w:spacing w:lineRule="auto" w:line="480"/>
+    </w:p>
+    <w:p>
+      <w:pPr>
+        <w:spacing w:line="480" w:lineRule="auto"/>
         <w:ind w:left="720"/>
         <w:rPr>
           <w:lang w:val="en-CA"/>
@@ -1312,7 +1249,22 @@
         <w:rPr>
           <w:lang w:val="en-CA"/>
         </w:rPr>
-        <w:t xml:space="preserve">Schaul, T., Quan, J., Antonoglou, I., &amp; Silver, D. (2016). </w:t>
+        <w:lastRenderedPageBreak/>
+        <w:t xml:space="preserve">Schaul, T., Quan, J., </w:t>
+      </w:r>
+      <w:proofErr w:type="spellStart"/>
+      <w:r>
+        <w:rPr>
+          <w:lang w:val="en-CA"/>
+        </w:rPr>
+        <w:t>Antonoglou</w:t>
+      </w:r>
+      <w:proofErr w:type="spellEnd"/>
+      <w:r>
+        <w:rPr>
+          <w:lang w:val="en-CA"/>
+        </w:rPr>
+        <w:t xml:space="preserve">, I., &amp; Silver, D. (2016). </w:t>
       </w:r>
       <w:r>
         <w:rPr>
@@ -1328,7 +1280,7 @@
         </w:rPr>
         <w:t xml:space="preserve">. Proceedings of the 4th International Conference on Learning Representations (ICLR). </w:t>
       </w:r>
-      <w:hyperlink r:id="rId7" w:tgtFrame="_blank">
+      <w:hyperlink r:id="rId12" w:tgtFrame="_blank">
         <w:r>
           <w:rPr>
             <w:rStyle w:val="Hyperlink"/>
@@ -1340,23 +1292,16 @@
     </w:p>
     <w:p>
       <w:pPr>
-        <w:pStyle w:val="Normal"/>
-        <w:spacing w:lineRule="auto" w:line="480"/>
+        <w:spacing w:line="480" w:lineRule="auto"/>
         <w:ind w:left="720"/>
         <w:rPr>
           <w:lang w:val="en-CA"/>
         </w:rPr>
       </w:pPr>
-      <w:r>
-        <w:rPr>
-          <w:lang w:val="en-CA"/>
-        </w:rPr>
-      </w:r>
-    </w:p>
-    <w:p>
-      <w:pPr>
-        <w:pStyle w:val="Normal"/>
-        <w:spacing w:lineRule="auto" w:line="480"/>
+    </w:p>
+    <w:p>
+      <w:pPr>
+        <w:spacing w:line="480" w:lineRule="auto"/>
         <w:ind w:left="720"/>
         <w:rPr>
           <w:lang w:val="en-CA"/>
@@ -1380,9 +1325,23 @@
         <w:rPr>
           <w:lang w:val="en-CA"/>
         </w:rPr>
-        <w:t xml:space="preserve">. arXiv. </w:t>
-      </w:r>
-      <w:hyperlink r:id="rId8" w:tgtFrame="_blank">
+        <w:t xml:space="preserve">. </w:t>
+      </w:r>
+      <w:proofErr w:type="spellStart"/>
+      <w:r>
+        <w:rPr>
+          <w:lang w:val="en-CA"/>
+        </w:rPr>
+        <w:t>arXiv</w:t>
+      </w:r>
+      <w:proofErr w:type="spellEnd"/>
+      <w:r>
+        <w:rPr>
+          <w:lang w:val="en-CA"/>
+        </w:rPr>
+        <w:t xml:space="preserve">. </w:t>
+      </w:r>
+      <w:hyperlink r:id="rId13" w:tgtFrame="_blank">
         <w:r>
           <w:rPr>
             <w:rStyle w:val="Hyperlink"/>
@@ -1394,22 +1353,15 @@
     </w:p>
     <w:p>
       <w:pPr>
-        <w:pStyle w:val="Normal"/>
-        <w:spacing w:lineRule="auto" w:line="480"/>
-        <w:rPr>
-          <w:lang w:val="en-CA"/>
-        </w:rPr>
-      </w:pPr>
-      <w:r>
-        <w:rPr>
-          <w:lang w:val="en-CA"/>
-        </w:rPr>
-      </w:r>
-    </w:p>
-    <w:p>
-      <w:pPr>
-        <w:pStyle w:val="Normal"/>
-        <w:spacing w:lineRule="auto" w:line="480"/>
+        <w:spacing w:line="480" w:lineRule="auto"/>
+        <w:rPr>
+          <w:lang w:val="en-CA"/>
+        </w:rPr>
+      </w:pPr>
+    </w:p>
+    <w:p>
+      <w:pPr>
+        <w:spacing w:line="480" w:lineRule="auto"/>
         <w:ind w:left="720"/>
         <w:rPr>
           <w:lang w:val="en-CA"/>
@@ -1419,7 +1371,49 @@
         <w:rPr>
           <w:lang w:val="en-CA"/>
         </w:rPr>
-        <w:t xml:space="preserve">Vaswani, A., Shazeer, N., Parmar, N., Uszkoreit, J., Jones, L., Gomez, A. N., Kaiser, Ł., &amp; Polosukhin, Illia. (2017). Attention is all you need. </w:t>
+        <w:t xml:space="preserve">Vaswani, A., </w:t>
+      </w:r>
+      <w:proofErr w:type="spellStart"/>
+      <w:r>
+        <w:rPr>
+          <w:lang w:val="en-CA"/>
+        </w:rPr>
+        <w:t>Shazeer</w:t>
+      </w:r>
+      <w:proofErr w:type="spellEnd"/>
+      <w:r>
+        <w:rPr>
+          <w:lang w:val="en-CA"/>
+        </w:rPr>
+        <w:t xml:space="preserve">, N., Parmar, N., </w:t>
+      </w:r>
+      <w:proofErr w:type="spellStart"/>
+      <w:r>
+        <w:rPr>
+          <w:lang w:val="en-CA"/>
+        </w:rPr>
+        <w:t>Uszkoreit</w:t>
+      </w:r>
+      <w:proofErr w:type="spellEnd"/>
+      <w:r>
+        <w:rPr>
+          <w:lang w:val="en-CA"/>
+        </w:rPr>
+        <w:t xml:space="preserve">, J., Jones, L., Gomez, A. N., Kaiser, Ł., &amp; </w:t>
+      </w:r>
+      <w:proofErr w:type="spellStart"/>
+      <w:r>
+        <w:rPr>
+          <w:lang w:val="en-CA"/>
+        </w:rPr>
+        <w:t>Polosukhin</w:t>
+      </w:r>
+      <w:proofErr w:type="spellEnd"/>
+      <w:r>
+        <w:rPr>
+          <w:lang w:val="en-CA"/>
+        </w:rPr>
+        <w:t xml:space="preserve">, Illia. (2017). Attention is all you need. </w:t>
       </w:r>
       <w:r>
         <w:rPr>
@@ -1427,7 +1421,25 @@
           <w:iCs/>
           <w:lang w:val="en-CA"/>
         </w:rPr>
-        <w:t>Advances in Neural Information Processing Systems (NeurIPS)</w:t>
+        <w:t>Advances in Neural Information Processing Systems (</w:t>
+      </w:r>
+      <w:proofErr w:type="spellStart"/>
+      <w:r>
+        <w:rPr>
+          <w:i/>
+          <w:iCs/>
+          <w:lang w:val="en-CA"/>
+        </w:rPr>
+        <w:t>NeurIPS</w:t>
+      </w:r>
+      <w:proofErr w:type="spellEnd"/>
+      <w:r>
+        <w:rPr>
+          <w:i/>
+          <w:iCs/>
+          <w:lang w:val="en-CA"/>
+        </w:rPr>
+        <w:t>)</w:t>
       </w:r>
       <w:r>
         <w:rPr>
@@ -1435,7 +1447,7 @@
         </w:rPr>
         <w:t xml:space="preserve">, 5998–6008. </w:t>
       </w:r>
-      <w:hyperlink r:id="rId9" w:tgtFrame="_blank">
+      <w:hyperlink r:id="rId14" w:tgtFrame="_blank">
         <w:r>
           <w:rPr>
             <w:rStyle w:val="Hyperlink"/>
@@ -1447,83 +1459,95 @@
     </w:p>
     <w:p>
       <w:pPr>
-        <w:pStyle w:val="Normal"/>
-        <w:spacing w:lineRule="auto" w:line="480"/>
+        <w:spacing w:line="480" w:lineRule="auto"/>
         <w:ind w:left="720"/>
         <w:rPr>
           <w:lang w:val="en-CA"/>
         </w:rPr>
       </w:pPr>
-      <w:r>
-        <w:rPr>
-          <w:lang w:val="en-CA"/>
-        </w:rPr>
-      </w:r>
-    </w:p>
-    <w:p>
-      <w:pPr>
-        <w:pStyle w:val="Normal"/>
-        <w:spacing w:lineRule="auto" w:line="480"/>
+    </w:p>
+    <w:p>
+      <w:pPr>
+        <w:spacing w:line="480" w:lineRule="auto"/>
         <w:ind w:left="720"/>
         <w:rPr>
           <w:lang w:val="en-CA"/>
         </w:rPr>
       </w:pPr>
-      <w:r>
-        <w:rPr>
-          <w:lang w:val="en-CA"/>
-        </w:rPr>
-      </w:r>
-    </w:p>
-    <w:p>
-      <w:pPr>
-        <w:pStyle w:val="Normal"/>
-        <w:spacing w:lineRule="auto" w:line="480"/>
+    </w:p>
+    <w:p>
+      <w:pPr>
+        <w:spacing w:line="480" w:lineRule="auto"/>
         <w:ind w:left="720"/>
         <w:rPr>
           <w:lang w:val="en-CA"/>
         </w:rPr>
       </w:pPr>
-      <w:r>
-        <w:rPr>
-          <w:lang w:val="en-CA"/>
-        </w:rPr>
-      </w:r>
-    </w:p>
-    <w:p>
-      <w:pPr>
-        <w:pStyle w:val="Normal"/>
-        <w:spacing w:lineRule="auto" w:line="480"/>
-        <w:ind w:hanging="720" w:left="720"/>
-        <w:rPr/>
-      </w:pPr>
-      <w:r>
-        <w:rPr/>
-      </w:r>
+    </w:p>
+    <w:p>
+      <w:pPr>
+        <w:spacing w:line="480" w:lineRule="auto"/>
+        <w:ind w:left="720" w:hanging="720"/>
+      </w:pPr>
     </w:p>
     <w:sectPr>
-      <w:headerReference w:type="even" r:id="rId10"/>
-      <w:headerReference w:type="default" r:id="rId11"/>
-      <w:headerReference w:type="first" r:id="rId12"/>
-      <w:type w:val="nextPage"/>
+      <w:headerReference w:type="even" r:id="rId15"/>
+      <w:headerReference w:type="default" r:id="rId16"/>
+      <w:headerReference w:type="first" r:id="rId17"/>
       <w:pgSz w:w="12240" w:h="15840"/>
-      <w:pgMar w:left="1440" w:right="1440" w:gutter="0" w:header="720" w:top="1440" w:footer="0" w:bottom="1440"/>
-      <w:pgNumType w:start="1" w:fmt="decimal"/>
-      <w:formProt w:val="false"/>
-      <w:textDirection w:val="lrTb"/>
-      <w:docGrid w:type="default" w:linePitch="100" w:charSpace="0"/>
+      <w:pgMar w:top="1440" w:right="1440" w:bottom="1440" w:left="1440" w:header="720" w:footer="0" w:gutter="0"/>
+      <w:pgNumType w:start="1"/>
+      <w:cols w:space="720"/>
+      <w:formProt w:val="0"/>
+      <w:docGrid w:linePitch="100"/>
     </w:sectPr>
   </w:body>
 </w:document>
 </file>
 
+<file path=word/endnotes.xml><?xml version="1.0" encoding="utf-8"?>
+<w:endnotes xmlns:wpc="http://schemas.microsoft.com/office/word/2010/wordprocessingCanvas" xmlns:cx="http://schemas.microsoft.com/office/drawing/2014/chartex" xmlns:cx1="http://schemas.microsoft.com/office/drawing/2015/9/8/chartex" xmlns:cx2="http://schemas.microsoft.com/office/drawing/2015/10/21/chartex" xmlns:cx3="http://schemas.microsoft.com/office/drawing/2016/5/9/chartex" xmlns:cx4="http://schemas.microsoft.com/office/drawing/2016/5/10/chartex" xmlns:cx5="http://schemas.microsoft.com/office/drawing/2016/5/11/chartex" xmlns:cx6="http://schemas.microsoft.com/office/drawing/2016/5/12/chartex" xmlns:cx7="http://schemas.microsoft.com/office/drawing/2016/5/13/chartex" xmlns:cx8="http://schemas.microsoft.com/office/drawing/2016/5/14/chartex" xmlns:mc="http://schemas.openxmlformats.org/markup-compatibility/2006" xmlns:aink="http://schemas.microsoft.com/office/drawing/2016/ink" xmlns:am3d="http://schemas.microsoft.com/office/drawing/2017/model3d" xmlns:o="urn:schemas-microsoft-com:office:office" xmlns:oel="http://schemas.microsoft.com/office/2019/extlst" xmlns:r="http://schemas.openxmlformats.org/officeDocument/2006/relationships" xmlns:m="http://schemas.openxmlformats.org/officeDocument/2006/math" xmlns:v="urn:schemas-microsoft-com:vml" xmlns:wp14="http://schemas.microsoft.com/office/word/2010/wordprocessingDrawing" xmlns:wp="http://schemas.openxmlformats.org/drawingml/2006/wordprocessingDrawing" xmlns:w10="urn:schemas-microsoft-com:office:word" xmlns:w="http://schemas.openxmlformats.org/wordprocessingml/2006/main" xmlns:w14="http://schemas.microsoft.com/office/word/2010/wordml" xmlns:w15="http://schemas.microsoft.com/office/word/2012/wordml" xmlns:w16cex="http://schemas.microsoft.com/office/word/2018/wordml/cex" xmlns:w16cid="http://schemas.microsoft.com/office/word/2016/wordml/cid" xmlns:w16="http://schemas.microsoft.com/office/word/2018/wordml" xmlns:w16du="http://schemas.microsoft.com/office/word/2023/wordml/word16du" xmlns:w16sdtdh="http://schemas.microsoft.com/office/word/2020/wordml/sdtdatahash" xmlns:w16sdtfl="http://schemas.microsoft.com/office/word/2024/wordml/sdtformatlock" xmlns:w16se="http://schemas.microsoft.com/office/word/2015/wordml/symex" xmlns:wpg="http://schemas.microsoft.com/office/word/2010/wordprocessingGroup" xmlns:wpi="http://schemas.microsoft.com/office/word/2010/wordprocessingInk" xmlns:wne="http://schemas.microsoft.com/office/word/2006/wordml" xmlns:wps="http://schemas.microsoft.com/office/word/2010/wordprocessingShape" mc:Ignorable="w14 w15 w16se w16cid w16 w16cex w16sdtdh w16sdtfl w16du wp14">
+  <w:endnote w:type="separator" w:id="-1">
+    <w:p>
+      <w:r>
+        <w:separator/>
+      </w:r>
+    </w:p>
+  </w:endnote>
+  <w:endnote w:type="continuationSeparator" w:id="0">
+    <w:p>
+      <w:r>
+        <w:continuationSeparator/>
+      </w:r>
+    </w:p>
+  </w:endnote>
+</w:endnotes>
+</file>
+
+<file path=word/footnotes.xml><?xml version="1.0" encoding="utf-8"?>
+<w:footnotes xmlns:wpc="http://schemas.microsoft.com/office/word/2010/wordprocessingCanvas" xmlns:cx="http://schemas.microsoft.com/office/drawing/2014/chartex" xmlns:cx1="http://schemas.microsoft.com/office/drawing/2015/9/8/chartex" xmlns:cx2="http://schemas.microsoft.com/office/drawing/2015/10/21/chartex" xmlns:cx3="http://schemas.microsoft.com/office/drawing/2016/5/9/chartex" xmlns:cx4="http://schemas.microsoft.com/office/drawing/2016/5/10/chartex" xmlns:cx5="http://schemas.microsoft.com/office/drawing/2016/5/11/chartex" xmlns:cx6="http://schemas.microsoft.com/office/drawing/2016/5/12/chartex" xmlns:cx7="http://schemas.microsoft.com/office/drawing/2016/5/13/chartex" xmlns:cx8="http://schemas.microsoft.com/office/drawing/2016/5/14/chartex" xmlns:mc="http://schemas.openxmlformats.org/markup-compatibility/2006" xmlns:aink="http://schemas.microsoft.com/office/drawing/2016/ink" xmlns:am3d="http://schemas.microsoft.com/office/drawing/2017/model3d" xmlns:o="urn:schemas-microsoft-com:office:office" xmlns:oel="http://schemas.microsoft.com/office/2019/extlst" xmlns:r="http://schemas.openxmlformats.org/officeDocument/2006/relationships" xmlns:m="http://schemas.openxmlformats.org/officeDocument/2006/math" xmlns:v="urn:schemas-microsoft-com:vml" xmlns:wp14="http://schemas.microsoft.com/office/word/2010/wordprocessingDrawing" xmlns:wp="http://schemas.openxmlformats.org/drawingml/2006/wordprocessingDrawing" xmlns:w10="urn:schemas-microsoft-com:office:word" xmlns:w="http://schemas.openxmlformats.org/wordprocessingml/2006/main" xmlns:w14="http://schemas.microsoft.com/office/word/2010/wordml" xmlns:w15="http://schemas.microsoft.com/office/word/2012/wordml" xmlns:w16cex="http://schemas.microsoft.com/office/word/2018/wordml/cex" xmlns:w16cid="http://schemas.microsoft.com/office/word/2016/wordml/cid" xmlns:w16="http://schemas.microsoft.com/office/word/2018/wordml" xmlns:w16du="http://schemas.microsoft.com/office/word/2023/wordml/word16du" xmlns:w16sdtdh="http://schemas.microsoft.com/office/word/2020/wordml/sdtdatahash" xmlns:w16sdtfl="http://schemas.microsoft.com/office/word/2024/wordml/sdtformatlock" xmlns:w16se="http://schemas.microsoft.com/office/word/2015/wordml/symex" xmlns:wpg="http://schemas.microsoft.com/office/word/2010/wordprocessingGroup" xmlns:wpi="http://schemas.microsoft.com/office/word/2010/wordprocessingInk" xmlns:wne="http://schemas.microsoft.com/office/word/2006/wordml" xmlns:wps="http://schemas.microsoft.com/office/word/2010/wordprocessingShape" mc:Ignorable="w14 w15 w16se w16cid w16 w16cex w16sdtdh w16sdtfl w16du wp14">
+  <w:footnote w:type="separator" w:id="-1">
+    <w:p>
+      <w:r>
+        <w:separator/>
+      </w:r>
+    </w:p>
+  </w:footnote>
+  <w:footnote w:type="continuationSeparator" w:id="0">
+    <w:p>
+      <w:r>
+        <w:continuationSeparator/>
+      </w:r>
+    </w:p>
+  </w:footnote>
+</w:footnotes>
+</file>
+
 <file path=word/header1.xml><?xml version="1.0" encoding="utf-8"?>
-<w:hdr xmlns:o="urn:schemas-microsoft-com:office:office" xmlns:r="http://schemas.openxmlformats.org/officeDocument/2006/relationships" xmlns:v="urn:schemas-microsoft-com:vml" xmlns:w="http://schemas.openxmlformats.org/wordprocessingml/2006/main" xmlns:w10="urn:schemas-microsoft-com:office:word" xmlns:wp="http://schemas.openxmlformats.org/drawingml/2006/wordprocessingDrawing" xmlns:wps="http://schemas.microsoft.com/office/word/2010/wordprocessingShape" xmlns:wpg="http://schemas.microsoft.com/office/word/2010/wordprocessingGroup" xmlns:mc="http://schemas.openxmlformats.org/markup-compatibility/2006" xmlns:wp14="http://schemas.microsoft.com/office/word/2010/wordprocessingDrawing" xmlns:w14="http://schemas.microsoft.com/office/word/2010/wordml" xmlns:w15="http://schemas.microsoft.com/office/word/2012/wordml" mc:Ignorable="w14 wp14 w15">
+<w:hdr xmlns:wpc="http://schemas.microsoft.com/office/word/2010/wordprocessingCanvas" xmlns:cx="http://schemas.microsoft.com/office/drawing/2014/chartex" xmlns:cx1="http://schemas.microsoft.com/office/drawing/2015/9/8/chartex" xmlns:cx2="http://schemas.microsoft.com/office/drawing/2015/10/21/chartex" xmlns:cx3="http://schemas.microsoft.com/office/drawing/2016/5/9/chartex" xmlns:cx4="http://schemas.microsoft.com/office/drawing/2016/5/10/chartex" xmlns:cx5="http://schemas.microsoft.com/office/drawing/2016/5/11/chartex" xmlns:cx6="http://schemas.microsoft.com/office/drawing/2016/5/12/chartex" xmlns:cx7="http://schemas.microsoft.com/office/drawing/2016/5/13/chartex" xmlns:cx8="http://schemas.microsoft.com/office/drawing/2016/5/14/chartex" xmlns:mc="http://schemas.openxmlformats.org/markup-compatibility/2006" xmlns:aink="http://schemas.microsoft.com/office/drawing/2016/ink" xmlns:am3d="http://schemas.microsoft.com/office/drawing/2017/model3d" xmlns:o="urn:schemas-microsoft-com:office:office" xmlns:oel="http://schemas.microsoft.com/office/2019/extlst" xmlns:r="http://schemas.openxmlformats.org/officeDocument/2006/relationships" xmlns:m="http://schemas.openxmlformats.org/officeDocument/2006/math" xmlns:v="urn:schemas-microsoft-com:vml" xmlns:wp14="http://schemas.microsoft.com/office/word/2010/wordprocessingDrawing" xmlns:wp="http://schemas.openxmlformats.org/drawingml/2006/wordprocessingDrawing" xmlns:w10="urn:schemas-microsoft-com:office:word" xmlns:w="http://schemas.openxmlformats.org/wordprocessingml/2006/main" xmlns:w14="http://schemas.microsoft.com/office/word/2010/wordml" xmlns:w15="http://schemas.microsoft.com/office/word/2012/wordml" xmlns:w16cex="http://schemas.microsoft.com/office/word/2018/wordml/cex" xmlns:w16cid="http://schemas.microsoft.com/office/word/2016/wordml/cid" xmlns:w16="http://schemas.microsoft.com/office/word/2018/wordml" xmlns:w16du="http://schemas.microsoft.com/office/word/2023/wordml/word16du" xmlns:w16sdtdh="http://schemas.microsoft.com/office/word/2020/wordml/sdtdatahash" xmlns:w16sdtfl="http://schemas.microsoft.com/office/word/2024/wordml/sdtformatlock" xmlns:w16se="http://schemas.microsoft.com/office/word/2015/wordml/symex" xmlns:wpg="http://schemas.microsoft.com/office/word/2010/wordprocessingGroup" xmlns:wpi="http://schemas.microsoft.com/office/word/2010/wordprocessingInk" xmlns:wne="http://schemas.microsoft.com/office/word/2006/wordml" xmlns:wps="http://schemas.microsoft.com/office/word/2010/wordprocessingShape" mc:Ignorable="w14 w15 w16se w16cid w16 w16cex w16sdtdh w16sdtfl w16du wp14">
   <w:p>
     <w:pPr>
-      <w:pStyle w:val="Normal"/>
-      <w:pBdr/>
-      <w:spacing w:lineRule="auto" w:line="480"/>
+      <w:spacing w:line="480" w:lineRule="auto"/>
       <w:rPr>
         <w:color w:val="000000"/>
       </w:rPr>
@@ -1561,33 +1585,23 @@
   </w:p>
   <w:p>
     <w:pPr>
-      <w:pStyle w:val="Normal"/>
-      <w:pBdr/>
-      <w:spacing w:lineRule="auto" w:line="480"/>
+      <w:spacing w:line="480" w:lineRule="auto"/>
       <w:rPr>
         <w:color w:val="000000"/>
       </w:rPr>
     </w:pPr>
-    <w:r>
-      <w:rPr>
-        <w:color w:val="000000"/>
-      </w:rPr>
-    </w:r>
   </w:p>
 </w:hdr>
 </file>
 
 <file path=word/header2.xml><?xml version="1.0" encoding="utf-8"?>
-<w:hdr xmlns:o="urn:schemas-microsoft-com:office:office" xmlns:r="http://schemas.openxmlformats.org/officeDocument/2006/relationships" xmlns:v="urn:schemas-microsoft-com:vml" xmlns:w="http://schemas.openxmlformats.org/wordprocessingml/2006/main" xmlns:w10="urn:schemas-microsoft-com:office:word" xmlns:wp="http://schemas.openxmlformats.org/drawingml/2006/wordprocessingDrawing" xmlns:wps="http://schemas.microsoft.com/office/word/2010/wordprocessingShape" xmlns:wpg="http://schemas.microsoft.com/office/word/2010/wordprocessingGroup" xmlns:mc="http://schemas.openxmlformats.org/markup-compatibility/2006" xmlns:wp14="http://schemas.microsoft.com/office/word/2010/wordprocessingDrawing" xmlns:w14="http://schemas.microsoft.com/office/word/2010/wordml" xmlns:w15="http://schemas.microsoft.com/office/word/2012/wordml" mc:Ignorable="w14 wp14 w15">
+<w:hdr xmlns:wpc="http://schemas.microsoft.com/office/word/2010/wordprocessingCanvas" xmlns:cx="http://schemas.microsoft.com/office/drawing/2014/chartex" xmlns:cx1="http://schemas.microsoft.com/office/drawing/2015/9/8/chartex" xmlns:cx2="http://schemas.microsoft.com/office/drawing/2015/10/21/chartex" xmlns:cx3="http://schemas.microsoft.com/office/drawing/2016/5/9/chartex" xmlns:cx4="http://schemas.microsoft.com/office/drawing/2016/5/10/chartex" xmlns:cx5="http://schemas.microsoft.com/office/drawing/2016/5/11/chartex" xmlns:cx6="http://schemas.microsoft.com/office/drawing/2016/5/12/chartex" xmlns:cx7="http://schemas.microsoft.com/office/drawing/2016/5/13/chartex" xmlns:cx8="http://schemas.microsoft.com/office/drawing/2016/5/14/chartex" xmlns:mc="http://schemas.openxmlformats.org/markup-compatibility/2006" xmlns:aink="http://schemas.microsoft.com/office/drawing/2016/ink" xmlns:am3d="http://schemas.microsoft.com/office/drawing/2017/model3d" xmlns:o="urn:schemas-microsoft-com:office:office" xmlns:oel="http://schemas.microsoft.com/office/2019/extlst" xmlns:r="http://schemas.openxmlformats.org/officeDocument/2006/relationships" xmlns:m="http://schemas.openxmlformats.org/officeDocument/2006/math" xmlns:v="urn:schemas-microsoft-com:vml" xmlns:wp14="http://schemas.microsoft.com/office/word/2010/wordprocessingDrawing" xmlns:wp="http://schemas.openxmlformats.org/drawingml/2006/wordprocessingDrawing" xmlns:w10="urn:schemas-microsoft-com:office:word" xmlns:w="http://schemas.openxmlformats.org/wordprocessingml/2006/main" xmlns:w14="http://schemas.microsoft.com/office/word/2010/wordml" xmlns:w15="http://schemas.microsoft.com/office/word/2012/wordml" xmlns:w16cex="http://schemas.microsoft.com/office/word/2018/wordml/cex" xmlns:w16cid="http://schemas.microsoft.com/office/word/2016/wordml/cid" xmlns:w16="http://schemas.microsoft.com/office/word/2018/wordml" xmlns:w16du="http://schemas.microsoft.com/office/word/2023/wordml/word16du" xmlns:w16sdtdh="http://schemas.microsoft.com/office/word/2020/wordml/sdtdatahash" xmlns:w16sdtfl="http://schemas.microsoft.com/office/word/2024/wordml/sdtformatlock" xmlns:w16se="http://schemas.microsoft.com/office/word/2015/wordml/symex" xmlns:wpg="http://schemas.microsoft.com/office/word/2010/wordprocessingGroup" xmlns:wpi="http://schemas.microsoft.com/office/word/2010/wordprocessingInk" xmlns:wne="http://schemas.microsoft.com/office/word/2006/wordml" xmlns:wps="http://schemas.microsoft.com/office/word/2010/wordprocessingShape" mc:Ignorable="w14 w15 w16se w16cid w16 w16cex w16sdtdh w16sdtfl w16du wp14">
   <w:p>
     <w:pPr>
-      <w:pStyle w:val="Normal"/>
-      <w:pBdr/>
       <w:tabs>
-        <w:tab w:val="clear" w:pos="720"/>
-        <w:tab w:val="right" w:pos="9360" w:leader="none"/>
+        <w:tab w:val="right" w:pos="9360"/>
       </w:tabs>
-      <w:spacing w:lineRule="auto" w:line="480"/>
+      <w:spacing w:line="480" w:lineRule="auto"/>
       <w:rPr>
         <w:color w:val="000000"/>
       </w:rPr>
@@ -1633,16 +1647,13 @@
 </file>
 
 <file path=word/header3.xml><?xml version="1.0" encoding="utf-8"?>
-<w:hdr xmlns:o="urn:schemas-microsoft-com:office:office" xmlns:r="http://schemas.openxmlformats.org/officeDocument/2006/relationships" xmlns:v="urn:schemas-microsoft-com:vml" xmlns:w="http://schemas.openxmlformats.org/wordprocessingml/2006/main" xmlns:w10="urn:schemas-microsoft-com:office:word" xmlns:wp="http://schemas.openxmlformats.org/drawingml/2006/wordprocessingDrawing" xmlns:wps="http://schemas.microsoft.com/office/word/2010/wordprocessingShape" xmlns:wpg="http://schemas.microsoft.com/office/word/2010/wordprocessingGroup" xmlns:mc="http://schemas.openxmlformats.org/markup-compatibility/2006" xmlns:wp14="http://schemas.microsoft.com/office/word/2010/wordprocessingDrawing" xmlns:w14="http://schemas.microsoft.com/office/word/2010/wordml" xmlns:w15="http://schemas.microsoft.com/office/word/2012/wordml" mc:Ignorable="w14 wp14 w15">
+<w:hdr xmlns:wpc="http://schemas.microsoft.com/office/word/2010/wordprocessingCanvas" xmlns:cx="http://schemas.microsoft.com/office/drawing/2014/chartex" xmlns:cx1="http://schemas.microsoft.com/office/drawing/2015/9/8/chartex" xmlns:cx2="http://schemas.microsoft.com/office/drawing/2015/10/21/chartex" xmlns:cx3="http://schemas.microsoft.com/office/drawing/2016/5/9/chartex" xmlns:cx4="http://schemas.microsoft.com/office/drawing/2016/5/10/chartex" xmlns:cx5="http://schemas.microsoft.com/office/drawing/2016/5/11/chartex" xmlns:cx6="http://schemas.microsoft.com/office/drawing/2016/5/12/chartex" xmlns:cx7="http://schemas.microsoft.com/office/drawing/2016/5/13/chartex" xmlns:cx8="http://schemas.microsoft.com/office/drawing/2016/5/14/chartex" xmlns:mc="http://schemas.openxmlformats.org/markup-compatibility/2006" xmlns:aink="http://schemas.microsoft.com/office/drawing/2016/ink" xmlns:am3d="http://schemas.microsoft.com/office/drawing/2017/model3d" xmlns:o="urn:schemas-microsoft-com:office:office" xmlns:oel="http://schemas.microsoft.com/office/2019/extlst" xmlns:r="http://schemas.openxmlformats.org/officeDocument/2006/relationships" xmlns:m="http://schemas.openxmlformats.org/officeDocument/2006/math" xmlns:v="urn:schemas-microsoft-com:vml" xmlns:wp14="http://schemas.microsoft.com/office/word/2010/wordprocessingDrawing" xmlns:wp="http://schemas.openxmlformats.org/drawingml/2006/wordprocessingDrawing" xmlns:w10="urn:schemas-microsoft-com:office:word" xmlns:w="http://schemas.openxmlformats.org/wordprocessingml/2006/main" xmlns:w14="http://schemas.microsoft.com/office/word/2010/wordml" xmlns:w15="http://schemas.microsoft.com/office/word/2012/wordml" xmlns:w16cex="http://schemas.microsoft.com/office/word/2018/wordml/cex" xmlns:w16cid="http://schemas.microsoft.com/office/word/2016/wordml/cid" xmlns:w16="http://schemas.microsoft.com/office/word/2018/wordml" xmlns:w16du="http://schemas.microsoft.com/office/word/2023/wordml/word16du" xmlns:w16sdtdh="http://schemas.microsoft.com/office/word/2020/wordml/sdtdatahash" xmlns:w16sdtfl="http://schemas.microsoft.com/office/word/2024/wordml/sdtformatlock" xmlns:w16se="http://schemas.microsoft.com/office/word/2015/wordml/symex" xmlns:wpg="http://schemas.microsoft.com/office/word/2010/wordprocessingGroup" xmlns:wpi="http://schemas.microsoft.com/office/word/2010/wordprocessingInk" xmlns:wne="http://schemas.microsoft.com/office/word/2006/wordml" xmlns:wps="http://schemas.microsoft.com/office/word/2010/wordprocessingShape" mc:Ignorable="w14 w15 w16se w16cid w16 w16cex w16sdtdh w16sdtfl w16du wp14">
   <w:p>
     <w:pPr>
-      <w:pStyle w:val="Normal"/>
-      <w:pBdr/>
       <w:tabs>
-        <w:tab w:val="clear" w:pos="720"/>
-        <w:tab w:val="right" w:pos="9360" w:leader="none"/>
+        <w:tab w:val="right" w:pos="9360"/>
       </w:tabs>
-      <w:spacing w:lineRule="auto" w:line="480"/>
+      <w:spacing w:line="480" w:lineRule="auto"/>
       <w:rPr>
         <w:color w:val="000000"/>
       </w:rPr>
@@ -1688,8 +1699,11 @@
 </file>
 
 <file path=word/numbering.xml><?xml version="1.0" encoding="utf-8"?>
-<w:numbering xmlns:w="http://schemas.openxmlformats.org/wordprocessingml/2006/main" xmlns:o="urn:schemas-microsoft-com:office:office" xmlns:r="http://schemas.openxmlformats.org/officeDocument/2006/relationships" xmlns:v="urn:schemas-microsoft-com:vml" xmlns:mc="http://schemas.openxmlformats.org/markup-compatibility/2006" xmlns:w14="http://schemas.microsoft.com/office/word/2010/wordml" mc:Ignorable="w14">
-  <w:abstractNum w:abstractNumId="1">
+<w:numbering xmlns:wpc="http://schemas.microsoft.com/office/word/2010/wordprocessingCanvas" xmlns:cx="http://schemas.microsoft.com/office/drawing/2014/chartex" xmlns:cx1="http://schemas.microsoft.com/office/drawing/2015/9/8/chartex" xmlns:cx2="http://schemas.microsoft.com/office/drawing/2015/10/21/chartex" xmlns:cx3="http://schemas.microsoft.com/office/drawing/2016/5/9/chartex" xmlns:cx4="http://schemas.microsoft.com/office/drawing/2016/5/10/chartex" xmlns:cx5="http://schemas.microsoft.com/office/drawing/2016/5/11/chartex" xmlns:cx6="http://schemas.microsoft.com/office/drawing/2016/5/12/chartex" xmlns:cx7="http://schemas.microsoft.com/office/drawing/2016/5/13/chartex" xmlns:cx8="http://schemas.microsoft.com/office/drawing/2016/5/14/chartex" xmlns:mc="http://schemas.openxmlformats.org/markup-compatibility/2006" xmlns:aink="http://schemas.microsoft.com/office/drawing/2016/ink" xmlns:am3d="http://schemas.microsoft.com/office/drawing/2017/model3d" xmlns:o="urn:schemas-microsoft-com:office:office" xmlns:oel="http://schemas.microsoft.com/office/2019/extlst" xmlns:r="http://schemas.openxmlformats.org/officeDocument/2006/relationships" xmlns:m="http://schemas.openxmlformats.org/officeDocument/2006/math" xmlns:v="urn:schemas-microsoft-com:vml" xmlns:wp14="http://schemas.microsoft.com/office/word/2010/wordprocessingDrawing" xmlns:wp="http://schemas.openxmlformats.org/drawingml/2006/wordprocessingDrawing" xmlns:w10="urn:schemas-microsoft-com:office:word" xmlns:w="http://schemas.openxmlformats.org/wordprocessingml/2006/main" xmlns:w14="http://schemas.microsoft.com/office/word/2010/wordml" xmlns:w15="http://schemas.microsoft.com/office/word/2012/wordml" xmlns:w16cex="http://schemas.microsoft.com/office/word/2018/wordml/cex" xmlns:w16cid="http://schemas.microsoft.com/office/word/2016/wordml/cid" xmlns:w16="http://schemas.microsoft.com/office/word/2018/wordml" xmlns:w16du="http://schemas.microsoft.com/office/word/2023/wordml/word16du" xmlns:w16sdtdh="http://schemas.microsoft.com/office/word/2020/wordml/sdtdatahash" xmlns:w16sdtfl="http://schemas.microsoft.com/office/word/2024/wordml/sdtformatlock" xmlns:w16se="http://schemas.microsoft.com/office/word/2015/wordml/symex" xmlns:wpg="http://schemas.microsoft.com/office/word/2010/wordprocessingGroup" xmlns:wpi="http://schemas.microsoft.com/office/word/2010/wordprocessingInk" xmlns:wne="http://schemas.microsoft.com/office/word/2006/wordml" xmlns:wps="http://schemas.microsoft.com/office/word/2010/wordprocessingShape" mc:Ignorable="w14 w15 w16se w16cid w16 w16cex w16sdtdh w16sdtfl w16du wp14">
+  <w:abstractNum w:abstractNumId="0" w15:restartNumberingAfterBreak="0">
+    <w:nsid w:val="1FF649DE"/>
+    <w:multiLevelType w:val="multilevel"/>
+    <w:tmpl w:val="FD16B74C"/>
     <w:lvl w:ilvl="0">
       <w:start w:val="1"/>
       <w:numFmt w:val="bullet"/>
@@ -1699,7 +1713,7 @@
         <w:tabs>
           <w:tab w:val="num" w:pos="0"/>
         </w:tabs>
-        <w:ind w:left="1440" w:hanging="360"/>
+        <w:ind w:left="720" w:hanging="360"/>
       </w:pPr>
       <w:rPr>
         <w:rFonts w:ascii="Symbol" w:hAnsi="Symbol" w:cs="Symbol" w:hint="default"/>
@@ -1714,7 +1728,7 @@
         <w:tabs>
           <w:tab w:val="num" w:pos="0"/>
         </w:tabs>
-        <w:ind w:left="2160" w:hanging="360"/>
+        <w:ind w:left="1440" w:hanging="360"/>
       </w:pPr>
       <w:rPr>
         <w:rFonts w:ascii="Courier New" w:hAnsi="Courier New" w:cs="Courier New" w:hint="default"/>
@@ -1729,7 +1743,7 @@
         <w:tabs>
           <w:tab w:val="num" w:pos="0"/>
         </w:tabs>
-        <w:ind w:left="2880" w:hanging="360"/>
+        <w:ind w:left="2160" w:hanging="360"/>
       </w:pPr>
       <w:rPr>
         <w:rFonts w:ascii="Wingdings" w:hAnsi="Wingdings" w:cs="Wingdings" w:hint="default"/>
@@ -1744,7 +1758,7 @@
         <w:tabs>
           <w:tab w:val="num" w:pos="0"/>
         </w:tabs>
-        <w:ind w:left="3600" w:hanging="360"/>
+        <w:ind w:left="2880" w:hanging="360"/>
       </w:pPr>
       <w:rPr>
         <w:rFonts w:ascii="Symbol" w:hAnsi="Symbol" w:cs="Symbol" w:hint="default"/>
@@ -1759,7 +1773,7 @@
         <w:tabs>
           <w:tab w:val="num" w:pos="0"/>
         </w:tabs>
-        <w:ind w:left="4320" w:hanging="360"/>
+        <w:ind w:left="3600" w:hanging="360"/>
       </w:pPr>
       <w:rPr>
         <w:rFonts w:ascii="Courier New" w:hAnsi="Courier New" w:cs="Courier New" w:hint="default"/>
@@ -1774,7 +1788,7 @@
         <w:tabs>
           <w:tab w:val="num" w:pos="0"/>
         </w:tabs>
-        <w:ind w:left="5040" w:hanging="360"/>
+        <w:ind w:left="4320" w:hanging="360"/>
       </w:pPr>
       <w:rPr>
         <w:rFonts w:ascii="Wingdings" w:hAnsi="Wingdings" w:cs="Wingdings" w:hint="default"/>
@@ -1789,7 +1803,7 @@
         <w:tabs>
           <w:tab w:val="num" w:pos="0"/>
         </w:tabs>
-        <w:ind w:left="5760" w:hanging="360"/>
+        <w:ind w:left="5040" w:hanging="360"/>
       </w:pPr>
       <w:rPr>
         <w:rFonts w:ascii="Symbol" w:hAnsi="Symbol" w:cs="Symbol" w:hint="default"/>
@@ -1804,7 +1818,7 @@
         <w:tabs>
           <w:tab w:val="num" w:pos="0"/>
         </w:tabs>
-        <w:ind w:left="6480" w:hanging="360"/>
+        <w:ind w:left="5760" w:hanging="360"/>
       </w:pPr>
       <w:rPr>
         <w:rFonts w:ascii="Courier New" w:hAnsi="Courier New" w:cs="Courier New" w:hint="default"/>
@@ -1819,14 +1833,17 @@
         <w:tabs>
           <w:tab w:val="num" w:pos="0"/>
         </w:tabs>
-        <w:ind w:left="7200" w:hanging="360"/>
+        <w:ind w:left="6480" w:hanging="360"/>
       </w:pPr>
       <w:rPr>
         <w:rFonts w:ascii="Wingdings" w:hAnsi="Wingdings" w:cs="Wingdings" w:hint="default"/>
       </w:rPr>
     </w:lvl>
   </w:abstractNum>
-  <w:abstractNum w:abstractNumId="2">
+  <w:abstractNum w:abstractNumId="1" w15:restartNumberingAfterBreak="0">
+    <w:nsid w:val="3A0172A7"/>
+    <w:multiLevelType w:val="multilevel"/>
+    <w:tmpl w:val="D3A298C6"/>
     <w:lvl w:ilvl="0">
       <w:start w:val="1"/>
       <w:numFmt w:val="bullet"/>
@@ -1836,7 +1853,7 @@
         <w:tabs>
           <w:tab w:val="num" w:pos="0"/>
         </w:tabs>
-        <w:ind w:left="720" w:hanging="360"/>
+        <w:ind w:left="1440" w:hanging="360"/>
       </w:pPr>
       <w:rPr>
         <w:rFonts w:ascii="Symbol" w:hAnsi="Symbol" w:cs="Symbol" w:hint="default"/>
@@ -1851,7 +1868,7 @@
         <w:tabs>
           <w:tab w:val="num" w:pos="0"/>
         </w:tabs>
-        <w:ind w:left="1440" w:hanging="360"/>
+        <w:ind w:left="2160" w:hanging="360"/>
       </w:pPr>
       <w:rPr>
         <w:rFonts w:ascii="Courier New" w:hAnsi="Courier New" w:cs="Courier New" w:hint="default"/>
@@ -1866,7 +1883,7 @@
         <w:tabs>
           <w:tab w:val="num" w:pos="0"/>
         </w:tabs>
-        <w:ind w:left="2160" w:hanging="360"/>
+        <w:ind w:left="2880" w:hanging="360"/>
       </w:pPr>
       <w:rPr>
         <w:rFonts w:ascii="Wingdings" w:hAnsi="Wingdings" w:cs="Wingdings" w:hint="default"/>
@@ -1881,7 +1898,7 @@
         <w:tabs>
           <w:tab w:val="num" w:pos="0"/>
         </w:tabs>
-        <w:ind w:left="2880" w:hanging="360"/>
+        <w:ind w:left="3600" w:hanging="360"/>
       </w:pPr>
       <w:rPr>
         <w:rFonts w:ascii="Symbol" w:hAnsi="Symbol" w:cs="Symbol" w:hint="default"/>
@@ -1896,7 +1913,7 @@
         <w:tabs>
           <w:tab w:val="num" w:pos="0"/>
         </w:tabs>
-        <w:ind w:left="3600" w:hanging="360"/>
+        <w:ind w:left="4320" w:hanging="360"/>
       </w:pPr>
       <w:rPr>
         <w:rFonts w:ascii="Courier New" w:hAnsi="Courier New" w:cs="Courier New" w:hint="default"/>
@@ -1911,7 +1928,7 @@
         <w:tabs>
           <w:tab w:val="num" w:pos="0"/>
         </w:tabs>
-        <w:ind w:left="4320" w:hanging="360"/>
+        <w:ind w:left="5040" w:hanging="360"/>
       </w:pPr>
       <w:rPr>
         <w:rFonts w:ascii="Wingdings" w:hAnsi="Wingdings" w:cs="Wingdings" w:hint="default"/>
@@ -1926,7 +1943,7 @@
         <w:tabs>
           <w:tab w:val="num" w:pos="0"/>
         </w:tabs>
-        <w:ind w:left="5040" w:hanging="360"/>
+        <w:ind w:left="5760" w:hanging="360"/>
       </w:pPr>
       <w:rPr>
         <w:rFonts w:ascii="Symbol" w:hAnsi="Symbol" w:cs="Symbol" w:hint="default"/>
@@ -1941,7 +1958,7 @@
         <w:tabs>
           <w:tab w:val="num" w:pos="0"/>
         </w:tabs>
-        <w:ind w:left="5760" w:hanging="360"/>
+        <w:ind w:left="6480" w:hanging="360"/>
       </w:pPr>
       <w:rPr>
         <w:rFonts w:ascii="Courier New" w:hAnsi="Courier New" w:cs="Courier New" w:hint="default"/>
@@ -1956,14 +1973,17 @@
         <w:tabs>
           <w:tab w:val="num" w:pos="0"/>
         </w:tabs>
-        <w:ind w:left="6480" w:hanging="360"/>
+        <w:ind w:left="7200" w:hanging="360"/>
       </w:pPr>
       <w:rPr>
         <w:rFonts w:ascii="Wingdings" w:hAnsi="Wingdings" w:cs="Wingdings" w:hint="default"/>
       </w:rPr>
     </w:lvl>
   </w:abstractNum>
-  <w:abstractNum w:abstractNumId="3">
+  <w:abstractNum w:abstractNumId="2" w15:restartNumberingAfterBreak="0">
+    <w:nsid w:val="74EF516E"/>
+    <w:multiLevelType w:val="multilevel"/>
+    <w:tmpl w:val="5DC6DD5A"/>
     <w:lvl w:ilvl="0">
       <w:start w:val="1"/>
       <w:numFmt w:val="none"/>
@@ -1974,7 +1994,7 @@
         <w:tabs>
           <w:tab w:val="num" w:pos="0"/>
         </w:tabs>
-        <w:ind w:left="0" w:hanging="0"/>
+        <w:ind w:left="0" w:firstLine="0"/>
       </w:pPr>
     </w:lvl>
     <w:lvl w:ilvl="1">
@@ -1987,7 +2007,7 @@
         <w:tabs>
           <w:tab w:val="num" w:pos="0"/>
         </w:tabs>
-        <w:ind w:left="0" w:hanging="0"/>
+        <w:ind w:left="0" w:firstLine="0"/>
       </w:pPr>
     </w:lvl>
     <w:lvl w:ilvl="2">
@@ -2000,7 +2020,7 @@
         <w:tabs>
           <w:tab w:val="num" w:pos="0"/>
         </w:tabs>
-        <w:ind w:left="0" w:hanging="0"/>
+        <w:ind w:left="0" w:firstLine="0"/>
       </w:pPr>
     </w:lvl>
     <w:lvl w:ilvl="3">
@@ -2013,7 +2033,7 @@
         <w:tabs>
           <w:tab w:val="num" w:pos="0"/>
         </w:tabs>
-        <w:ind w:left="0" w:hanging="0"/>
+        <w:ind w:left="0" w:firstLine="0"/>
       </w:pPr>
     </w:lvl>
     <w:lvl w:ilvl="4">
@@ -2026,7 +2046,7 @@
         <w:tabs>
           <w:tab w:val="num" w:pos="0"/>
         </w:tabs>
-        <w:ind w:left="0" w:hanging="0"/>
+        <w:ind w:left="0" w:firstLine="0"/>
       </w:pPr>
     </w:lvl>
     <w:lvl w:ilvl="5">
@@ -2039,7 +2059,7 @@
         <w:tabs>
           <w:tab w:val="num" w:pos="0"/>
         </w:tabs>
-        <w:ind w:left="0" w:hanging="0"/>
+        <w:ind w:left="0" w:firstLine="0"/>
       </w:pPr>
     </w:lvl>
     <w:lvl w:ilvl="6">
@@ -2052,7 +2072,7 @@
         <w:tabs>
           <w:tab w:val="num" w:pos="0"/>
         </w:tabs>
-        <w:ind w:left="0" w:hanging="0"/>
+        <w:ind w:left="0" w:firstLine="0"/>
       </w:pPr>
     </w:lvl>
     <w:lvl w:ilvl="7">
@@ -2065,7 +2085,7 @@
         <w:tabs>
           <w:tab w:val="num" w:pos="0"/>
         </w:tabs>
-        <w:ind w:left="0" w:hanging="0"/>
+        <w:ind w:left="0" w:firstLine="0"/>
       </w:pPr>
     </w:lvl>
     <w:lvl w:ilvl="8">
@@ -2078,28 +2098,28 @@
         <w:tabs>
           <w:tab w:val="num" w:pos="0"/>
         </w:tabs>
-        <w:ind w:left="0" w:hanging="0"/>
+        <w:ind w:left="0" w:firstLine="0"/>
       </w:pPr>
     </w:lvl>
   </w:abstractNum>
-  <w:num w:numId="1">
+  <w:num w:numId="1" w16cid:durableId="509102178">
     <w:abstractNumId w:val="1"/>
   </w:num>
-  <w:num w:numId="2">
+  <w:num w:numId="2" w16cid:durableId="1081833916">
+    <w:abstractNumId w:val="0"/>
+  </w:num>
+  <w:num w:numId="3" w16cid:durableId="82992955">
     <w:abstractNumId w:val="2"/>
-  </w:num>
-  <w:num w:numId="3">
-    <w:abstractNumId w:val="3"/>
   </w:num>
 </w:numbering>
 </file>
 
 <file path=word/styles.xml><?xml version="1.0" encoding="utf-8"?>
-<w:styles xmlns:w="http://schemas.openxmlformats.org/wordprocessingml/2006/main" xmlns:w14="http://schemas.microsoft.com/office/word/2010/wordml" xmlns:mc="http://schemas.openxmlformats.org/markup-compatibility/2006" mc:Ignorable="w14">
+<w:styles xmlns:mc="http://schemas.openxmlformats.org/markup-compatibility/2006" xmlns:r="http://schemas.openxmlformats.org/officeDocument/2006/relationships" xmlns:w="http://schemas.openxmlformats.org/wordprocessingml/2006/main" xmlns:w14="http://schemas.microsoft.com/office/word/2010/wordml" xmlns:w15="http://schemas.microsoft.com/office/word/2012/wordml" xmlns:w16cex="http://schemas.microsoft.com/office/word/2018/wordml/cex" xmlns:w16cid="http://schemas.microsoft.com/office/word/2016/wordml/cid" xmlns:w16="http://schemas.microsoft.com/office/word/2018/wordml" xmlns:w16du="http://schemas.microsoft.com/office/word/2023/wordml/word16du" xmlns:w16sdtdh="http://schemas.microsoft.com/office/word/2020/wordml/sdtdatahash" xmlns:w16sdtfl="http://schemas.microsoft.com/office/word/2024/wordml/sdtformatlock" xmlns:w16se="http://schemas.microsoft.com/office/word/2015/wordml/symex" mc:Ignorable="w14 w15 w16se w16cid w16 w16cex w16sdtdh w16sdtfl w16du">
   <w:docDefaults>
     <w:rPrDefault>
       <w:rPr>
-        <w:rFonts w:ascii="Times New Roman" w:hAnsi="Times New Roman" w:eastAsia="Times New Roman" w:cs="Times New Roman"/>
+        <w:rFonts w:ascii="Times New Roman" w:eastAsia="Times New Roman" w:hAnsi="Times New Roman" w:cs="Times New Roman"/>
         <w:sz w:val="24"/>
         <w:szCs w:val="24"/>
         <w:lang w:val="en-US" w:eastAsia="ja-JP" w:bidi="ar-SA"/>
@@ -2107,21 +2127,21 @@
     </w:rPrDefault>
     <w:pPrDefault>
       <w:pPr>
-        <w:suppressAutoHyphens w:val="true"/>
+        <w:suppressAutoHyphens/>
       </w:pPr>
     </w:pPrDefault>
   </w:docDefaults>
   <w:latentStyles w:defLockedState="0" w:defUIPriority="99" w:defSemiHidden="0" w:defUnhideWhenUsed="0" w:defQFormat="0" w:count="376">
     <w:lsdException w:name="Normal" w:uiPriority="0" w:qFormat="1"/>
     <w:lsdException w:name="heading 1" w:uiPriority="9" w:qFormat="1"/>
-    <w:lsdException w:name="heading 2" w:uiPriority="9" w:semiHidden="1" w:unhideWhenUsed="1" w:qFormat="1"/>
-    <w:lsdException w:name="heading 3" w:uiPriority="9" w:semiHidden="1" w:unhideWhenUsed="1" w:qFormat="1"/>
-    <w:lsdException w:name="heading 4" w:uiPriority="9" w:semiHidden="1" w:unhideWhenUsed="1" w:qFormat="1"/>
-    <w:lsdException w:name="heading 5" w:uiPriority="9" w:semiHidden="1" w:unhideWhenUsed="1" w:qFormat="1"/>
-    <w:lsdException w:name="heading 6" w:uiPriority="9" w:semiHidden="1" w:unhideWhenUsed="1" w:qFormat="1"/>
-    <w:lsdException w:name="heading 7" w:uiPriority="9" w:semiHidden="1" w:unhideWhenUsed="1" w:qFormat="1"/>
-    <w:lsdException w:name="heading 8" w:uiPriority="9" w:semiHidden="1" w:unhideWhenUsed="1" w:qFormat="1"/>
-    <w:lsdException w:name="heading 9" w:uiPriority="9" w:semiHidden="1" w:unhideWhenUsed="1" w:qFormat="1"/>
+    <w:lsdException w:name="heading 2" w:semiHidden="1" w:uiPriority="9" w:unhideWhenUsed="1" w:qFormat="1"/>
+    <w:lsdException w:name="heading 3" w:semiHidden="1" w:uiPriority="9" w:unhideWhenUsed="1" w:qFormat="1"/>
+    <w:lsdException w:name="heading 4" w:semiHidden="1" w:uiPriority="9" w:unhideWhenUsed="1" w:qFormat="1"/>
+    <w:lsdException w:name="heading 5" w:semiHidden="1" w:uiPriority="9" w:unhideWhenUsed="1" w:qFormat="1"/>
+    <w:lsdException w:name="heading 6" w:semiHidden="1" w:uiPriority="9" w:unhideWhenUsed="1" w:qFormat="1"/>
+    <w:lsdException w:name="heading 7" w:semiHidden="1" w:uiPriority="9" w:unhideWhenUsed="1" w:qFormat="1"/>
+    <w:lsdException w:name="heading 8" w:semiHidden="1" w:uiPriority="9" w:unhideWhenUsed="1" w:qFormat="1"/>
+    <w:lsdException w:name="heading 9" w:semiHidden="1" w:uiPriority="9" w:unhideWhenUsed="1" w:qFormat="1"/>
     <w:lsdException w:name="index 1" w:semiHidden="1" w:unhideWhenUsed="1"/>
     <w:lsdException w:name="index 2" w:semiHidden="1" w:unhideWhenUsed="1"/>
     <w:lsdException w:name="index 3" w:semiHidden="1" w:unhideWhenUsed="1"/>
@@ -2131,22 +2151,22 @@
     <w:lsdException w:name="index 7" w:semiHidden="1" w:unhideWhenUsed="1"/>
     <w:lsdException w:name="index 8" w:semiHidden="1" w:unhideWhenUsed="1"/>
     <w:lsdException w:name="index 9" w:semiHidden="1" w:unhideWhenUsed="1"/>
-    <w:lsdException w:name="toc 1" w:uiPriority="39" w:semiHidden="1" w:unhideWhenUsed="1"/>
-    <w:lsdException w:name="toc 2" w:uiPriority="39" w:semiHidden="1" w:unhideWhenUsed="1"/>
-    <w:lsdException w:name="toc 3" w:uiPriority="39" w:semiHidden="1" w:unhideWhenUsed="1"/>
-    <w:lsdException w:name="toc 4" w:uiPriority="39" w:semiHidden="1" w:unhideWhenUsed="1"/>
-    <w:lsdException w:name="toc 5" w:uiPriority="39" w:semiHidden="1" w:unhideWhenUsed="1"/>
-    <w:lsdException w:name="toc 6" w:uiPriority="39" w:semiHidden="1" w:unhideWhenUsed="1"/>
-    <w:lsdException w:name="toc 7" w:uiPriority="39" w:semiHidden="1" w:unhideWhenUsed="1"/>
-    <w:lsdException w:name="toc 8" w:uiPriority="39" w:semiHidden="1" w:unhideWhenUsed="1"/>
-    <w:lsdException w:name="toc 9" w:uiPriority="39" w:semiHidden="1" w:unhideWhenUsed="1"/>
+    <w:lsdException w:name="toc 1" w:semiHidden="1" w:uiPriority="39" w:unhideWhenUsed="1"/>
+    <w:lsdException w:name="toc 2" w:semiHidden="1" w:uiPriority="39" w:unhideWhenUsed="1"/>
+    <w:lsdException w:name="toc 3" w:semiHidden="1" w:uiPriority="39" w:unhideWhenUsed="1"/>
+    <w:lsdException w:name="toc 4" w:semiHidden="1" w:uiPriority="39" w:unhideWhenUsed="1"/>
+    <w:lsdException w:name="toc 5" w:semiHidden="1" w:uiPriority="39" w:unhideWhenUsed="1"/>
+    <w:lsdException w:name="toc 6" w:semiHidden="1" w:uiPriority="39" w:unhideWhenUsed="1"/>
+    <w:lsdException w:name="toc 7" w:semiHidden="1" w:uiPriority="39" w:unhideWhenUsed="1"/>
+    <w:lsdException w:name="toc 8" w:semiHidden="1" w:uiPriority="39" w:unhideWhenUsed="1"/>
+    <w:lsdException w:name="toc 9" w:semiHidden="1" w:uiPriority="39" w:unhideWhenUsed="1"/>
     <w:lsdException w:name="Normal Indent" w:semiHidden="1" w:unhideWhenUsed="1"/>
     <w:lsdException w:name="footnote text" w:semiHidden="1" w:unhideWhenUsed="1"/>
     <w:lsdException w:name="annotation text" w:semiHidden="1" w:unhideWhenUsed="1"/>
     <w:lsdException w:name="header" w:semiHidden="1" w:unhideWhenUsed="1"/>
     <w:lsdException w:name="footer" w:semiHidden="1" w:unhideWhenUsed="1"/>
     <w:lsdException w:name="index heading" w:semiHidden="1" w:unhideWhenUsed="1"/>
-    <w:lsdException w:name="caption" w:uiPriority="35" w:semiHidden="1" w:unhideWhenUsed="1" w:qFormat="1"/>
+    <w:lsdException w:name="caption" w:semiHidden="1" w:uiPriority="35" w:unhideWhenUsed="1" w:qFormat="1"/>
     <w:lsdException w:name="table of figures" w:semiHidden="1" w:unhideWhenUsed="1"/>
     <w:lsdException w:name="envelope address" w:semiHidden="1" w:unhideWhenUsed="1"/>
     <w:lsdException w:name="envelope return" w:semiHidden="1" w:unhideWhenUsed="1"/>
@@ -2177,7 +2197,7 @@
     <w:lsdException w:name="Title" w:uiPriority="10" w:qFormat="1"/>
     <w:lsdException w:name="Closing" w:semiHidden="1" w:unhideWhenUsed="1"/>
     <w:lsdException w:name="Signature" w:semiHidden="1" w:unhideWhenUsed="1"/>
-    <w:lsdException w:name="Default Paragraph Font" w:uiPriority="1" w:semiHidden="1" w:unhideWhenUsed="1"/>
+    <w:lsdException w:name="Default Paragraph Font" w:semiHidden="1" w:uiPriority="1" w:unhideWhenUsed="1"/>
     <w:lsdException w:name="Body Text" w:semiHidden="1" w:unhideWhenUsed="1"/>
     <w:lsdException w:name="Body Text Indent" w:semiHidden="1" w:unhideWhenUsed="1"/>
     <w:lsdException w:name="List Continue" w:semiHidden="1" w:unhideWhenUsed="1"/>
@@ -2377,8 +2397,8 @@
     <w:lsdException w:name="Subtle Reference" w:uiPriority="31" w:qFormat="1"/>
     <w:lsdException w:name="Intense Reference" w:uiPriority="32" w:qFormat="1"/>
     <w:lsdException w:name="Book Title" w:uiPriority="33" w:qFormat="1"/>
-    <w:lsdException w:name="Bibliography" w:uiPriority="37" w:semiHidden="1" w:unhideWhenUsed="1"/>
-    <w:lsdException w:name="TOC Heading" w:uiPriority="39" w:semiHidden="1" w:unhideWhenUsed="1" w:qFormat="1"/>
+    <w:lsdException w:name="Bibliography" w:semiHidden="1" w:uiPriority="37" w:unhideWhenUsed="1"/>
+    <w:lsdException w:name="TOC Heading" w:semiHidden="1" w:uiPriority="39" w:unhideWhenUsed="1" w:qFormat="1"/>
     <w:lsdException w:name="Plain Table 1" w:uiPriority="41"/>
     <w:lsdException w:name="Plain Table 2" w:uiPriority="42"/>
     <w:lsdException w:name="Plain Table 3" w:uiPriority="43"/>
@@ -2489,43 +2509,29 @@
     <w:lsdException w:name="Unresolved Mention" w:semiHidden="1" w:unhideWhenUsed="1"/>
     <w:lsdException w:name="Smart Link" w:semiHidden="1" w:unhideWhenUsed="1"/>
   </w:latentStyles>
-  <w:style w:type="paragraph" w:styleId="Normal" w:default="1">
+  <w:style w:type="paragraph" w:default="1" w:styleId="Normal">
     <w:name w:val="Normal"/>
     <w:qFormat/>
-    <w:pPr>
-      <w:widowControl/>
-      <w:bidi w:val="0"/>
-      <w:spacing w:before="0" w:after="0"/>
-      <w:jc w:val="left"/>
-    </w:pPr>
-    <w:rPr>
-      <w:rFonts w:ascii="Times New Roman" w:hAnsi="Times New Roman" w:eastAsia="Times New Roman" w:cs="Times New Roman"/>
-      <w:color w:val="auto"/>
-      <w:kern w:val="0"/>
-      <w:sz w:val="24"/>
-      <w:szCs w:val="24"/>
-      <w:lang w:val="en-US" w:eastAsia="ja-JP" w:bidi="ar-SA"/>
-    </w:rPr>
   </w:style>
   <w:style w:type="paragraph" w:styleId="Heading1">
-    <w:name w:val="Heading 1"/>
+    <w:name w:val="heading 1"/>
     <w:basedOn w:val="Normal"/>
     <w:next w:val="Normal"/>
     <w:uiPriority w:val="9"/>
     <w:qFormat/>
     <w:pPr>
-      <w:spacing w:before="0" w:after="167"/>
+      <w:spacing w:after="167"/>
       <w:outlineLvl w:val="0"/>
     </w:pPr>
     <w:rPr>
-      <w:rFonts w:ascii="Arial" w:hAnsi="Arial" w:eastAsia="Arial" w:cs="Arial"/>
+      <w:rFonts w:ascii="Arial" w:eastAsia="Arial" w:hAnsi="Arial" w:cs="Arial"/>
       <w:b/>
       <w:sz w:val="27"/>
       <w:szCs w:val="27"/>
     </w:rPr>
   </w:style>
   <w:style w:type="paragraph" w:styleId="Heading2">
-    <w:name w:val="Heading 2"/>
+    <w:name w:val="heading 2"/>
     <w:basedOn w:val="Normal"/>
     <w:next w:val="Normal"/>
     <w:uiPriority w:val="9"/>
@@ -2533,12 +2539,12 @@
     <w:unhideWhenUsed/>
     <w:qFormat/>
     <w:pPr>
-      <w:keepNext w:val="true"/>
+      <w:keepNext/>
       <w:spacing w:before="240" w:after="60"/>
       <w:outlineLvl w:val="1"/>
     </w:pPr>
     <w:rPr>
-      <w:rFonts w:ascii="Arial" w:hAnsi="Arial" w:eastAsia="Arial" w:cs="Arial"/>
+      <w:rFonts w:ascii="Arial" w:eastAsia="Arial" w:hAnsi="Arial" w:cs="Arial"/>
       <w:b/>
       <w:i/>
       <w:sz w:val="28"/>
@@ -2546,7 +2552,7 @@
     </w:rPr>
   </w:style>
   <w:style w:type="paragraph" w:styleId="Heading3">
-    <w:name w:val="Heading 3"/>
+    <w:name w:val="heading 3"/>
     <w:basedOn w:val="Normal"/>
     <w:next w:val="Normal"/>
     <w:uiPriority w:val="9"/>
@@ -2554,19 +2560,19 @@
     <w:unhideWhenUsed/>
     <w:qFormat/>
     <w:pPr>
-      <w:keepNext w:val="true"/>
+      <w:keepNext/>
       <w:spacing w:before="240" w:after="60"/>
       <w:outlineLvl w:val="2"/>
     </w:pPr>
     <w:rPr>
-      <w:rFonts w:ascii="Arial" w:hAnsi="Arial" w:eastAsia="Arial" w:cs="Arial"/>
+      <w:rFonts w:ascii="Arial" w:eastAsia="Arial" w:hAnsi="Arial" w:cs="Arial"/>
       <w:b/>
       <w:sz w:val="26"/>
       <w:szCs w:val="26"/>
     </w:rPr>
   </w:style>
   <w:style w:type="paragraph" w:styleId="Heading4">
-    <w:name w:val="Heading 4"/>
+    <w:name w:val="heading 4"/>
     <w:basedOn w:val="Normal"/>
     <w:next w:val="Normal"/>
     <w:uiPriority w:val="9"/>
@@ -2574,7 +2580,7 @@
     <w:unhideWhenUsed/>
     <w:qFormat/>
     <w:pPr>
-      <w:keepNext w:val="true"/>
+      <w:keepNext/>
       <w:keepLines/>
       <w:spacing w:before="240" w:after="40"/>
       <w:outlineLvl w:val="3"/>
@@ -2584,7 +2590,7 @@
     </w:rPr>
   </w:style>
   <w:style w:type="paragraph" w:styleId="Heading5">
-    <w:name w:val="Heading 5"/>
+    <w:name w:val="heading 5"/>
     <w:basedOn w:val="Normal"/>
     <w:next w:val="Normal"/>
     <w:uiPriority w:val="9"/>
@@ -2592,7 +2598,7 @@
     <w:unhideWhenUsed/>
     <w:qFormat/>
     <w:pPr>
-      <w:keepNext w:val="true"/>
+      <w:keepNext/>
       <w:keepLines/>
       <w:spacing w:before="220" w:after="40"/>
       <w:outlineLvl w:val="4"/>
@@ -2604,7 +2610,7 @@
     </w:rPr>
   </w:style>
   <w:style w:type="paragraph" w:styleId="Heading6">
-    <w:name w:val="Heading 6"/>
+    <w:name w:val="heading 6"/>
     <w:basedOn w:val="Normal"/>
     <w:next w:val="Normal"/>
     <w:uiPriority w:val="9"/>
@@ -2612,7 +2618,7 @@
     <w:unhideWhenUsed/>
     <w:qFormat/>
     <w:pPr>
-      <w:keepNext w:val="true"/>
+      <w:keepNext/>
       <w:keepLines/>
       <w:spacing w:before="200" w:after="40"/>
       <w:outlineLvl w:val="5"/>
@@ -2623,21 +2629,41 @@
       <w:szCs w:val="20"/>
     </w:rPr>
   </w:style>
-  <w:style w:type="character" w:styleId="DefaultParagraphFont" w:default="1">
+  <w:style w:type="character" w:default="1" w:styleId="DefaultParagraphFont">
     <w:name w:val="Default Paragraph Font"/>
     <w:uiPriority w:val="1"/>
+    <w:semiHidden/>
     <w:unhideWhenUsed/>
-    <w:qFormat/>
-    <w:rPr/>
+  </w:style>
+  <w:style w:type="table" w:default="1" w:styleId="TableNormal">
+    <w:name w:val="Normal Table"/>
+    <w:uiPriority w:val="99"/>
+    <w:semiHidden/>
+    <w:unhideWhenUsed/>
+    <w:tblPr>
+      <w:tblInd w:w="0" w:type="dxa"/>
+      <w:tblCellMar>
+        <w:top w:w="0" w:type="dxa"/>
+        <w:left w:w="108" w:type="dxa"/>
+        <w:bottom w:w="0" w:type="dxa"/>
+        <w:right w:w="108" w:type="dxa"/>
+      </w:tblCellMar>
+    </w:tblPr>
+  </w:style>
+  <w:style w:type="numbering" w:default="1" w:styleId="NoList">
+    <w:name w:val="No List"/>
+    <w:uiPriority w:val="99"/>
+    <w:semiHidden/>
+    <w:unhideWhenUsed/>
   </w:style>
   <w:style w:type="character" w:styleId="Hyperlink">
     <w:name w:val="Hyperlink"/>
     <w:basedOn w:val="DefaultParagraphFont"/>
     <w:uiPriority w:val="99"/>
     <w:unhideWhenUsed/>
-    <w:rsid w:val="005022c7"/>
+    <w:rsid w:val="005022C7"/>
     <w:rPr>
-      <w:color w:themeColor="hyperlink" w:val="0000FF"/>
+      <w:color w:val="0000FF" w:themeColor="hyperlink"/>
       <w:u w:val="single"/>
     </w:rPr>
   </w:style>
@@ -2648,23 +2674,23 @@
     <w:semiHidden/>
     <w:unhideWhenUsed/>
     <w:qFormat/>
-    <w:rsid w:val="005022c7"/>
+    <w:rsid w:val="005022C7"/>
     <w:rPr>
       <w:color w:val="605E5C"/>
-      <w:shd w:fill="E1DFDD" w:val="clear"/>
+      <w:shd w:val="clear" w:color="auto" w:fill="E1DFDD"/>
     </w:rPr>
   </w:style>
-  <w:style w:type="paragraph" w:styleId="Heading">
+  <w:style w:type="paragraph" w:customStyle="1" w:styleId="Heading">
     <w:name w:val="Heading"/>
     <w:basedOn w:val="Normal"/>
     <w:next w:val="BodyText"/>
     <w:qFormat/>
     <w:pPr>
-      <w:keepNext w:val="true"/>
+      <w:keepNext/>
       <w:spacing w:before="240" w:after="120"/>
     </w:pPr>
     <w:rPr>
-      <w:rFonts w:ascii="Liberation Sans" w:hAnsi="Liberation Sans" w:eastAsia="Noto Sans CJK SC" w:cs="FreeSans"/>
+      <w:rFonts w:ascii="Liberation Sans" w:eastAsia="Noto Sans CJK SC" w:hAnsi="Liberation Sans" w:cs="FreeSans"/>
       <w:sz w:val="28"/>
       <w:szCs w:val="28"/>
     </w:rPr>
@@ -2673,38 +2699,36 @@
     <w:name w:val="Body Text"/>
     <w:basedOn w:val="Normal"/>
     <w:pPr>
-      <w:spacing w:lineRule="auto" w:line="276" w:before="0" w:after="140"/>
+      <w:spacing w:after="140" w:line="276" w:lineRule="auto"/>
     </w:pPr>
-    <w:rPr/>
   </w:style>
   <w:style w:type="paragraph" w:styleId="List">
     <w:name w:val="List"/>
     <w:basedOn w:val="BodyText"/>
-    <w:pPr/>
     <w:rPr>
       <w:rFonts w:cs="FreeSans"/>
     </w:rPr>
   </w:style>
   <w:style w:type="paragraph" w:styleId="Caption">
-    <w:name w:val="Caption"/>
+    <w:name w:val="caption"/>
     <w:basedOn w:val="Normal"/>
     <w:next w:val="Normal"/>
     <w:uiPriority w:val="35"/>
     <w:unhideWhenUsed/>
     <w:qFormat/>
-    <w:rsid w:val="008c00eb"/>
+    <w:rsid w:val="008C00EB"/>
     <w:pPr>
-      <w:spacing w:before="0" w:after="200"/>
+      <w:spacing w:after="200"/>
     </w:pPr>
     <w:rPr>
       <w:i/>
       <w:iCs/>
-      <w:color w:themeColor="text2" w:val="1F497D"/>
+      <w:color w:val="1F497D" w:themeColor="text2"/>
       <w:sz w:val="18"/>
       <w:szCs w:val="18"/>
     </w:rPr>
   </w:style>
-  <w:style w:type="paragraph" w:styleId="Index">
+  <w:style w:type="paragraph" w:customStyle="1" w:styleId="Index">
     <w:name w:val="Index"/>
     <w:basedOn w:val="Normal"/>
     <w:qFormat/>
@@ -2722,7 +2746,7 @@
     <w:uiPriority w:val="10"/>
     <w:qFormat/>
     <w:pPr>
-      <w:keepNext w:val="true"/>
+      <w:keepNext/>
       <w:keepLines/>
       <w:spacing w:before="480" w:after="120"/>
     </w:pPr>
@@ -2739,12 +2763,12 @@
     <w:uiPriority w:val="11"/>
     <w:qFormat/>
     <w:pPr>
-      <w:keepNext w:val="true"/>
+      <w:keepNext/>
       <w:keepLines/>
       <w:spacing w:before="360" w:after="80"/>
     </w:pPr>
     <w:rPr>
-      <w:rFonts w:ascii="Georgia" w:hAnsi="Georgia" w:eastAsia="Georgia" w:cs="Georgia"/>
+      <w:rFonts w:ascii="Georgia" w:eastAsia="Georgia" w:hAnsi="Georgia" w:cs="Georgia"/>
       <w:i/>
       <w:color w:val="666666"/>
       <w:sz w:val="48"/>
@@ -2756,87 +2780,60 @@
     <w:basedOn w:val="Normal"/>
     <w:uiPriority w:val="34"/>
     <w:qFormat/>
-    <w:rsid w:val="00ce176f"/>
+    <w:rsid w:val="00CE176F"/>
     <w:pPr>
-      <w:spacing w:before="0" w:after="0"/>
       <w:ind w:left="720"/>
       <w:contextualSpacing/>
     </w:pPr>
-    <w:rPr/>
   </w:style>
-  <w:style w:type="paragraph" w:styleId="HeaderandFooter">
+  <w:style w:type="paragraph" w:customStyle="1" w:styleId="HeaderandFooter">
     <w:name w:val="Header and Footer"/>
     <w:basedOn w:val="Normal"/>
     <w:qFormat/>
-    <w:pPr/>
-    <w:rPr/>
   </w:style>
   <w:style w:type="paragraph" w:styleId="Header">
-    <w:name w:val="Header"/>
+    <w:name w:val="header"/>
     <w:basedOn w:val="HeaderandFooter"/>
-    <w:pPr/>
-    <w:rPr/>
-  </w:style>
-  <w:style w:type="numbering" w:styleId="NoList" w:default="1">
-    <w:name w:val="No List"/>
-    <w:uiPriority w:val="99"/>
-    <w:semiHidden/>
-    <w:unhideWhenUsed/>
-    <w:qFormat/>
-  </w:style>
-  <w:style w:type="table" w:default="1" w:styleId="TableNormal">
-    <w:name w:val="Normal Table"/>
-    <w:uiPriority w:val="99"/>
-    <w:semiHidden/>
-    <w:unhideWhenUsed/>
-    <w:tblPr>
-      <w:tblCellMar>
-        <w:top w:w="0" w:type="dxa"/>
-        <w:left w:w="108" w:type="dxa"/>
-        <w:bottom w:w="0" w:type="dxa"/>
-        <w:right w:w="108" w:type="dxa"/>
-      </w:tblCellMar>
-    </w:tblPr>
   </w:style>
 </w:styles>
 </file>
 
 <file path=word/theme/theme1.xml><?xml version="1.0" encoding="utf-8"?>
-<a:theme xmlns:a="http://schemas.openxmlformats.org/drawingml/2006/main" xmlns:r="http://schemas.openxmlformats.org/officeDocument/2006/relationships" name="Office Theme">
+<a:theme xmlns:a="http://schemas.openxmlformats.org/drawingml/2006/main" name="Office Theme">
   <a:themeElements>
     <a:clrScheme name="Office">
       <a:dk1>
         <a:srgbClr val="000000"/>
       </a:dk1>
       <a:lt1>
-        <a:srgbClr val="ffffff"/>
+        <a:srgbClr val="FFFFFF"/>
       </a:lt1>
       <a:dk2>
-        <a:srgbClr val="1f497d"/>
+        <a:srgbClr val="1F497D"/>
       </a:dk2>
       <a:lt2>
-        <a:srgbClr val="eeece1"/>
+        <a:srgbClr val="EEECE1"/>
       </a:lt2>
       <a:accent1>
-        <a:srgbClr val="4f81bd"/>
+        <a:srgbClr val="4F81BD"/>
       </a:accent1>
       <a:accent2>
-        <a:srgbClr val="c0504d"/>
+        <a:srgbClr val="C0504D"/>
       </a:accent2>
       <a:accent3>
-        <a:srgbClr val="9bbb59"/>
+        <a:srgbClr val="9BBB59"/>
       </a:accent3>
       <a:accent4>
-        <a:srgbClr val="8064a2"/>
+        <a:srgbClr val="8064A2"/>
       </a:accent4>
       <a:accent5>
-        <a:srgbClr val="4bacc6"/>
+        <a:srgbClr val="4BACC6"/>
       </a:accent5>
       <a:accent6>
-        <a:srgbClr val="f79646"/>
+        <a:srgbClr val="F79646"/>
       </a:accent6>
       <a:hlink>
-        <a:srgbClr val="0000ff"/>
+        <a:srgbClr val="0000FF"/>
       </a:hlink>
       <a:folHlink>
         <a:srgbClr val="800080"/>
@@ -2844,12 +2841,12 @@
     </a:clrScheme>
     <a:fontScheme name="Office">
       <a:majorFont>
-        <a:latin typeface="Calibri" pitchFamily="0" charset="1"/>
+        <a:latin typeface="Calibri"/>
         <a:ea typeface=""/>
         <a:cs typeface=""/>
       </a:majorFont>
       <a:minorFont>
-        <a:latin typeface="Cambria" pitchFamily="0" charset="1"/>
+        <a:latin typeface="Cambria"/>
         <a:ea typeface=""/>
         <a:cs typeface=""/>
       </a:minorFont>
@@ -2878,7 +2875,7 @@
             </a:gs>
           </a:gsLst>
           <a:lin ang="16200000" scaled="1"/>
-          <a:tileRect l="0" t="0" r="0" b="0"/>
+          <a:tileRect/>
         </a:gradFill>
         <a:gradFill>
           <a:gsLst>
@@ -2896,7 +2893,7 @@
             </a:gs>
           </a:gsLst>
           <a:lin ang="16200000" scaled="0"/>
-          <a:tileRect l="0" t="0" r="0" b="0"/>
+          <a:tileRect/>
         </a:gradFill>
       </a:fillStyleLst>
       <a:lnStyleLst>
@@ -2947,7 +2944,7 @@
           <a:path path="circle">
             <a:fillToRect l="50000" t="-80000" r="50000" b="180000"/>
           </a:path>
-          <a:tileRect l="0" t="0" r="0" b="0"/>
+          <a:tileRect/>
         </a:gradFill>
         <a:gradFill>
           <a:gsLst>
@@ -2965,10 +2962,12 @@
           <a:path path="circle">
             <a:fillToRect l="50000" t="50000" r="50000" b="50000"/>
           </a:path>
-          <a:tileRect l="0" t="0" r="0" b="0"/>
+          <a:tileRect/>
         </a:gradFill>
       </a:bgFillStyleLst>
     </a:fmtScheme>
   </a:themeElements>
+  <a:objectDefaults/>
+  <a:extraClrSchemeLst/>
 </a:theme>
 </file>
</xml_diff>

<commit_message>
(update): filling in report
</commit_message>
<xml_diff>
--- a/Generative_AI_Analysis_Report.docx
+++ b/Generative_AI_Analysis_Report.docx
@@ -110,431 +110,17 @@
     </w:p>
     <w:p>
       <w:pPr>
-        <w:spacing w:line="480" w:lineRule="auto"/>
-        <w:ind w:firstLine="720"/>
-      </w:pPr>
-    </w:p>
-    <w:p>
-      <w:pPr>
-        <w:spacing w:line="480" w:lineRule="auto"/>
-        <w:jc w:val="center"/>
-        <w:rPr>
-          <w:b/>
-        </w:rPr>
-      </w:pPr>
-      <w:r>
-        <w:rPr>
-          <w:b/>
-        </w:rPr>
-        <w:t>Dataset Description</w:t>
-      </w:r>
-    </w:p>
-    <w:p>
-      <w:pPr>
-        <w:spacing w:line="480" w:lineRule="auto"/>
-        <w:ind w:firstLine="720"/>
-      </w:pPr>
-      <w:r>
-        <w:t xml:space="preserve">We approached this problem using human data generated (reference D4RL) from the </w:t>
-      </w:r>
-      <w:hyperlink r:id="rId7">
-        <w:r>
-          <w:rPr>
-            <w:rStyle w:val="Hyperlink"/>
-          </w:rPr>
-          <w:t>ADROIT Relocate problem</w:t>
-        </w:r>
-      </w:hyperlink>
-      <w:r>
-        <w:t xml:space="preserve"> (reference ADROIT PAPER). In the ADROIT Relocate problem, a 24 </w:t>
-      </w:r>
-      <w:proofErr w:type="spellStart"/>
-      <w:r>
-        <w:t>DoF</w:t>
-      </w:r>
-      <w:proofErr w:type="spellEnd"/>
-      <w:r>
-        <w:t xml:space="preserve"> robotic hand is tasked with picking up a small ball off a table and placing it down at a target location.  We control the hand by providing a sequence of joint angles for each of the actuators as well as positional / rotational angles for the hand’s overall location in the world. For this problem, the D4RL group collected 25 human generated trajectories using a virtual environment combined with a </w:t>
-      </w:r>
-      <w:proofErr w:type="spellStart"/>
-      <w:r>
-        <w:t>CyberGlove</w:t>
-      </w:r>
-      <w:proofErr w:type="spellEnd"/>
-      <w:r>
-        <w:t xml:space="preserve"> (FOOTNOTE) apparatus for input.</w:t>
-      </w:r>
-    </w:p>
-    <w:p>
-      <w:pPr>
-        <w:spacing w:line="480" w:lineRule="auto"/>
-        <w:ind w:firstLine="720"/>
-      </w:pPr>
-      <w:r>
-        <w:t>Each trajectory in the dataset has three key pieces of information:</w:t>
-      </w:r>
-    </w:p>
-    <w:p>
-      <w:pPr>
-        <w:spacing w:line="480" w:lineRule="auto"/>
-        <w:ind w:firstLine="720"/>
-      </w:pPr>
-    </w:p>
-    <w:p>
-      <w:pPr>
-        <w:spacing w:line="480" w:lineRule="auto"/>
-        <w:ind w:firstLine="720"/>
-        <w:rPr>
-          <w:b/>
-          <w:bCs/>
-          <w:i/>
-          <w:iCs/>
-        </w:rPr>
-      </w:pPr>
-      <w:r>
-        <w:rPr>
-          <w:b/>
-          <w:bCs/>
-          <w:i/>
-          <w:iCs/>
-        </w:rPr>
-        <w:t xml:space="preserve">Actions: </w:t>
-      </w:r>
-    </w:p>
-    <w:p>
-      <w:pPr>
-        <w:spacing w:line="480" w:lineRule="auto"/>
-        <w:ind w:firstLine="720"/>
-      </w:pPr>
-      <w:r>
-        <w:t xml:space="preserve">As mentioned earlier, actions represent joint angles for the ADROIT Hand. Our system will learn to generate sequences of actions using a Transformer model. Actions are represented as a 30-dimensional vector space. These represent the 24 </w:t>
-      </w:r>
-      <w:proofErr w:type="spellStart"/>
-      <w:r>
-        <w:t>DoF</w:t>
-      </w:r>
-      <w:proofErr w:type="spellEnd"/>
-      <w:r>
-        <w:t xml:space="preserve"> for the hands – 4 </w:t>
-      </w:r>
-      <w:proofErr w:type="spellStart"/>
-      <w:r>
-        <w:t>DoF</w:t>
-      </w:r>
-      <w:proofErr w:type="spellEnd"/>
-      <w:r>
-        <w:t xml:space="preserve"> for the First, </w:t>
-      </w:r>
-      <w:r>
-        <w:lastRenderedPageBreak/>
-        <w:t xml:space="preserve">Middle, and Ring Fings, 5 </w:t>
-      </w:r>
-      <w:proofErr w:type="spellStart"/>
-      <w:r>
-        <w:t>DoF</w:t>
-      </w:r>
-      <w:proofErr w:type="spellEnd"/>
-      <w:r>
-        <w:t xml:space="preserve"> for the Little Finger, Thumb, 2 </w:t>
-      </w:r>
-      <w:proofErr w:type="spellStart"/>
-      <w:r>
-        <w:t>DoF</w:t>
-      </w:r>
-      <w:proofErr w:type="spellEnd"/>
-      <w:r>
-        <w:t xml:space="preserve"> for the write, 3 values for the hand’s global location (centered at the palm) and 3 values for the hand’s global rotation. All inputs are clipped between [-1, 1].</w:t>
-      </w:r>
-    </w:p>
-    <w:p>
-      <w:pPr>
-        <w:spacing w:line="480" w:lineRule="auto"/>
-        <w:ind w:firstLine="720"/>
-      </w:pPr>
-    </w:p>
-    <w:p>
-      <w:pPr>
-        <w:spacing w:line="480" w:lineRule="auto"/>
-        <w:ind w:firstLine="720"/>
-        <w:rPr>
-          <w:b/>
-          <w:bCs/>
-          <w:i/>
-          <w:iCs/>
-        </w:rPr>
-      </w:pPr>
-      <w:r>
-        <w:rPr>
-          <w:b/>
-          <w:bCs/>
-          <w:i/>
-          <w:iCs/>
-        </w:rPr>
-        <w:t>Observations:</w:t>
-      </w:r>
-    </w:p>
-    <w:p>
-      <w:pPr>
-        <w:spacing w:line="480" w:lineRule="auto"/>
-        <w:ind w:firstLine="720"/>
-      </w:pPr>
-      <w:r>
-        <w:t>Observations are represented as 39-dimensional vectors. This observation space contains information about the hands current state (the same states used to represent the hand for actions). In addition, it has 3 entries representing the difference in position between the palm of the hand and the target, 3 entries representing the difference in position between the palm of the hand and the target, and 3 entries representing the difference in position between the ball and the target.</w:t>
-      </w:r>
-    </w:p>
-    <w:p>
-      <w:pPr>
-        <w:spacing w:line="480" w:lineRule="auto"/>
-        <w:ind w:firstLine="720"/>
-      </w:pPr>
-    </w:p>
-    <w:p>
-      <w:pPr>
-        <w:spacing w:line="480" w:lineRule="auto"/>
-        <w:ind w:firstLine="720"/>
-        <w:rPr>
-          <w:b/>
-          <w:bCs/>
-          <w:i/>
-          <w:iCs/>
-        </w:rPr>
-      </w:pPr>
-      <w:r>
-        <w:rPr>
-          <w:b/>
-          <w:bCs/>
-          <w:i/>
-          <w:iCs/>
-        </w:rPr>
-        <w:t>Reward:</w:t>
-      </w:r>
-    </w:p>
-    <w:p>
-      <w:pPr>
-        <w:pStyle w:val="ListParagraph"/>
-        <w:numPr>
-          <w:ilvl w:val="0"/>
-          <w:numId w:val="1"/>
-        </w:numPr>
-        <w:spacing w:line="480" w:lineRule="auto"/>
-      </w:pPr>
-      <w:r>
-        <w:t>Rewards offered by the Human generated dataset are heavily shaped. At each step, the environment provides the following rewards:</w:t>
-      </w:r>
-    </w:p>
-    <w:p>
-      <w:pPr>
-        <w:pStyle w:val="ListParagraph"/>
-        <w:numPr>
-          <w:ilvl w:val="0"/>
-          <w:numId w:val="1"/>
-        </w:numPr>
-        <w:spacing w:line="480" w:lineRule="auto"/>
-      </w:pPr>
-      <w:r>
-        <w:t>Increase negative reward the further the hand is from the ball.</w:t>
-      </w:r>
-    </w:p>
-    <w:p>
-      <w:pPr>
-        <w:pStyle w:val="ListParagraph"/>
-        <w:numPr>
-          <w:ilvl w:val="0"/>
-          <w:numId w:val="1"/>
-        </w:numPr>
-        <w:spacing w:line="480" w:lineRule="auto"/>
-      </w:pPr>
-      <w:r>
-        <w:t>A reward of 1 if the ball is off the table.</w:t>
-      </w:r>
-    </w:p>
-    <w:p>
-      <w:pPr>
-        <w:pStyle w:val="ListParagraph"/>
-        <w:numPr>
-          <w:ilvl w:val="0"/>
-          <w:numId w:val="1"/>
-        </w:numPr>
-        <w:spacing w:line="480" w:lineRule="auto"/>
-      </w:pPr>
-      <w:r>
-        <w:t>A negative reward representing how far the ball is from the target when the ball is in hand.</w:t>
-      </w:r>
-    </w:p>
-    <w:p>
-      <w:pPr>
-        <w:pStyle w:val="ListParagraph"/>
-        <w:numPr>
-          <w:ilvl w:val="0"/>
-          <w:numId w:val="1"/>
-        </w:numPr>
-        <w:spacing w:line="480" w:lineRule="auto"/>
-      </w:pPr>
-      <w:r>
-        <w:t>A reward of 10 when the ball is close to the target (less than 0.1 meters)</w:t>
-      </w:r>
-    </w:p>
-    <w:p>
-      <w:pPr>
-        <w:spacing w:line="480" w:lineRule="auto"/>
-        <w:ind w:firstLine="720"/>
-      </w:pPr>
-    </w:p>
-    <w:p>
-      <w:pPr>
-        <w:spacing w:line="480" w:lineRule="auto"/>
-        <w:ind w:firstLine="720"/>
-      </w:pPr>
-      <w:r>
-        <w:t xml:space="preserve">Each trajectory had between [M, N] steps, for a total of K total recorded (observation, action, reward) triplets recorded from the humans’ interactions with the environment. </w:t>
-      </w:r>
-    </w:p>
-    <w:p>
-      <w:pPr>
-        <w:spacing w:line="480" w:lineRule="auto"/>
-        <w:ind w:firstLine="720"/>
-      </w:pPr>
-      <w:r>
-        <w:lastRenderedPageBreak/>
-        <w:t>Before training our Transformer, we preprocessed the dataset. Our preprocessing involved the following steps:</w:t>
-      </w:r>
-    </w:p>
-    <w:p>
-      <w:pPr>
-        <w:pStyle w:val="ListParagraph"/>
-        <w:numPr>
-          <w:ilvl w:val="0"/>
-          <w:numId w:val="2"/>
-        </w:numPr>
-        <w:spacing w:line="480" w:lineRule="auto"/>
-      </w:pPr>
-      <w:r>
-        <w:t xml:space="preserve">Created a timestamp array for each trajectory. </w:t>
-      </w:r>
-    </w:p>
-    <w:p>
-      <w:pPr>
-        <w:pStyle w:val="ListParagraph"/>
-        <w:numPr>
-          <w:ilvl w:val="0"/>
-          <w:numId w:val="2"/>
-        </w:numPr>
-        <w:spacing w:line="480" w:lineRule="auto"/>
-      </w:pPr>
-      <w:r>
-        <w:t>Calculated “</w:t>
-      </w:r>
-      <w:proofErr w:type="spellStart"/>
-      <w:r>
-        <w:t>returns_to_go</w:t>
-      </w:r>
-      <w:proofErr w:type="spellEnd"/>
-      <w:r>
-        <w:t>” – the cumulative reward for each timestep of a trajectory.</w:t>
-      </w:r>
-    </w:p>
-    <w:p>
-      <w:pPr>
-        <w:pStyle w:val="ListParagraph"/>
-        <w:numPr>
-          <w:ilvl w:val="0"/>
-          <w:numId w:val="2"/>
-        </w:numPr>
-        <w:spacing w:line="480" w:lineRule="auto"/>
-      </w:pPr>
-      <w:r>
-        <w:t>Scaled “</w:t>
-      </w:r>
-      <w:proofErr w:type="spellStart"/>
-      <w:r>
-        <w:t>returns_to_go</w:t>
-      </w:r>
-      <w:proofErr w:type="spellEnd"/>
-      <w:r>
-        <w:t>” by 3600 – the average reward humans received when performing this task using the virtual environment.</w:t>
-      </w:r>
-    </w:p>
-    <w:p>
-      <w:pPr>
-        <w:spacing w:line="480" w:lineRule="auto"/>
-      </w:pPr>
-    </w:p>
-    <w:p>
-      <w:pPr>
-        <w:spacing w:line="480" w:lineRule="auto"/>
-      </w:pPr>
-    </w:p>
-    <w:p>
-      <w:pPr>
-        <w:spacing w:line="480" w:lineRule="auto"/>
-        <w:jc w:val="center"/>
-        <w:rPr>
-          <w:b/>
-        </w:rPr>
-      </w:pPr>
-      <w:r>
-        <w:rPr>
-          <w:b/>
-        </w:rPr>
-        <w:t>Model Design and Training Approach</w:t>
-      </w:r>
-    </w:p>
-    <w:p>
-      <w:pPr>
-        <w:spacing w:line="480" w:lineRule="auto"/>
-        <w:ind w:firstLine="720"/>
-      </w:pPr>
-      <w:r>
-        <w:t>For this task we based our model design on the Decision Transformer approach (reference). A Decision Transformer is a wrapper around the Transformer architecture introduced in (reference). The general idea is that we use a Transformer to generate trajectories for a Reinforcement Learning problem. More formally, given a trajectory:</w:t>
-      </w:r>
-    </w:p>
-    <w:p>
-      <w:pPr>
-        <w:spacing w:line="480" w:lineRule="auto"/>
-        <w:ind w:firstLine="720"/>
-      </w:pPr>
-      <w:r>
-        <w:t>&lt;EQUATION&gt;</w:t>
-      </w:r>
-    </w:p>
-    <w:p>
-      <w:pPr>
-        <w:spacing w:line="480" w:lineRule="auto"/>
-        <w:ind w:firstLine="720"/>
-      </w:pPr>
-      <w:r>
-        <w:t xml:space="preserve">The Decisions Transformer uses the underlying Transformer to predict the next action in the sequence. We then apply that action to the environment to get the next state and reward. These, along with the rest of the sequence generated so far, are fed back into the Decision Transformer to continue the process. Figure 1 </w:t>
-      </w:r>
-      <w:r>
-        <w:t>provides</w:t>
-      </w:r>
-      <w:r>
-        <w:t xml:space="preserve"> a schematic illustration of how this works. </w:t>
-      </w:r>
-    </w:p>
-    <w:p>
-      <w:pPr>
-        <w:spacing w:line="480" w:lineRule="auto"/>
-        <w:ind w:firstLine="720"/>
-      </w:pPr>
-    </w:p>
-    <w:p>
-      <w:pPr>
         <w:keepNext/>
         <w:spacing w:line="480" w:lineRule="auto"/>
         <w:ind w:firstLine="720"/>
         <w:jc w:val="center"/>
       </w:pPr>
       <w:r>
-        <w:rPr>
-          <w:noProof/>
-        </w:rPr>
-        <w:lastRenderedPageBreak/>
         <w:drawing>
-          <wp:inline distT="0" distB="0" distL="0" distR="0" wp14:anchorId="5FB54A85" wp14:editId="48F8C0C9">
-            <wp:extent cx="1899920" cy="3094990"/>
+          <wp:inline distT="0" distB="0" distL="0" distR="0" wp14:anchorId="40D55FB6" wp14:editId="1861F04B">
+            <wp:extent cx="2604138" cy="2577402"/>
             <wp:effectExtent l="0" t="0" r="0" b="0"/>
-            <wp:docPr id="1" name="Picture 1"/>
+            <wp:docPr id="2056713673" name="Picture 1"/>
             <wp:cNvGraphicFramePr>
               <a:graphicFrameLocks xmlns:a="http://schemas.openxmlformats.org/drawingml/2006/main" noChangeAspect="1"/>
             </wp:cNvGraphicFramePr>
@@ -542,10 +128,8 @@
               <a:graphicData uri="http://schemas.openxmlformats.org/drawingml/2006/picture">
                 <pic:pic xmlns:pic="http://schemas.openxmlformats.org/drawingml/2006/picture">
                   <pic:nvPicPr>
-                    <pic:cNvPr id="1" name="Picture 1"/>
-                    <pic:cNvPicPr>
-                      <a:picLocks noChangeAspect="1" noChangeArrowheads="1"/>
-                    </pic:cNvPicPr>
+                    <pic:cNvPr id="2056713673" name=""/>
+                    <pic:cNvPicPr/>
                   </pic:nvPicPr>
                   <pic:blipFill>
                     <a:blip r:embed="rId8"/>
@@ -553,10 +137,10 @@
                       <a:fillRect/>
                     </a:stretch>
                   </pic:blipFill>
-                  <pic:spPr bwMode="auto">
+                  <pic:spPr>
                     <a:xfrm>
                       <a:off x="0" y="0"/>
-                      <a:ext cx="1899920" cy="3094990"/>
+                      <a:ext cx="2612256" cy="2585437"/>
                     </a:xfrm>
                     <a:prstGeom prst="rect">
                       <a:avLst/>
@@ -579,26 +163,114 @@
       </w:r>
       <w:fldSimple w:instr=" SEQ Figure \* ARABIC ">
         <w:r>
+          <w:rPr>
+            <w:noProof/>
+          </w:rPr>
           <w:t>1</w:t>
         </w:r>
       </w:fldSimple>
       <w:r>
-        <w:t xml:space="preserve"> Decision Transformer Architecture</w:t>
+        <w:t xml:space="preserve"> Hand in Action</w:t>
+      </w:r>
+    </w:p>
+    <w:p>
+      <w:pPr>
+        <w:spacing w:line="480" w:lineRule="auto"/>
+        <w:jc w:val="center"/>
+        <w:rPr>
+          <w:b/>
+        </w:rPr>
+      </w:pPr>
+    </w:p>
+    <w:p>
+      <w:pPr>
+        <w:spacing w:line="480" w:lineRule="auto"/>
+        <w:jc w:val="center"/>
+        <w:rPr>
+          <w:b/>
+        </w:rPr>
+      </w:pPr>
+      <w:r>
+        <w:rPr>
+          <w:b/>
+        </w:rPr>
+        <w:t>Dataset Description</w:t>
       </w:r>
     </w:p>
     <w:p>
       <w:pPr>
         <w:spacing w:line="480" w:lineRule="auto"/>
         <w:ind w:firstLine="720"/>
-      </w:pPr>
-      <w:r>
-        <w:t xml:space="preserve">As we are restricting ourselves to only those training trajectories generated by human input, we are limited to 25 full training sessions to work with. </w:t>
-      </w:r>
-      <w:r>
-        <w:t>To</w:t>
-      </w:r>
-      <w:r>
-        <w:t xml:space="preserve"> stretch this out further, we handled the data as follows:</w:t>
+        <w:rPr>
+          <w:lang w:val="en-CA"/>
+        </w:rPr>
+      </w:pPr>
+      <w:r>
+        <w:t>We approached this problem using human data generated (</w:t>
+      </w:r>
+      <w:r>
+        <w:t>Fu 2020</w:t>
+      </w:r>
+      <w:r>
+        <w:t xml:space="preserve">) from the </w:t>
+      </w:r>
+      <w:hyperlink r:id="rId9">
+        <w:r>
+          <w:rPr>
+            <w:rStyle w:val="Hyperlink"/>
+          </w:rPr>
+          <w:t>ADROIT Relocate problem</w:t>
+        </w:r>
+      </w:hyperlink>
+      <w:r>
+        <w:t xml:space="preserve"> (</w:t>
+      </w:r>
+      <w:r>
+        <w:rPr>
+          <w:lang w:val="en-CA"/>
+        </w:rPr>
+        <w:t>Rajeswaran</w:t>
+      </w:r>
+      <w:r>
+        <w:rPr>
+          <w:lang w:val="en-CA"/>
+        </w:rPr>
+        <w:t xml:space="preserve"> </w:t>
+      </w:r>
+      <w:r>
+        <w:t>2017</w:t>
+      </w:r>
+      <w:r>
+        <w:t xml:space="preserve">). In the ADROIT Relocate problem, a 24 </w:t>
+      </w:r>
+      <w:proofErr w:type="spellStart"/>
+      <w:r>
+        <w:t>DoF</w:t>
+      </w:r>
+      <w:proofErr w:type="spellEnd"/>
+      <w:r>
+        <w:t xml:space="preserve"> robotic hand is tasked with picking up a small ball off a table and placing it down at a target location.  We control the hand by providing a sequence of joint angles for each of the actuators as well as positional / rotational angles for the hand’s overall location in the world. For this problem, the </w:t>
+      </w:r>
+      <w:r>
+        <w:lastRenderedPageBreak/>
+        <w:t xml:space="preserve">D4RL group collected 25 human generated trajectories using a virtual environment combined with a </w:t>
+      </w:r>
+      <w:proofErr w:type="spellStart"/>
+      <w:r>
+        <w:t>CyberGlove</w:t>
+      </w:r>
+      <w:proofErr w:type="spellEnd"/>
+      <w:r>
+        <w:rPr>
+          <w:rStyle w:val="FootnoteReference"/>
+        </w:rPr>
+        <w:footnoteReference w:id="1"/>
+      </w:r>
+      <w:r>
+        <w:t xml:space="preserve"> </w:t>
+      </w:r>
+      <w:r>
+        <w:t>apparatus for input.</w:t>
       </w:r>
     </w:p>
     <w:p>
@@ -607,13 +279,7 @@
         <w:ind w:firstLine="720"/>
       </w:pPr>
       <w:r>
-        <w:t xml:space="preserve">We split the data into “sub-trajectories” each the length of the </w:t>
-      </w:r>
-      <w:r>
-        <w:t>model’s</w:t>
-      </w:r>
-      <w:r>
-        <w:t xml:space="preserve"> context size.</w:t>
+        <w:t>Each trajectory in the dataset has three key pieces of information:</w:t>
       </w:r>
     </w:p>
     <w:p>
@@ -621,306 +287,2105 @@
         <w:spacing w:line="480" w:lineRule="auto"/>
         <w:ind w:firstLine="720"/>
       </w:pPr>
-      <w:r>
-        <w:t xml:space="preserve">We used Hindsight Experience Replay </w:t>
-      </w:r>
-      <w:r>
-        <w:t xml:space="preserve">(HER) </w:t>
-      </w:r>
-      <w:r>
-        <w:t>(reference) to re</w:t>
-      </w:r>
-      <w:r>
-        <w:t>-</w:t>
-      </w:r>
-      <w:r>
-        <w:t>label the rewards on those sub-trajectories.</w:t>
-      </w:r>
-      <w:r>
-        <w:t xml:space="preserve"> HER was applied to sub-trajectories with 85% probability.</w:t>
-      </w:r>
-      <w:r>
-        <w:t xml:space="preserve"> </w:t>
-      </w:r>
-      <w:r>
-        <w:t xml:space="preserve">We do this in two stages. In stage 1 we extract milestones from the sub-trajectory: Is the ball near the hand? Is the ball near the target? In stage 2, </w:t>
-      </w:r>
-      <w:r>
-        <w:t xml:space="preserve">if a milestone was predicted in the previous stage, then </w:t>
-      </w:r>
     </w:p>
     <w:p>
       <w:pPr>
         <w:spacing w:line="480" w:lineRule="auto"/>
         <w:ind w:firstLine="720"/>
-      </w:pPr>
-    </w:p>
-    <w:p>
-      <w:pPr>
-        <w:spacing w:line="480" w:lineRule="auto"/>
-        <w:ind w:firstLine="720"/>
-      </w:pPr>
-    </w:p>
-    <w:p>
-      <w:pPr>
-        <w:spacing w:line="480" w:lineRule="auto"/>
-        <w:ind w:firstLine="720"/>
-      </w:pPr>
-    </w:p>
-    <w:p>
-      <w:pPr>
-        <w:spacing w:line="480" w:lineRule="auto"/>
-        <w:ind w:firstLine="720"/>
-      </w:pPr>
-    </w:p>
-    <w:p>
-      <w:pPr>
-        <w:spacing w:line="480" w:lineRule="auto"/>
-        <w:jc w:val="center"/>
         <w:rPr>
           <w:b/>
-        </w:rPr>
-      </w:pPr>
-      <w:r>
-        <w:rPr>
-          <w:b/>
-        </w:rPr>
-        <w:t>Output Evaluation and Interpretation</w:t>
-      </w:r>
-    </w:p>
-    <w:p>
-      <w:pPr>
-        <w:spacing w:line="480" w:lineRule="auto"/>
-        <w:ind w:firstLine="720"/>
-      </w:pPr>
-      <w:r>
-        <w:lastRenderedPageBreak/>
-        <w:t>The main body of your paper goes here, starting on page 3. (Or starting on page 2, if you’re not required to include an abstract.)</w:t>
-      </w:r>
-    </w:p>
-    <w:p>
-      <w:pPr>
-        <w:spacing w:line="480" w:lineRule="auto"/>
-        <w:ind w:firstLine="720"/>
-      </w:pPr>
-    </w:p>
-    <w:p>
-      <w:pPr>
-        <w:spacing w:line="480" w:lineRule="auto"/>
-        <w:jc w:val="center"/>
-        <w:rPr>
-          <w:b/>
-        </w:rPr>
-      </w:pPr>
-      <w:r>
-        <w:rPr>
-          <w:b/>
-        </w:rPr>
-        <w:t>Ethical Considerations and Responsible Use</w:t>
-      </w:r>
-    </w:p>
-    <w:p>
-      <w:pPr>
-        <w:spacing w:line="480" w:lineRule="auto"/>
-        <w:ind w:firstLine="720"/>
-      </w:pPr>
-      <w:r>
-        <w:t>The main body of your paper goes here, starting on page 3. (Or starting on page 2, if you’re not required to include an abstract.)</w:t>
-      </w:r>
-    </w:p>
-    <w:p>
-      <w:pPr>
-        <w:spacing w:line="480" w:lineRule="auto"/>
-        <w:ind w:firstLine="720"/>
-      </w:pPr>
-    </w:p>
-    <w:p>
-      <w:pPr>
-        <w:spacing w:line="480" w:lineRule="auto"/>
-        <w:jc w:val="center"/>
-        <w:rPr>
-          <w:b/>
-        </w:rPr>
-      </w:pPr>
-      <w:r>
-        <w:rPr>
-          <w:b/>
-        </w:rPr>
-        <w:t>Limitations and Future Improvements</w:t>
-      </w:r>
-    </w:p>
-    <w:p>
-      <w:pPr>
-        <w:spacing w:line="480" w:lineRule="auto"/>
-        <w:ind w:firstLine="720"/>
-      </w:pPr>
-      <w:r>
-        <w:t>The main body of your paper goes here, starting on page 3. (Or starting on page 2, if you’re not required to include an abstract.)</w:t>
-      </w:r>
-    </w:p>
-    <w:p>
-      <w:pPr>
-        <w:spacing w:line="480" w:lineRule="auto"/>
-        <w:ind w:firstLine="720"/>
-      </w:pPr>
-    </w:p>
-    <w:p>
-      <w:pPr>
-        <w:spacing w:line="480" w:lineRule="auto"/>
-        <w:ind w:firstLine="720"/>
-      </w:pPr>
-    </w:p>
-    <w:p>
-      <w:pPr>
-        <w:spacing w:line="480" w:lineRule="auto"/>
-        <w:ind w:firstLine="720"/>
-      </w:pPr>
-    </w:p>
-    <w:p>
-      <w:pPr>
-        <w:spacing w:line="480" w:lineRule="auto"/>
-        <w:ind w:firstLine="720"/>
-      </w:pPr>
-    </w:p>
-    <w:p>
-      <w:pPr>
-        <w:spacing w:line="480" w:lineRule="auto"/>
-        <w:jc w:val="center"/>
-      </w:pPr>
-    </w:p>
-    <w:p>
-      <w:pPr>
-        <w:spacing w:line="480" w:lineRule="auto"/>
-        <w:jc w:val="center"/>
-      </w:pPr>
-    </w:p>
-    <w:p>
-      <w:pPr>
-        <w:spacing w:line="480" w:lineRule="auto"/>
-        <w:jc w:val="center"/>
-      </w:pPr>
-    </w:p>
-    <w:p>
-      <w:pPr>
-        <w:spacing w:line="480" w:lineRule="auto"/>
-        <w:jc w:val="center"/>
-      </w:pPr>
-    </w:p>
-    <w:p>
-      <w:pPr>
-        <w:spacing w:line="480" w:lineRule="auto"/>
-        <w:jc w:val="center"/>
-      </w:pPr>
-    </w:p>
-    <w:p>
-      <w:pPr>
-        <w:spacing w:line="480" w:lineRule="auto"/>
-        <w:jc w:val="center"/>
-      </w:pPr>
-    </w:p>
-    <w:p>
-      <w:pPr>
-        <w:spacing w:line="480" w:lineRule="auto"/>
-        <w:jc w:val="center"/>
-      </w:pPr>
-    </w:p>
-    <w:p>
-      <w:pPr>
-        <w:spacing w:line="480" w:lineRule="auto"/>
-        <w:jc w:val="center"/>
-      </w:pPr>
-    </w:p>
-    <w:p>
-      <w:pPr>
-        <w:spacing w:line="480" w:lineRule="auto"/>
-        <w:jc w:val="center"/>
-      </w:pPr>
-    </w:p>
-    <w:p>
-      <w:pPr>
-        <w:spacing w:line="480" w:lineRule="auto"/>
-        <w:jc w:val="center"/>
-      </w:pPr>
-    </w:p>
-    <w:p>
-      <w:pPr>
-        <w:spacing w:line="480" w:lineRule="auto"/>
-        <w:jc w:val="center"/>
-      </w:pPr>
-    </w:p>
-    <w:p>
-      <w:pPr>
-        <w:spacing w:line="480" w:lineRule="auto"/>
-      </w:pPr>
-    </w:p>
-    <w:p>
-      <w:pPr>
-        <w:spacing w:line="480" w:lineRule="auto"/>
-        <w:jc w:val="center"/>
-      </w:pPr>
-      <w:r>
-        <w:br w:type="page"/>
-      </w:r>
-    </w:p>
-    <w:p>
-      <w:pPr>
-        <w:spacing w:line="480" w:lineRule="auto"/>
-        <w:jc w:val="center"/>
-        <w:rPr>
-          <w:b/>
-        </w:rPr>
-      </w:pPr>
-      <w:r>
-        <w:rPr>
-          <w:b/>
-        </w:rPr>
-        <w:lastRenderedPageBreak/>
-        <w:t>References</w:t>
-      </w:r>
-    </w:p>
-    <w:p>
-      <w:pPr>
-        <w:spacing w:line="480" w:lineRule="auto"/>
-        <w:ind w:left="720"/>
-      </w:pPr>
-      <w:r>
-        <w:rPr>
-          <w:lang w:val="en-CA"/>
-        </w:rPr>
-        <w:t xml:space="preserve">Andrychowicz, M., Wolski, F., Ray, A., Schneider, J., Fong, R., </w:t>
-      </w:r>
-      <w:proofErr w:type="spellStart"/>
-      <w:r>
-        <w:rPr>
-          <w:lang w:val="en-CA"/>
-        </w:rPr>
-        <w:t>Welinder</w:t>
-      </w:r>
-      <w:proofErr w:type="spellEnd"/>
-      <w:r>
-        <w:rPr>
-          <w:lang w:val="en-CA"/>
-        </w:rPr>
-        <w:t xml:space="preserve">, P., McGrew, B., Tobin, J., </w:t>
-      </w:r>
-      <w:proofErr w:type="spellStart"/>
-      <w:r>
-        <w:rPr>
-          <w:lang w:val="en-CA"/>
-        </w:rPr>
-        <w:t>Abbeel</w:t>
-      </w:r>
-      <w:proofErr w:type="spellEnd"/>
-      <w:r>
-        <w:rPr>
-          <w:lang w:val="en-CA"/>
-        </w:rPr>
-        <w:t xml:space="preserve">, P., &amp; Zaremba, W. (2017). </w:t>
-      </w:r>
-      <w:r>
-        <w:rPr>
+          <w:bCs/>
           <w:i/>
           <w:iCs/>
+        </w:rPr>
+      </w:pPr>
+      <w:r>
+        <w:rPr>
+          <w:b/>
+          <w:bCs/>
+          <w:i/>
+          <w:iCs/>
+        </w:rPr>
+        <w:t xml:space="preserve">Actions: </w:t>
+      </w:r>
+    </w:p>
+    <w:p>
+      <w:pPr>
+        <w:spacing w:line="480" w:lineRule="auto"/>
+        <w:ind w:firstLine="720"/>
+      </w:pPr>
+      <w:r>
+        <w:t xml:space="preserve">As mentioned earlier, actions represent joint angles for the ADROIT Hand. Our system will learn to generate sequences of actions using a Transformer model. Actions are represented as a 30-dimensional vector space. These represent the 24 </w:t>
+      </w:r>
+      <w:proofErr w:type="spellStart"/>
+      <w:r>
+        <w:t>DoF</w:t>
+      </w:r>
+      <w:proofErr w:type="spellEnd"/>
+      <w:r>
+        <w:t xml:space="preserve"> for the hands – 4 </w:t>
+      </w:r>
+      <w:proofErr w:type="spellStart"/>
+      <w:r>
+        <w:t>DoF</w:t>
+      </w:r>
+      <w:proofErr w:type="spellEnd"/>
+      <w:r>
+        <w:t xml:space="preserve"> for the First, Middle, and Ring Fings, 5 </w:t>
+      </w:r>
+      <w:proofErr w:type="spellStart"/>
+      <w:r>
+        <w:t>DoF</w:t>
+      </w:r>
+      <w:proofErr w:type="spellEnd"/>
+      <w:r>
+        <w:t xml:space="preserve"> for the Little Finger, Thumb, 2 </w:t>
+      </w:r>
+      <w:proofErr w:type="spellStart"/>
+      <w:r>
+        <w:t>DoF</w:t>
+      </w:r>
+      <w:proofErr w:type="spellEnd"/>
+      <w:r>
+        <w:t xml:space="preserve"> for the write, 3 values for the hand’s global location (centered at the palm) and 3 values for the hand’s global rotation. All inputs are clipped between [-1, 1].</w:t>
+      </w:r>
+    </w:p>
+    <w:p>
+      <w:pPr>
+        <w:spacing w:line="480" w:lineRule="auto"/>
+        <w:ind w:firstLine="720"/>
+      </w:pPr>
+    </w:p>
+    <w:p>
+      <w:pPr>
+        <w:spacing w:line="480" w:lineRule="auto"/>
+        <w:ind w:firstLine="720"/>
+        <w:rPr>
+          <w:b/>
+          <w:bCs/>
+          <w:i/>
+          <w:iCs/>
+        </w:rPr>
+      </w:pPr>
+      <w:r>
+        <w:rPr>
+          <w:b/>
+          <w:bCs/>
+          <w:i/>
+          <w:iCs/>
+        </w:rPr>
+        <w:t>Observations:</w:t>
+      </w:r>
+    </w:p>
+    <w:p>
+      <w:pPr>
+        <w:spacing w:line="480" w:lineRule="auto"/>
+        <w:ind w:firstLine="720"/>
+      </w:pPr>
+      <w:r>
+        <w:t>Observations are represented as 39-dimensional vectors. This observation space contains information about the hands current state (the same states used to represent the hand for actions). In addition, it has 3 entries representing the difference in position between the palm of the hand and the target, 3 entries representing the difference in position between the palm of the hand and the target, and 3 entries representing the difference in position between the ball and the target.</w:t>
+      </w:r>
+    </w:p>
+    <w:p>
+      <w:pPr>
+        <w:spacing w:line="480" w:lineRule="auto"/>
+        <w:ind w:firstLine="720"/>
+      </w:pPr>
+    </w:p>
+    <w:p>
+      <w:pPr>
+        <w:spacing w:line="480" w:lineRule="auto"/>
+        <w:ind w:firstLine="720"/>
+        <w:rPr>
+          <w:b/>
+          <w:bCs/>
+          <w:i/>
+          <w:iCs/>
+        </w:rPr>
+      </w:pPr>
+      <w:r>
+        <w:rPr>
+          <w:b/>
+          <w:bCs/>
+          <w:i/>
+          <w:iCs/>
+        </w:rPr>
+        <w:t>Reward:</w:t>
+      </w:r>
+    </w:p>
+    <w:p>
+      <w:pPr>
+        <w:pStyle w:val="ListParagraph"/>
+        <w:numPr>
+          <w:ilvl w:val="0"/>
+          <w:numId w:val="1"/>
+        </w:numPr>
+        <w:spacing w:line="480" w:lineRule="auto"/>
+      </w:pPr>
+      <w:r>
+        <w:t>Rewards offered by the Human generated dataset are heavily shaped. At each step, the environment provides the following rewards:</w:t>
+      </w:r>
+    </w:p>
+    <w:p>
+      <w:pPr>
+        <w:pStyle w:val="ListParagraph"/>
+        <w:numPr>
+          <w:ilvl w:val="0"/>
+          <w:numId w:val="1"/>
+        </w:numPr>
+        <w:spacing w:line="480" w:lineRule="auto"/>
+      </w:pPr>
+      <w:r>
+        <w:t>Increase negative reward the further the hand is from the ball.</w:t>
+      </w:r>
+    </w:p>
+    <w:p>
+      <w:pPr>
+        <w:pStyle w:val="ListParagraph"/>
+        <w:numPr>
+          <w:ilvl w:val="0"/>
+          <w:numId w:val="1"/>
+        </w:numPr>
+        <w:spacing w:line="480" w:lineRule="auto"/>
+      </w:pPr>
+      <w:r>
+        <w:lastRenderedPageBreak/>
+        <w:t>A reward of 1 if the ball is off the table.</w:t>
+      </w:r>
+    </w:p>
+    <w:p>
+      <w:pPr>
+        <w:pStyle w:val="ListParagraph"/>
+        <w:numPr>
+          <w:ilvl w:val="0"/>
+          <w:numId w:val="1"/>
+        </w:numPr>
+        <w:spacing w:line="480" w:lineRule="auto"/>
+      </w:pPr>
+      <w:r>
+        <w:t>A negative reward representing how far the ball is from the target when the ball is in hand.</w:t>
+      </w:r>
+    </w:p>
+    <w:p>
+      <w:pPr>
+        <w:pStyle w:val="ListParagraph"/>
+        <w:numPr>
+          <w:ilvl w:val="0"/>
+          <w:numId w:val="1"/>
+        </w:numPr>
+        <w:spacing w:line="480" w:lineRule="auto"/>
+      </w:pPr>
+      <w:r>
+        <w:t>A reward of 10 when the ball is close to the target (less than 0.1 meters)</w:t>
+      </w:r>
+    </w:p>
+    <w:p>
+      <w:pPr>
+        <w:spacing w:line="480" w:lineRule="auto"/>
+        <w:ind w:firstLine="720"/>
+      </w:pPr>
+    </w:p>
+    <w:p>
+      <w:pPr>
+        <w:spacing w:line="480" w:lineRule="auto"/>
+        <w:ind w:firstLine="720"/>
+      </w:pPr>
+      <w:r>
+        <w:t>Each trajectory had between [</w:t>
+      </w:r>
+      <w:r>
+        <w:t>297</w:t>
+      </w:r>
+      <w:r>
+        <w:t xml:space="preserve">, </w:t>
+      </w:r>
+      <w:r>
+        <w:t>527</w:t>
+      </w:r>
+      <w:r>
+        <w:t xml:space="preserve">] steps, for a total of </w:t>
+      </w:r>
+      <w:r>
+        <w:t>9942</w:t>
+      </w:r>
+      <w:r>
+        <w:t xml:space="preserve"> total recorded (observation, action, reward) triplets recorded from the humans’ interactions with the environment. </w:t>
+      </w:r>
+    </w:p>
+    <w:p>
+      <w:pPr>
+        <w:spacing w:line="480" w:lineRule="auto"/>
+        <w:ind w:firstLine="720"/>
+      </w:pPr>
+      <w:r>
+        <w:t>Before training our Transformer, we preprocessed the dataset. Our preprocessing involved the following steps:</w:t>
+      </w:r>
+    </w:p>
+    <w:p>
+      <w:pPr>
+        <w:pStyle w:val="ListParagraph"/>
+        <w:numPr>
+          <w:ilvl w:val="0"/>
+          <w:numId w:val="2"/>
+        </w:numPr>
+        <w:spacing w:line="480" w:lineRule="auto"/>
+      </w:pPr>
+      <w:r>
+        <w:t xml:space="preserve">Created a timestamp array for each trajectory. </w:t>
+      </w:r>
+    </w:p>
+    <w:p>
+      <w:pPr>
+        <w:pStyle w:val="ListParagraph"/>
+        <w:numPr>
+          <w:ilvl w:val="0"/>
+          <w:numId w:val="2"/>
+        </w:numPr>
+        <w:spacing w:line="480" w:lineRule="auto"/>
+      </w:pPr>
+      <w:r>
+        <w:t>Calculated “</w:t>
+      </w:r>
+      <w:proofErr w:type="spellStart"/>
+      <w:r>
+        <w:t>returns_to_go</w:t>
+      </w:r>
+      <w:proofErr w:type="spellEnd"/>
+      <w:r>
+        <w:t>” – the cumulative reward for each timestep of a trajectory.</w:t>
+      </w:r>
+    </w:p>
+    <w:p>
+      <w:pPr>
+        <w:pStyle w:val="ListParagraph"/>
+        <w:numPr>
+          <w:ilvl w:val="0"/>
+          <w:numId w:val="2"/>
+        </w:numPr>
+        <w:spacing w:line="480" w:lineRule="auto"/>
+      </w:pPr>
+      <w:r>
+        <w:t>Scaled “</w:t>
+      </w:r>
+      <w:proofErr w:type="spellStart"/>
+      <w:r>
+        <w:t>returns_to_go</w:t>
+      </w:r>
+      <w:proofErr w:type="spellEnd"/>
+      <w:r>
+        <w:t>” by 3600 – the average reward humans received when performing this task using the virtual environment.</w:t>
+      </w:r>
+    </w:p>
+    <w:p>
+      <w:pPr>
+        <w:spacing w:line="480" w:lineRule="auto"/>
+      </w:pPr>
+    </w:p>
+    <w:p>
+      <w:pPr>
+        <w:spacing w:line="480" w:lineRule="auto"/>
+        <w:jc w:val="center"/>
+        <w:rPr>
+          <w:b/>
+        </w:rPr>
+      </w:pPr>
+      <w:r>
+        <w:rPr>
+          <w:b/>
+        </w:rPr>
+        <w:t>Model Design and Training Approach</w:t>
+      </w:r>
+    </w:p>
+    <w:p>
+      <w:pPr>
+        <w:spacing w:line="480" w:lineRule="auto"/>
+        <w:ind w:firstLine="720"/>
+        <w:rPr>
+          <w:lang w:val="en-CA"/>
+        </w:rPr>
+      </w:pPr>
+      <w:r>
+        <w:t>For this task we based our model design on the Decision Transformer approach (</w:t>
+      </w:r>
+      <w:r>
+        <w:t>Chen 2021</w:t>
+      </w:r>
+      <w:r>
+        <w:t>). A Decision Transformer is a wrapper around the Transformer architecture introduced in (</w:t>
+      </w:r>
+      <w:r>
+        <w:rPr>
+          <w:lang w:val="en-CA"/>
+        </w:rPr>
+        <w:t>Vaswani</w:t>
+      </w:r>
+      <w:r>
+        <w:rPr>
+          <w:lang w:val="en-CA"/>
+        </w:rPr>
+        <w:t xml:space="preserve"> 2017</w:t>
+      </w:r>
+      <w:r>
+        <w:t>). The general idea is that we use a Transformer to generate trajectories for a Reinforcement Learning problem. More formally, given a trajectory:</w:t>
+      </w:r>
+    </w:p>
+    <w:p>
+      <w:pPr>
+        <w:spacing w:line="480" w:lineRule="auto"/>
+        <w:ind w:firstLine="720"/>
+      </w:pPr>
+      <m:oMathPara>
+        <m:oMath>
+          <m:r>
+            <w:rPr>
+              <w:rFonts w:ascii="Cambria Math" w:hAnsi="Cambria Math"/>
+            </w:rPr>
+            <m:t>τ=(</m:t>
+          </m:r>
+          <m:sSub>
+            <m:sSubPr>
+              <m:ctrlPr>
+                <w:rPr>
+                  <w:rFonts w:ascii="Cambria Math" w:hAnsi="Cambria Math"/>
+                  <w:i/>
+                </w:rPr>
+              </m:ctrlPr>
+            </m:sSubPr>
+            <m:e>
+              <m:r>
+                <w:rPr>
+                  <w:rFonts w:ascii="Cambria Math" w:hAnsi="Cambria Math"/>
+                </w:rPr>
+                <m:t>s</m:t>
+              </m:r>
+            </m:e>
+            <m:sub>
+              <m:r>
+                <w:rPr>
+                  <w:rFonts w:ascii="Cambria Math" w:hAnsi="Cambria Math"/>
+                </w:rPr>
+                <m:t>1</m:t>
+              </m:r>
+            </m:sub>
+          </m:sSub>
+          <m:r>
+            <w:rPr>
+              <w:rFonts w:ascii="Cambria Math" w:hAnsi="Cambria Math"/>
+            </w:rPr>
+            <m:t xml:space="preserve">, </m:t>
+          </m:r>
+          <m:sSub>
+            <m:sSubPr>
+              <m:ctrlPr>
+                <w:rPr>
+                  <w:rFonts w:ascii="Cambria Math" w:hAnsi="Cambria Math"/>
+                  <w:i/>
+                </w:rPr>
+              </m:ctrlPr>
+            </m:sSubPr>
+            <m:e>
+              <m:r>
+                <w:rPr>
+                  <w:rFonts w:ascii="Cambria Math" w:hAnsi="Cambria Math"/>
+                </w:rPr>
+                <m:t>a</m:t>
+              </m:r>
+            </m:e>
+            <m:sub>
+              <m:r>
+                <w:rPr>
+                  <w:rFonts w:ascii="Cambria Math" w:hAnsi="Cambria Math"/>
+                </w:rPr>
+                <m:t>1</m:t>
+              </m:r>
+            </m:sub>
+          </m:sSub>
+          <m:r>
+            <w:rPr>
+              <w:rFonts w:ascii="Cambria Math" w:hAnsi="Cambria Math"/>
+            </w:rPr>
+            <m:t>,</m:t>
+          </m:r>
+          <m:sSub>
+            <m:sSubPr>
+              <m:ctrlPr>
+                <w:rPr>
+                  <w:rFonts w:ascii="Cambria Math" w:hAnsi="Cambria Math"/>
+                  <w:i/>
+                </w:rPr>
+              </m:ctrlPr>
+            </m:sSubPr>
+            <m:e>
+              <m:r>
+                <w:rPr>
+                  <w:rFonts w:ascii="Cambria Math" w:hAnsi="Cambria Math"/>
+                </w:rPr>
+                <m:t xml:space="preserve"> r</m:t>
+              </m:r>
+            </m:e>
+            <m:sub>
+              <m:r>
+                <w:rPr>
+                  <w:rFonts w:ascii="Cambria Math" w:hAnsi="Cambria Math"/>
+                </w:rPr>
+                <m:t xml:space="preserve">1, </m:t>
+              </m:r>
+            </m:sub>
+          </m:sSub>
+          <m:sSub>
+            <m:sSubPr>
+              <m:ctrlPr>
+                <w:rPr>
+                  <w:rFonts w:ascii="Cambria Math" w:hAnsi="Cambria Math"/>
+                  <w:i/>
+                </w:rPr>
+              </m:ctrlPr>
+            </m:sSubPr>
+            <m:e>
+              <m:r>
+                <w:rPr>
+                  <w:rFonts w:ascii="Cambria Math" w:hAnsi="Cambria Math"/>
+                </w:rPr>
+                <m:t>s</m:t>
+              </m:r>
+            </m:e>
+            <m:sub>
+              <m:r>
+                <w:rPr>
+                  <w:rFonts w:ascii="Cambria Math" w:hAnsi="Cambria Math"/>
+                </w:rPr>
+                <m:t>2</m:t>
+              </m:r>
+            </m:sub>
+          </m:sSub>
+          <m:r>
+            <w:rPr>
+              <w:rFonts w:ascii="Cambria Math" w:hAnsi="Cambria Math"/>
+            </w:rPr>
+            <m:t xml:space="preserve">, </m:t>
+          </m:r>
+          <m:sSub>
+            <m:sSubPr>
+              <m:ctrlPr>
+                <w:rPr>
+                  <w:rFonts w:ascii="Cambria Math" w:hAnsi="Cambria Math"/>
+                  <w:i/>
+                </w:rPr>
+              </m:ctrlPr>
+            </m:sSubPr>
+            <m:e>
+              <m:r>
+                <w:rPr>
+                  <w:rFonts w:ascii="Cambria Math" w:hAnsi="Cambria Math"/>
+                </w:rPr>
+                <m:t>a</m:t>
+              </m:r>
+            </m:e>
+            <m:sub>
+              <m:r>
+                <w:rPr>
+                  <w:rFonts w:ascii="Cambria Math" w:hAnsi="Cambria Math"/>
+                </w:rPr>
+                <m:t>2</m:t>
+              </m:r>
+            </m:sub>
+          </m:sSub>
+          <m:r>
+            <w:rPr>
+              <w:rFonts w:ascii="Cambria Math" w:hAnsi="Cambria Math"/>
+            </w:rPr>
+            <m:t>,</m:t>
+          </m:r>
+          <m:sSub>
+            <m:sSubPr>
+              <m:ctrlPr>
+                <w:rPr>
+                  <w:rFonts w:ascii="Cambria Math" w:hAnsi="Cambria Math"/>
+                  <w:i/>
+                </w:rPr>
+              </m:ctrlPr>
+            </m:sSubPr>
+            <m:e>
+              <m:r>
+                <w:rPr>
+                  <w:rFonts w:ascii="Cambria Math" w:hAnsi="Cambria Math"/>
+                </w:rPr>
+                <m:t>r</m:t>
+              </m:r>
+            </m:e>
+            <m:sub>
+              <m:r>
+                <w:rPr>
+                  <w:rFonts w:ascii="Cambria Math" w:hAnsi="Cambria Math"/>
+                </w:rPr>
+                <m:t>3</m:t>
+              </m:r>
+              <m:r>
+                <w:rPr>
+                  <w:rFonts w:ascii="Cambria Math" w:hAnsi="Cambria Math"/>
+                </w:rPr>
+                <m:t xml:space="preserve">, </m:t>
+              </m:r>
+            </m:sub>
+          </m:sSub>
+          <m:r>
+            <w:rPr>
+              <w:rFonts w:ascii="Cambria Math" w:hAnsi="Cambria Math"/>
+            </w:rPr>
+            <m:t xml:space="preserve">…, </m:t>
+          </m:r>
+          <m:sSub>
+            <m:sSubPr>
+              <m:ctrlPr>
+                <w:rPr>
+                  <w:rFonts w:ascii="Cambria Math" w:hAnsi="Cambria Math"/>
+                  <w:i/>
+                </w:rPr>
+              </m:ctrlPr>
+            </m:sSubPr>
+            <m:e>
+              <m:r>
+                <w:rPr>
+                  <w:rFonts w:ascii="Cambria Math" w:hAnsi="Cambria Math"/>
+                </w:rPr>
+                <m:t>s</m:t>
+              </m:r>
+            </m:e>
+            <m:sub>
+              <m:r>
+                <w:rPr>
+                  <w:rFonts w:ascii="Cambria Math" w:hAnsi="Cambria Math"/>
+                </w:rPr>
+                <m:t>N</m:t>
+              </m:r>
+            </m:sub>
+          </m:sSub>
+          <m:r>
+            <w:rPr>
+              <w:rFonts w:ascii="Cambria Math" w:hAnsi="Cambria Math"/>
+            </w:rPr>
+            <m:t xml:space="preserve">, </m:t>
+          </m:r>
+          <m:sSub>
+            <m:sSubPr>
+              <m:ctrlPr>
+                <w:rPr>
+                  <w:rFonts w:ascii="Cambria Math" w:hAnsi="Cambria Math"/>
+                  <w:i/>
+                </w:rPr>
+              </m:ctrlPr>
+            </m:sSubPr>
+            <m:e>
+              <m:r>
+                <w:rPr>
+                  <w:rFonts w:ascii="Cambria Math" w:hAnsi="Cambria Math"/>
+                </w:rPr>
+                <m:t>a</m:t>
+              </m:r>
+            </m:e>
+            <m:sub>
+              <m:r>
+                <w:rPr>
+                  <w:rFonts w:ascii="Cambria Math" w:hAnsi="Cambria Math"/>
+                </w:rPr>
+                <m:t>N</m:t>
+              </m:r>
+            </m:sub>
+          </m:sSub>
+          <m:r>
+            <w:rPr>
+              <w:rFonts w:ascii="Cambria Math" w:hAnsi="Cambria Math"/>
+            </w:rPr>
+            <m:t>,</m:t>
+          </m:r>
+          <m:sSub>
+            <m:sSubPr>
+              <m:ctrlPr>
+                <w:rPr>
+                  <w:rFonts w:ascii="Cambria Math" w:hAnsi="Cambria Math"/>
+                  <w:i/>
+                </w:rPr>
+              </m:ctrlPr>
+            </m:sSubPr>
+            <m:e>
+              <m:r>
+                <w:rPr>
+                  <w:rFonts w:ascii="Cambria Math" w:hAnsi="Cambria Math"/>
+                </w:rPr>
+                <m:t>r</m:t>
+              </m:r>
+            </m:e>
+            <m:sub>
+              <m:r>
+                <w:rPr>
+                  <w:rFonts w:ascii="Cambria Math" w:hAnsi="Cambria Math"/>
+                </w:rPr>
+                <m:t>N</m:t>
+              </m:r>
+              <m:r>
+                <w:rPr>
+                  <w:rFonts w:ascii="Cambria Math" w:hAnsi="Cambria Math"/>
+                </w:rPr>
+                <m:t xml:space="preserve">, </m:t>
+              </m:r>
+            </m:sub>
+          </m:sSub>
+          <m:sSub>
+            <m:sSubPr>
+              <m:ctrlPr>
+                <w:rPr>
+                  <w:rFonts w:ascii="Cambria Math" w:hAnsi="Cambria Math"/>
+                  <w:i/>
+                </w:rPr>
+              </m:ctrlPr>
+            </m:sSubPr>
+            <m:e>
+              <m:r>
+                <w:rPr>
+                  <w:rFonts w:ascii="Cambria Math" w:hAnsi="Cambria Math"/>
+                </w:rPr>
+                <m:t>s</m:t>
+              </m:r>
+            </m:e>
+            <m:sub>
+              <m:r>
+                <w:rPr>
+                  <w:rFonts w:ascii="Cambria Math" w:hAnsi="Cambria Math"/>
+                </w:rPr>
+                <m:t>N+1</m:t>
+              </m:r>
+            </m:sub>
+          </m:sSub>
+          <m:r>
+            <w:rPr>
+              <w:rFonts w:ascii="Cambria Math" w:hAnsi="Cambria Math"/>
+            </w:rPr>
+            <m:t>)</m:t>
+          </m:r>
+        </m:oMath>
+      </m:oMathPara>
+    </w:p>
+    <w:p>
+      <w:pPr>
+        <w:spacing w:line="480" w:lineRule="auto"/>
+        <w:ind w:firstLine="720"/>
+      </w:pPr>
+      <w:r>
+        <w:t xml:space="preserve">The Decisions Transformer uses the underlying Transformer to predict the next action </w:t>
+      </w:r>
+      <w:r>
+        <w:t xml:space="preserve">and return in the sequence. We use the action to generate the next state from the environment. </w:t>
+      </w:r>
+      <w:r>
+        <w:lastRenderedPageBreak/>
+        <w:t>Predicted returns are only used during the training phase as part of the loss function. Once we have the action, state, and true return we append these to our context window and feed the new sequence back into the Decision Transformer to generate the next steps in our policy.</w:t>
+      </w:r>
+    </w:p>
+    <w:p>
+      <w:pPr>
+        <w:keepNext/>
+        <w:spacing w:line="480" w:lineRule="auto"/>
+        <w:ind w:firstLine="720"/>
+        <w:jc w:val="center"/>
+      </w:pPr>
+      <w:r>
+        <w:rPr>
+          <w:noProof/>
+        </w:rPr>
+        <w:drawing>
+          <wp:inline distT="0" distB="0" distL="0" distR="0" wp14:anchorId="6FD2379A" wp14:editId="68A9B4DC">
+            <wp:extent cx="2535037" cy="4124849"/>
+            <wp:effectExtent l="0" t="0" r="0" b="0"/>
+            <wp:docPr id="165144645" name="Picture 2"/>
+            <wp:cNvGraphicFramePr>
+              <a:graphicFrameLocks xmlns:a="http://schemas.openxmlformats.org/drawingml/2006/main" noChangeAspect="1"/>
+            </wp:cNvGraphicFramePr>
+            <a:graphic xmlns:a="http://schemas.openxmlformats.org/drawingml/2006/main">
+              <a:graphicData uri="http://schemas.openxmlformats.org/drawingml/2006/picture">
+                <pic:pic xmlns:pic="http://schemas.openxmlformats.org/drawingml/2006/picture">
+                  <pic:nvPicPr>
+                    <pic:cNvPr id="0" name="Picture 2"/>
+                    <pic:cNvPicPr>
+                      <a:picLocks noChangeAspect="1" noChangeArrowheads="1"/>
+                    </pic:cNvPicPr>
+                  </pic:nvPicPr>
+                  <pic:blipFill>
+                    <a:blip r:embed="rId10" cstate="print">
+                      <a:extLst>
+                        <a:ext uri="{28A0092B-C50C-407E-A947-70E740481C1C}">
+                          <a14:useLocalDpi xmlns:a14="http://schemas.microsoft.com/office/drawing/2010/main" val="0"/>
+                        </a:ext>
+                      </a:extLst>
+                    </a:blip>
+                    <a:srcRect/>
+                    <a:stretch>
+                      <a:fillRect/>
+                    </a:stretch>
+                  </pic:blipFill>
+                  <pic:spPr bwMode="auto">
+                    <a:xfrm>
+                      <a:off x="0" y="0"/>
+                      <a:ext cx="2542139" cy="4136404"/>
+                    </a:xfrm>
+                    <a:prstGeom prst="rect">
+                      <a:avLst/>
+                    </a:prstGeom>
+                    <a:noFill/>
+                    <a:ln>
+                      <a:noFill/>
+                    </a:ln>
+                  </pic:spPr>
+                </pic:pic>
+              </a:graphicData>
+            </a:graphic>
+          </wp:inline>
+        </w:drawing>
+      </w:r>
+    </w:p>
+    <w:p>
+      <w:pPr>
+        <w:spacing w:line="480" w:lineRule="auto"/>
+      </w:pPr>
+      <w:r>
+        <w:t xml:space="preserve">As we are restricting ourselves to only those training trajectories generated by human input, we are limited to 25 full training sessions to work with. </w:t>
+      </w:r>
+      <w:r>
+        <w:t>To</w:t>
+      </w:r>
+      <w:r>
+        <w:t xml:space="preserve"> stretch this out further, we handled the data as follows:</w:t>
+      </w:r>
+    </w:p>
+    <w:p>
+      <w:pPr>
+        <w:spacing w:line="480" w:lineRule="auto"/>
+      </w:pPr>
+    </w:p>
+    <w:p>
+      <w:pPr>
+        <w:pStyle w:val="ListParagraph"/>
+        <w:numPr>
+          <w:ilvl w:val="0"/>
+          <w:numId w:val="4"/>
+        </w:numPr>
+        <w:spacing w:line="480" w:lineRule="auto"/>
+      </w:pPr>
+      <w:r>
+        <w:t xml:space="preserve">We split the data into “sub-trajectories” each the length of the </w:t>
+      </w:r>
+      <w:r>
+        <w:t>model’s</w:t>
+      </w:r>
+      <w:r>
+        <w:t xml:space="preserve"> context size.</w:t>
+      </w:r>
+    </w:p>
+    <w:p>
+      <w:pPr>
+        <w:pStyle w:val="ListParagraph"/>
+        <w:numPr>
+          <w:ilvl w:val="0"/>
+          <w:numId w:val="4"/>
+        </w:numPr>
+        <w:spacing w:line="480" w:lineRule="auto"/>
+      </w:pPr>
+      <w:r>
+        <w:t xml:space="preserve">We used Hindsight Experience Replay </w:t>
+      </w:r>
+      <w:r>
+        <w:t xml:space="preserve">(HER) </w:t>
+      </w:r>
+      <w:r>
+        <w:t>(reference) to re</w:t>
+      </w:r>
+      <w:r>
+        <w:t>-</w:t>
+      </w:r>
+      <w:r>
+        <w:t>label the rewards on those sub-trajectories.</w:t>
+      </w:r>
+      <w:r>
+        <w:t xml:space="preserve"> HER was applied to sub-trajectories with 85% probability.</w:t>
+      </w:r>
+      <w:r>
+        <w:t xml:space="preserve"> </w:t>
+      </w:r>
+      <w:r>
+        <w:t xml:space="preserve">We do this in two stages. In stage 1 we extract milestones from the sub-trajectory: Is the ball near the </w:t>
+      </w:r>
+      <w:r>
+        <w:lastRenderedPageBreak/>
+        <w:t xml:space="preserve">hand? Is the ball near the target? In stage 2, </w:t>
+      </w:r>
+      <w:r>
+        <w:t xml:space="preserve">if a milestone was predicted in the previous stage, then </w:t>
+      </w:r>
+      <w:r>
+        <w:t xml:space="preserve">we re-label the </w:t>
+      </w:r>
+      <w:proofErr w:type="spellStart"/>
+      <w:r>
+        <w:t>returns_to_go</w:t>
+      </w:r>
+      <w:proofErr w:type="spellEnd"/>
+      <w:r>
+        <w:t xml:space="preserve"> for that trajectory so that the goal for that run was the sub-goal represented by the milestone we found in stage 1.</w:t>
+      </w:r>
+    </w:p>
+    <w:p>
+      <w:pPr>
+        <w:spacing w:line="480" w:lineRule="auto"/>
+      </w:pPr>
+    </w:p>
+    <w:p>
+      <w:pPr>
+        <w:spacing w:line="480" w:lineRule="auto"/>
+      </w:pPr>
+      <w:r>
+        <w:tab/>
+        <w:t>We followed the general training procedure described in (</w:t>
+      </w:r>
+      <w:r>
+        <w:t>Chen 2021</w:t>
+      </w:r>
+      <w:r>
+        <w:t>), treating the training as a supervised training problem where the goal was to teach the system to predict the correct next action in the sequence. To help the system generalize a bit better, we also asked the system to predict the next reward in the sequence as well, which we rescaled and added to the resulting loss function. Our final loss function can be seen below:</w:t>
+      </w:r>
+    </w:p>
+    <w:p>
+      <w:pPr>
+        <w:spacing w:line="480" w:lineRule="auto"/>
+      </w:pPr>
+    </w:p>
+    <w:p>
+      <w:pPr>
+        <w:spacing w:line="480" w:lineRule="auto"/>
+      </w:pPr>
+      <w:r>
+        <w:tab/>
+      </w:r>
+      <m:oMath>
+        <m:r>
+          <w:rPr>
+            <w:rFonts w:ascii="Cambria Math" w:hAnsi="Cambria Math"/>
+          </w:rPr>
+          <m:t>loss=MSE</m:t>
+        </m:r>
+        <m:d>
+          <m:dPr>
+            <m:ctrlPr>
+              <w:rPr>
+                <w:rFonts w:ascii="Cambria Math" w:hAnsi="Cambria Math"/>
+                <w:i/>
+              </w:rPr>
+            </m:ctrlPr>
+          </m:dPr>
+          <m:e>
+            <m:sSub>
+              <m:sSubPr>
+                <m:ctrlPr>
+                  <w:rPr>
+                    <w:rFonts w:ascii="Cambria Math" w:hAnsi="Cambria Math"/>
+                    <w:i/>
+                  </w:rPr>
+                </m:ctrlPr>
+              </m:sSubPr>
+              <m:e>
+                <m:r>
+                  <w:rPr>
+                    <w:rFonts w:ascii="Cambria Math" w:hAnsi="Cambria Math"/>
+                  </w:rPr>
+                  <m:t>action</m:t>
+                </m:r>
+              </m:e>
+              <m:sub>
+                <m:r>
+                  <w:rPr>
+                    <w:rFonts w:ascii="Cambria Math" w:hAnsi="Cambria Math"/>
+                  </w:rPr>
+                  <m:t>pred</m:t>
+                </m:r>
+              </m:sub>
+            </m:sSub>
+            <m:r>
+              <w:rPr>
+                <w:rFonts w:ascii="Cambria Math" w:hAnsi="Cambria Math"/>
+              </w:rPr>
+              <m:t>-</m:t>
+            </m:r>
+            <m:sSub>
+              <m:sSubPr>
+                <m:ctrlPr>
+                  <w:rPr>
+                    <w:rFonts w:ascii="Cambria Math" w:hAnsi="Cambria Math"/>
+                    <w:i/>
+                  </w:rPr>
+                </m:ctrlPr>
+              </m:sSubPr>
+              <m:e>
+                <m:r>
+                  <w:rPr>
+                    <w:rFonts w:ascii="Cambria Math" w:hAnsi="Cambria Math"/>
+                  </w:rPr>
+                  <m:t>action</m:t>
+                </m:r>
+              </m:e>
+              <m:sub>
+                <m:r>
+                  <w:rPr>
+                    <w:rFonts w:ascii="Cambria Math" w:hAnsi="Cambria Math"/>
+                  </w:rPr>
+                  <m:t>true</m:t>
+                </m:r>
+              </m:sub>
+            </m:sSub>
+          </m:e>
+        </m:d>
+        <m:r>
+          <w:rPr>
+            <w:rFonts w:ascii="Cambria Math" w:hAnsi="Cambria Math"/>
+          </w:rPr>
+          <m:t>+0.001*MSE(</m:t>
+        </m:r>
+        <m:sSub>
+          <m:sSubPr>
+            <m:ctrlPr>
+              <w:rPr>
+                <w:rFonts w:ascii="Cambria Math" w:hAnsi="Cambria Math"/>
+                <w:i/>
+              </w:rPr>
+            </m:ctrlPr>
+          </m:sSubPr>
+          <m:e>
+            <m:r>
+              <w:rPr>
+                <w:rFonts w:ascii="Cambria Math" w:hAnsi="Cambria Math"/>
+              </w:rPr>
+              <m:t>reward</m:t>
+            </m:r>
+          </m:e>
+          <m:sub>
+            <m:r>
+              <w:rPr>
+                <w:rFonts w:ascii="Cambria Math" w:hAnsi="Cambria Math"/>
+              </w:rPr>
+              <m:t>pred</m:t>
+            </m:r>
+          </m:sub>
+        </m:sSub>
+        <m:r>
+          <w:rPr>
+            <w:rFonts w:ascii="Cambria Math" w:hAnsi="Cambria Math"/>
+          </w:rPr>
+          <m:t>-</m:t>
+        </m:r>
+        <m:sSub>
+          <m:sSubPr>
+            <m:ctrlPr>
+              <w:rPr>
+                <w:rFonts w:ascii="Cambria Math" w:hAnsi="Cambria Math"/>
+                <w:i/>
+              </w:rPr>
+            </m:ctrlPr>
+          </m:sSubPr>
+          <m:e>
+            <m:r>
+              <w:rPr>
+                <w:rFonts w:ascii="Cambria Math" w:hAnsi="Cambria Math"/>
+              </w:rPr>
+              <m:t>reward</m:t>
+            </m:r>
+          </m:e>
+          <m:sub>
+            <m:r>
+              <w:rPr>
+                <w:rFonts w:ascii="Cambria Math" w:hAnsi="Cambria Math"/>
+              </w:rPr>
+              <m:t>true</m:t>
+            </m:r>
+          </m:sub>
+        </m:sSub>
+        <m:r>
+          <w:rPr>
+            <w:rFonts w:ascii="Cambria Math" w:hAnsi="Cambria Math"/>
+          </w:rPr>
+          <m:t>)</m:t>
+        </m:r>
+      </m:oMath>
+    </w:p>
+    <w:p>
+      <w:pPr>
+        <w:spacing w:line="480" w:lineRule="auto"/>
+      </w:pPr>
+    </w:p>
+    <w:p>
+      <w:pPr>
+        <w:spacing w:line="480" w:lineRule="auto"/>
+        <w:ind w:firstLine="720"/>
+      </w:pPr>
+      <w:r>
+        <w:t xml:space="preserve">Table 1 shows the hyper-parameters we used to train the model with. During training we evaluated the model every 10 epochs. If the maximum reward achieved exceeded the previous maximum reward, we saved a snapshot of the model as a candidate for final evaluation later in the paper. Figure 2 shows the resulting losses and maximum rewards we achieved over the training period. </w:t>
+      </w:r>
+    </w:p>
+    <w:p>
+      <w:pPr>
+        <w:spacing w:line="480" w:lineRule="auto"/>
+        <w:ind w:firstLine="720"/>
+      </w:pPr>
+    </w:p>
+    <w:tbl>
+      <w:tblPr>
+        <w:tblStyle w:val="GridTable1Light"/>
+        <w:tblW w:w="0" w:type="auto"/>
+        <w:tblLook w:val="04A0" w:firstRow="1" w:lastRow="0" w:firstColumn="1" w:lastColumn="0" w:noHBand="0" w:noVBand="1"/>
+      </w:tblPr>
+      <w:tblGrid>
+        <w:gridCol w:w="3398"/>
+        <w:gridCol w:w="2971"/>
+        <w:gridCol w:w="3207"/>
+      </w:tblGrid>
+      <w:tr>
+        <w:trPr>
+          <w:cnfStyle w:val="100000000000" w:firstRow="1" w:lastRow="0" w:firstColumn="0" w:lastColumn="0" w:oddVBand="0" w:evenVBand="0" w:oddHBand="0" w:evenHBand="0" w:firstRowFirstColumn="0" w:firstRowLastColumn="0" w:lastRowFirstColumn="0" w:lastRowLastColumn="0"/>
+        </w:trPr>
+        <w:tc>
+          <w:tcPr>
+            <w:cnfStyle w:val="001000000000" w:firstRow="0" w:lastRow="0" w:firstColumn="1" w:lastColumn="0" w:oddVBand="0" w:evenVBand="0" w:oddHBand="0" w:evenHBand="0" w:firstRowFirstColumn="0" w:firstRowLastColumn="0" w:lastRowFirstColumn="0" w:lastRowLastColumn="0"/>
+            <w:tcW w:w="3398" w:type="dxa"/>
+          </w:tcPr>
+          <w:p>
+            <w:pPr>
+              <w:spacing w:line="480" w:lineRule="auto"/>
+            </w:pPr>
+            <w:r>
+              <w:t>Hyper-parameter</w:t>
+            </w:r>
+          </w:p>
+        </w:tc>
+        <w:tc>
+          <w:tcPr>
+            <w:tcW w:w="2971" w:type="dxa"/>
+          </w:tcPr>
+          <w:p>
+            <w:pPr>
+              <w:spacing w:line="480" w:lineRule="auto"/>
+              <w:cnfStyle w:val="100000000000" w:firstRow="1" w:lastRow="0" w:firstColumn="0" w:lastColumn="0" w:oddVBand="0" w:evenVBand="0" w:oddHBand="0" w:evenHBand="0" w:firstRowFirstColumn="0" w:firstRowLastColumn="0" w:lastRowFirstColumn="0" w:lastRowLastColumn="0"/>
+            </w:pPr>
+            <w:r>
+              <w:t>Description</w:t>
+            </w:r>
+          </w:p>
+        </w:tc>
+        <w:tc>
+          <w:tcPr>
+            <w:tcW w:w="3207" w:type="dxa"/>
+          </w:tcPr>
+          <w:p>
+            <w:pPr>
+              <w:spacing w:line="480" w:lineRule="auto"/>
+              <w:cnfStyle w:val="100000000000" w:firstRow="1" w:lastRow="0" w:firstColumn="0" w:lastColumn="0" w:oddVBand="0" w:evenVBand="0" w:oddHBand="0" w:evenHBand="0" w:firstRowFirstColumn="0" w:firstRowLastColumn="0" w:lastRowFirstColumn="0" w:lastRowLastColumn="0"/>
+            </w:pPr>
+            <w:r>
+              <w:t>Value</w:t>
+            </w:r>
+          </w:p>
+        </w:tc>
+      </w:tr>
+      <w:tr>
+        <w:tc>
+          <w:tcPr>
+            <w:cnfStyle w:val="001000000000" w:firstRow="0" w:lastRow="0" w:firstColumn="1" w:lastColumn="0" w:oddVBand="0" w:evenVBand="0" w:oddHBand="0" w:evenHBand="0" w:firstRowFirstColumn="0" w:firstRowLastColumn="0" w:lastRowFirstColumn="0" w:lastRowLastColumn="0"/>
+            <w:tcW w:w="3398" w:type="dxa"/>
+          </w:tcPr>
+          <w:p>
+            <w:pPr>
+              <w:spacing w:line="480" w:lineRule="auto"/>
+            </w:pPr>
+            <w:r>
+              <w:t>Embedding Dimension</w:t>
+            </w:r>
+          </w:p>
+        </w:tc>
+        <w:tc>
+          <w:tcPr>
+            <w:tcW w:w="2971" w:type="dxa"/>
+          </w:tcPr>
+          <w:p>
+            <w:pPr>
+              <w:spacing w:line="480" w:lineRule="auto"/>
+              <w:cnfStyle w:val="000000000000" w:firstRow="0" w:lastRow="0" w:firstColumn="0" w:lastColumn="0" w:oddVBand="0" w:evenVBand="0" w:oddHBand="0" w:evenHBand="0" w:firstRowFirstColumn="0" w:firstRowLastColumn="0" w:lastRowFirstColumn="0" w:lastRowLastColumn="0"/>
+            </w:pPr>
+            <w:r>
+              <w:t xml:space="preserve">Size of the embedding layers used for positional embedding and embedding the state, actions, and </w:t>
+            </w:r>
+            <w:r>
+              <w:lastRenderedPageBreak/>
+              <w:t>rewards.</w:t>
+            </w:r>
+          </w:p>
+        </w:tc>
+        <w:tc>
+          <w:tcPr>
+            <w:tcW w:w="3207" w:type="dxa"/>
+          </w:tcPr>
+          <w:p>
+            <w:pPr>
+              <w:spacing w:line="480" w:lineRule="auto"/>
+              <w:cnfStyle w:val="000000000000" w:firstRow="0" w:lastRow="0" w:firstColumn="0" w:lastColumn="0" w:oddVBand="0" w:evenVBand="0" w:oddHBand="0" w:evenHBand="0" w:firstRowFirstColumn="0" w:firstRowLastColumn="0" w:lastRowFirstColumn="0" w:lastRowLastColumn="0"/>
+            </w:pPr>
+            <w:r>
+              <w:lastRenderedPageBreak/>
+              <w:t>64</w:t>
+            </w:r>
+          </w:p>
+        </w:tc>
+      </w:tr>
+      <w:tr>
+        <w:tc>
+          <w:tcPr>
+            <w:cnfStyle w:val="001000000000" w:firstRow="0" w:lastRow="0" w:firstColumn="1" w:lastColumn="0" w:oddVBand="0" w:evenVBand="0" w:oddHBand="0" w:evenHBand="0" w:firstRowFirstColumn="0" w:firstRowLastColumn="0" w:lastRowFirstColumn="0" w:lastRowLastColumn="0"/>
+            <w:tcW w:w="3398" w:type="dxa"/>
+          </w:tcPr>
+          <w:p>
+            <w:pPr>
+              <w:spacing w:line="480" w:lineRule="auto"/>
+            </w:pPr>
+            <w:r>
+              <w:t xml:space="preserve">Number of </w:t>
+            </w:r>
+            <w:r>
+              <w:t>Attention Blocks</w:t>
+            </w:r>
+          </w:p>
+        </w:tc>
+        <w:tc>
+          <w:tcPr>
+            <w:tcW w:w="2971" w:type="dxa"/>
+          </w:tcPr>
+          <w:p>
+            <w:pPr>
+              <w:spacing w:line="480" w:lineRule="auto"/>
+              <w:cnfStyle w:val="000000000000" w:firstRow="0" w:lastRow="0" w:firstColumn="0" w:lastColumn="0" w:oddVBand="0" w:evenVBand="0" w:oddHBand="0" w:evenHBand="0" w:firstRowFirstColumn="0" w:firstRowLastColumn="0" w:lastRowFirstColumn="0" w:lastRowLastColumn="0"/>
+            </w:pPr>
+            <w:r>
+              <w:t>How many “</w:t>
+            </w:r>
+            <w:proofErr w:type="gramStart"/>
+            <w:r>
+              <w:t>Attention</w:t>
+            </w:r>
+            <w:proofErr w:type="gramEnd"/>
+            <w:r>
+              <w:t xml:space="preserve">” blocks the </w:t>
+            </w:r>
+            <w:proofErr w:type="spellStart"/>
+            <w:r>
+              <w:t>Transfomer</w:t>
+            </w:r>
+            <w:proofErr w:type="spellEnd"/>
+            <w:r>
+              <w:t xml:space="preserve"> will have.</w:t>
+            </w:r>
+          </w:p>
+        </w:tc>
+        <w:tc>
+          <w:tcPr>
+            <w:tcW w:w="3207" w:type="dxa"/>
+          </w:tcPr>
+          <w:p>
+            <w:pPr>
+              <w:spacing w:line="480" w:lineRule="auto"/>
+              <w:cnfStyle w:val="000000000000" w:firstRow="0" w:lastRow="0" w:firstColumn="0" w:lastColumn="0" w:oddVBand="0" w:evenVBand="0" w:oddHBand="0" w:evenHBand="0" w:firstRowFirstColumn="0" w:firstRowLastColumn="0" w:lastRowFirstColumn="0" w:lastRowLastColumn="0"/>
+            </w:pPr>
+            <w:r>
+              <w:t>3</w:t>
+            </w:r>
+          </w:p>
+        </w:tc>
+      </w:tr>
+      <w:tr>
+        <w:tc>
+          <w:tcPr>
+            <w:cnfStyle w:val="001000000000" w:firstRow="0" w:lastRow="0" w:firstColumn="1" w:lastColumn="0" w:oddVBand="0" w:evenVBand="0" w:oddHBand="0" w:evenHBand="0" w:firstRowFirstColumn="0" w:firstRowLastColumn="0" w:lastRowFirstColumn="0" w:lastRowLastColumn="0"/>
+            <w:tcW w:w="3398" w:type="dxa"/>
+          </w:tcPr>
+          <w:p>
+            <w:pPr>
+              <w:spacing w:line="480" w:lineRule="auto"/>
+            </w:pPr>
+            <w:r>
+              <w:t>Number of Attention Heads</w:t>
+            </w:r>
+          </w:p>
+        </w:tc>
+        <w:tc>
+          <w:tcPr>
+            <w:tcW w:w="2971" w:type="dxa"/>
+          </w:tcPr>
+          <w:p>
+            <w:pPr>
+              <w:spacing w:line="480" w:lineRule="auto"/>
+              <w:cnfStyle w:val="000000000000" w:firstRow="0" w:lastRow="0" w:firstColumn="0" w:lastColumn="0" w:oddVBand="0" w:evenVBand="0" w:oddHBand="0" w:evenHBand="0" w:firstRowFirstColumn="0" w:firstRowLastColumn="0" w:lastRowFirstColumn="0" w:lastRowLastColumn="0"/>
+            </w:pPr>
+            <w:r>
+              <w:t xml:space="preserve">Number of independent </w:t>
+            </w:r>
+            <w:proofErr w:type="gramStart"/>
+            <w:r>
+              <w:t>attention</w:t>
+            </w:r>
+            <w:proofErr w:type="gramEnd"/>
+            <w:r>
+              <w:t xml:space="preserve"> heads each Attention Block in the transformer has.</w:t>
+            </w:r>
+          </w:p>
+        </w:tc>
+        <w:tc>
+          <w:tcPr>
+            <w:tcW w:w="3207" w:type="dxa"/>
+          </w:tcPr>
+          <w:p>
+            <w:pPr>
+              <w:spacing w:line="480" w:lineRule="auto"/>
+              <w:cnfStyle w:val="000000000000" w:firstRow="0" w:lastRow="0" w:firstColumn="0" w:lastColumn="0" w:oddVBand="0" w:evenVBand="0" w:oddHBand="0" w:evenHBand="0" w:firstRowFirstColumn="0" w:firstRowLastColumn="0" w:lastRowFirstColumn="0" w:lastRowLastColumn="0"/>
+            </w:pPr>
+            <w:r>
+              <w:t>4</w:t>
+            </w:r>
+          </w:p>
+        </w:tc>
+      </w:tr>
+      <w:tr>
+        <w:tc>
+          <w:tcPr>
+            <w:cnfStyle w:val="001000000000" w:firstRow="0" w:lastRow="0" w:firstColumn="1" w:lastColumn="0" w:oddVBand="0" w:evenVBand="0" w:oddHBand="0" w:evenHBand="0" w:firstRowFirstColumn="0" w:firstRowLastColumn="0" w:lastRowFirstColumn="0" w:lastRowLastColumn="0"/>
+            <w:tcW w:w="3398" w:type="dxa"/>
+          </w:tcPr>
+          <w:p>
+            <w:pPr>
+              <w:spacing w:line="480" w:lineRule="auto"/>
+            </w:pPr>
+            <w:r>
+              <w:t>Size of Attention Heads</w:t>
+            </w:r>
+          </w:p>
+        </w:tc>
+        <w:tc>
+          <w:tcPr>
+            <w:tcW w:w="2971" w:type="dxa"/>
+          </w:tcPr>
+          <w:p>
+            <w:pPr>
+              <w:spacing w:line="480" w:lineRule="auto"/>
+              <w:cnfStyle w:val="000000000000" w:firstRow="0" w:lastRow="0" w:firstColumn="0" w:lastColumn="0" w:oddVBand="0" w:evenVBand="0" w:oddHBand="0" w:evenHBand="0" w:firstRowFirstColumn="0" w:firstRowLastColumn="0" w:lastRowFirstColumn="0" w:lastRowLastColumn="0"/>
+            </w:pPr>
+            <w:r>
+              <w:t>Input size of the Attention Heads.</w:t>
+            </w:r>
+          </w:p>
+        </w:tc>
+        <w:tc>
+          <w:tcPr>
+            <w:tcW w:w="3207" w:type="dxa"/>
+          </w:tcPr>
+          <w:p>
+            <w:pPr>
+              <w:spacing w:line="480" w:lineRule="auto"/>
+              <w:cnfStyle w:val="000000000000" w:firstRow="0" w:lastRow="0" w:firstColumn="0" w:lastColumn="0" w:oddVBand="0" w:evenVBand="0" w:oddHBand="0" w:evenHBand="0" w:firstRowFirstColumn="0" w:firstRowLastColumn="0" w:lastRowFirstColumn="0" w:lastRowLastColumn="0"/>
+            </w:pPr>
+            <w:r>
+              <w:t>16</w:t>
+            </w:r>
+          </w:p>
+        </w:tc>
+      </w:tr>
+      <w:tr>
+        <w:tc>
+          <w:tcPr>
+            <w:cnfStyle w:val="001000000000" w:firstRow="0" w:lastRow="0" w:firstColumn="1" w:lastColumn="0" w:oddVBand="0" w:evenVBand="0" w:oddHBand="0" w:evenHBand="0" w:firstRowFirstColumn="0" w:firstRowLastColumn="0" w:lastRowFirstColumn="0" w:lastRowLastColumn="0"/>
+            <w:tcW w:w="3398" w:type="dxa"/>
+          </w:tcPr>
+          <w:p>
+            <w:pPr>
+              <w:spacing w:line="480" w:lineRule="auto"/>
+            </w:pPr>
+            <w:r>
+              <w:t>Dropout Rate</w:t>
+            </w:r>
+          </w:p>
+        </w:tc>
+        <w:tc>
+          <w:tcPr>
+            <w:tcW w:w="2971" w:type="dxa"/>
+          </w:tcPr>
+          <w:p>
+            <w:pPr>
+              <w:spacing w:line="480" w:lineRule="auto"/>
+              <w:cnfStyle w:val="000000000000" w:firstRow="0" w:lastRow="0" w:firstColumn="0" w:lastColumn="0" w:oddVBand="0" w:evenVBand="0" w:oddHBand="0" w:evenHBand="0" w:firstRowFirstColumn="0" w:firstRowLastColumn="0" w:lastRowFirstColumn="0" w:lastRowLastColumn="0"/>
+            </w:pPr>
+            <w:r>
+              <w:t>Dropout used for the Transformer model</w:t>
+            </w:r>
+          </w:p>
+        </w:tc>
+        <w:tc>
+          <w:tcPr>
+            <w:tcW w:w="3207" w:type="dxa"/>
+          </w:tcPr>
+          <w:p>
+            <w:pPr>
+              <w:spacing w:line="480" w:lineRule="auto"/>
+              <w:cnfStyle w:val="000000000000" w:firstRow="0" w:lastRow="0" w:firstColumn="0" w:lastColumn="0" w:oddVBand="0" w:evenVBand="0" w:oddHBand="0" w:evenHBand="0" w:firstRowFirstColumn="0" w:firstRowLastColumn="0" w:lastRowFirstColumn="0" w:lastRowLastColumn="0"/>
+            </w:pPr>
+            <w:r>
+              <w:t>0.3</w:t>
+            </w:r>
+          </w:p>
+        </w:tc>
+      </w:tr>
+      <w:tr>
+        <w:tc>
+          <w:tcPr>
+            <w:cnfStyle w:val="001000000000" w:firstRow="0" w:lastRow="0" w:firstColumn="1" w:lastColumn="0" w:oddVBand="0" w:evenVBand="0" w:oddHBand="0" w:evenHBand="0" w:firstRowFirstColumn="0" w:firstRowLastColumn="0" w:lastRowFirstColumn="0" w:lastRowLastColumn="0"/>
+            <w:tcW w:w="3398" w:type="dxa"/>
+          </w:tcPr>
+          <w:p>
+            <w:pPr>
+              <w:spacing w:line="480" w:lineRule="auto"/>
+            </w:pPr>
+            <w:r>
+              <w:t>Context Size</w:t>
+            </w:r>
+          </w:p>
+        </w:tc>
+        <w:tc>
+          <w:tcPr>
+            <w:tcW w:w="2971" w:type="dxa"/>
+          </w:tcPr>
+          <w:p>
+            <w:pPr>
+              <w:spacing w:line="480" w:lineRule="auto"/>
+              <w:cnfStyle w:val="000000000000" w:firstRow="0" w:lastRow="0" w:firstColumn="0" w:lastColumn="0" w:oddVBand="0" w:evenVBand="0" w:oddHBand="0" w:evenHBand="0" w:firstRowFirstColumn="0" w:firstRowLastColumn="0" w:lastRowFirstColumn="0" w:lastRowLastColumn="0"/>
+            </w:pPr>
+            <w:r>
+              <w:t>Number of tokens the Transformer will take as input. The maximum length of a trajectory that the system can take in the context is context size / 3 (as each entry in the sequence requires three tokens)</w:t>
+            </w:r>
+          </w:p>
+        </w:tc>
+        <w:tc>
+          <w:tcPr>
+            <w:tcW w:w="3207" w:type="dxa"/>
+          </w:tcPr>
+          <w:p>
+            <w:pPr>
+              <w:spacing w:line="480" w:lineRule="auto"/>
+              <w:cnfStyle w:val="000000000000" w:firstRow="0" w:lastRow="0" w:firstColumn="0" w:lastColumn="0" w:oddVBand="0" w:evenVBand="0" w:oddHBand="0" w:evenHBand="0" w:firstRowFirstColumn="0" w:firstRowLastColumn="0" w:lastRowFirstColumn="0" w:lastRowLastColumn="0"/>
+            </w:pPr>
+            <w:r>
+              <w:t>30</w:t>
+            </w:r>
+          </w:p>
+        </w:tc>
+      </w:tr>
+      <w:tr>
+        <w:tc>
+          <w:tcPr>
+            <w:cnfStyle w:val="001000000000" w:firstRow="0" w:lastRow="0" w:firstColumn="1" w:lastColumn="0" w:oddVBand="0" w:evenVBand="0" w:oddHBand="0" w:evenHBand="0" w:firstRowFirstColumn="0" w:firstRowLastColumn="0" w:lastRowFirstColumn="0" w:lastRowLastColumn="0"/>
+            <w:tcW w:w="3398" w:type="dxa"/>
+          </w:tcPr>
+          <w:p>
+            <w:pPr>
+              <w:spacing w:line="480" w:lineRule="auto"/>
+            </w:pPr>
+            <w:r>
+              <w:t>Batch Size</w:t>
+            </w:r>
+          </w:p>
+        </w:tc>
+        <w:tc>
+          <w:tcPr>
+            <w:tcW w:w="2971" w:type="dxa"/>
+          </w:tcPr>
+          <w:p>
+            <w:pPr>
+              <w:spacing w:line="480" w:lineRule="auto"/>
+              <w:cnfStyle w:val="000000000000" w:firstRow="0" w:lastRow="0" w:firstColumn="0" w:lastColumn="0" w:oddVBand="0" w:evenVBand="0" w:oddHBand="0" w:evenHBand="0" w:firstRowFirstColumn="0" w:firstRowLastColumn="0" w:lastRowFirstColumn="0" w:lastRowLastColumn="0"/>
+            </w:pPr>
+            <w:r>
+              <w:t xml:space="preserve">Number of sub-trajectories considered for each training </w:t>
+            </w:r>
+            <w:r>
+              <w:lastRenderedPageBreak/>
+              <w:t>loop.</w:t>
+            </w:r>
+          </w:p>
+        </w:tc>
+        <w:tc>
+          <w:tcPr>
+            <w:tcW w:w="3207" w:type="dxa"/>
+          </w:tcPr>
+          <w:p>
+            <w:pPr>
+              <w:spacing w:line="480" w:lineRule="auto"/>
+              <w:cnfStyle w:val="000000000000" w:firstRow="0" w:lastRow="0" w:firstColumn="0" w:lastColumn="0" w:oddVBand="0" w:evenVBand="0" w:oddHBand="0" w:evenHBand="0" w:firstRowFirstColumn="0" w:firstRowLastColumn="0" w:lastRowFirstColumn="0" w:lastRowLastColumn="0"/>
+            </w:pPr>
+            <w:r>
+              <w:lastRenderedPageBreak/>
+              <w:t>64</w:t>
+            </w:r>
+          </w:p>
+        </w:tc>
+      </w:tr>
+      <w:tr>
+        <w:tc>
+          <w:tcPr>
+            <w:cnfStyle w:val="001000000000" w:firstRow="0" w:lastRow="0" w:firstColumn="1" w:lastColumn="0" w:oddVBand="0" w:evenVBand="0" w:oddHBand="0" w:evenHBand="0" w:firstRowFirstColumn="0" w:firstRowLastColumn="0" w:lastRowFirstColumn="0" w:lastRowLastColumn="0"/>
+            <w:tcW w:w="3398" w:type="dxa"/>
+          </w:tcPr>
+          <w:p>
+            <w:pPr>
+              <w:spacing w:line="480" w:lineRule="auto"/>
+            </w:pPr>
+            <w:r>
+              <w:t>Learning Rate</w:t>
+            </w:r>
+          </w:p>
+        </w:tc>
+        <w:tc>
+          <w:tcPr>
+            <w:tcW w:w="2971" w:type="dxa"/>
+          </w:tcPr>
+          <w:p>
+            <w:pPr>
+              <w:spacing w:line="480" w:lineRule="auto"/>
+              <w:cnfStyle w:val="000000000000" w:firstRow="0" w:lastRow="0" w:firstColumn="0" w:lastColumn="0" w:oddVBand="0" w:evenVBand="0" w:oddHBand="0" w:evenHBand="0" w:firstRowFirstColumn="0" w:firstRowLastColumn="0" w:lastRowFirstColumn="0" w:lastRowLastColumn="0"/>
+            </w:pPr>
+          </w:p>
+        </w:tc>
+        <w:tc>
+          <w:tcPr>
+            <w:tcW w:w="3207" w:type="dxa"/>
+          </w:tcPr>
+          <w:p>
+            <w:pPr>
+              <w:spacing w:line="480" w:lineRule="auto"/>
+              <w:cnfStyle w:val="000000000000" w:firstRow="0" w:lastRow="0" w:firstColumn="0" w:lastColumn="0" w:oddVBand="0" w:evenVBand="0" w:oddHBand="0" w:evenHBand="0" w:firstRowFirstColumn="0" w:firstRowLastColumn="0" w:lastRowFirstColumn="0" w:lastRowLastColumn="0"/>
+            </w:pPr>
+            <w:r>
+              <w:t>0.0003</w:t>
+            </w:r>
+          </w:p>
+        </w:tc>
+      </w:tr>
+      <w:tr>
+        <w:tc>
+          <w:tcPr>
+            <w:cnfStyle w:val="001000000000" w:firstRow="0" w:lastRow="0" w:firstColumn="1" w:lastColumn="0" w:oddVBand="0" w:evenVBand="0" w:oddHBand="0" w:evenHBand="0" w:firstRowFirstColumn="0" w:firstRowLastColumn="0" w:lastRowFirstColumn="0" w:lastRowLastColumn="0"/>
+            <w:tcW w:w="3398" w:type="dxa"/>
+          </w:tcPr>
+          <w:p>
+            <w:pPr>
+              <w:spacing w:line="480" w:lineRule="auto"/>
+            </w:pPr>
+            <w:r>
+              <w:t>Weight Decay</w:t>
+            </w:r>
+          </w:p>
+        </w:tc>
+        <w:tc>
+          <w:tcPr>
+            <w:tcW w:w="2971" w:type="dxa"/>
+          </w:tcPr>
+          <w:p>
+            <w:pPr>
+              <w:spacing w:line="480" w:lineRule="auto"/>
+              <w:cnfStyle w:val="000000000000" w:firstRow="0" w:lastRow="0" w:firstColumn="0" w:lastColumn="0" w:oddVBand="0" w:evenVBand="0" w:oddHBand="0" w:evenHBand="0" w:firstRowFirstColumn="0" w:firstRowLastColumn="0" w:lastRowFirstColumn="0" w:lastRowLastColumn="0"/>
+            </w:pPr>
+            <w:r>
+              <w:t>Adds a penalty term proportional to the magnitude of the weights to keep them getting too large.</w:t>
+            </w:r>
+          </w:p>
+        </w:tc>
+        <w:tc>
+          <w:tcPr>
+            <w:tcW w:w="3207" w:type="dxa"/>
+          </w:tcPr>
+          <w:p>
+            <w:pPr>
+              <w:spacing w:line="480" w:lineRule="auto"/>
+              <w:cnfStyle w:val="000000000000" w:firstRow="0" w:lastRow="0" w:firstColumn="0" w:lastColumn="0" w:oddVBand="0" w:evenVBand="0" w:oddHBand="0" w:evenHBand="0" w:firstRowFirstColumn="0" w:firstRowLastColumn="0" w:lastRowFirstColumn="0" w:lastRowLastColumn="0"/>
+            </w:pPr>
+            <w:r>
+              <w:t>0.0001</w:t>
+            </w:r>
+          </w:p>
+        </w:tc>
+      </w:tr>
+      <w:tr>
+        <w:tc>
+          <w:tcPr>
+            <w:cnfStyle w:val="001000000000" w:firstRow="0" w:lastRow="0" w:firstColumn="1" w:lastColumn="0" w:oddVBand="0" w:evenVBand="0" w:oddHBand="0" w:evenHBand="0" w:firstRowFirstColumn="0" w:firstRowLastColumn="0" w:lastRowFirstColumn="0" w:lastRowLastColumn="0"/>
+            <w:tcW w:w="3398" w:type="dxa"/>
+          </w:tcPr>
+          <w:p>
+            <w:pPr>
+              <w:spacing w:line="480" w:lineRule="auto"/>
+            </w:pPr>
+            <w:r>
+              <w:t>Epochs</w:t>
+            </w:r>
+          </w:p>
+        </w:tc>
+        <w:tc>
+          <w:tcPr>
+            <w:tcW w:w="2971" w:type="dxa"/>
+          </w:tcPr>
+          <w:p>
+            <w:pPr>
+              <w:spacing w:line="480" w:lineRule="auto"/>
+              <w:cnfStyle w:val="000000000000" w:firstRow="0" w:lastRow="0" w:firstColumn="0" w:lastColumn="0" w:oddVBand="0" w:evenVBand="0" w:oddHBand="0" w:evenHBand="0" w:firstRowFirstColumn="0" w:firstRowLastColumn="0" w:lastRowFirstColumn="0" w:lastRowLastColumn="0"/>
+            </w:pPr>
+            <w:r>
+              <w:t>Number of training epochs.</w:t>
+            </w:r>
+          </w:p>
+        </w:tc>
+        <w:tc>
+          <w:tcPr>
+            <w:tcW w:w="3207" w:type="dxa"/>
+          </w:tcPr>
+          <w:p>
+            <w:pPr>
+              <w:spacing w:line="480" w:lineRule="auto"/>
+              <w:cnfStyle w:val="000000000000" w:firstRow="0" w:lastRow="0" w:firstColumn="0" w:lastColumn="0" w:oddVBand="0" w:evenVBand="0" w:oddHBand="0" w:evenHBand="0" w:firstRowFirstColumn="0" w:firstRowLastColumn="0" w:lastRowFirstColumn="0" w:lastRowLastColumn="0"/>
+            </w:pPr>
+            <w:r>
+              <w:t>200</w:t>
+            </w:r>
+          </w:p>
+        </w:tc>
+      </w:tr>
+      <w:tr>
+        <w:tc>
+          <w:tcPr>
+            <w:cnfStyle w:val="001000000000" w:firstRow="0" w:lastRow="0" w:firstColumn="1" w:lastColumn="0" w:oddVBand="0" w:evenVBand="0" w:oddHBand="0" w:evenHBand="0" w:firstRowFirstColumn="0" w:firstRowLastColumn="0" w:lastRowFirstColumn="0" w:lastRowLastColumn="0"/>
+            <w:tcW w:w="3398" w:type="dxa"/>
+          </w:tcPr>
+          <w:p>
+            <w:pPr>
+              <w:spacing w:line="480" w:lineRule="auto"/>
+            </w:pPr>
+            <w:r>
+              <w:t>Evaluation Episodes</w:t>
+            </w:r>
+          </w:p>
+        </w:tc>
+        <w:tc>
+          <w:tcPr>
+            <w:tcW w:w="2971" w:type="dxa"/>
+          </w:tcPr>
+          <w:p>
+            <w:pPr>
+              <w:spacing w:line="480" w:lineRule="auto"/>
+              <w:cnfStyle w:val="000000000000" w:firstRow="0" w:lastRow="0" w:firstColumn="0" w:lastColumn="0" w:oddVBand="0" w:evenVBand="0" w:oddHBand="0" w:evenHBand="0" w:firstRowFirstColumn="0" w:firstRowLastColumn="0" w:lastRowFirstColumn="0" w:lastRowLastColumn="0"/>
+            </w:pPr>
+            <w:r>
+              <w:t>Number of episodes to test the model against to determine best reward.</w:t>
+            </w:r>
+          </w:p>
+        </w:tc>
+        <w:tc>
+          <w:tcPr>
+            <w:tcW w:w="3207" w:type="dxa"/>
+          </w:tcPr>
+          <w:p>
+            <w:pPr>
+              <w:spacing w:line="480" w:lineRule="auto"/>
+              <w:cnfStyle w:val="000000000000" w:firstRow="0" w:lastRow="0" w:firstColumn="0" w:lastColumn="0" w:oddVBand="0" w:evenVBand="0" w:oddHBand="0" w:evenHBand="0" w:firstRowFirstColumn="0" w:firstRowLastColumn="0" w:lastRowFirstColumn="0" w:lastRowLastColumn="0"/>
+            </w:pPr>
+            <w:r>
+              <w:t>10</w:t>
+            </w:r>
+          </w:p>
+        </w:tc>
+      </w:tr>
+      <w:tr>
+        <w:tc>
+          <w:tcPr>
+            <w:cnfStyle w:val="001000000000" w:firstRow="0" w:lastRow="0" w:firstColumn="1" w:lastColumn="0" w:oddVBand="0" w:evenVBand="0" w:oddHBand="0" w:evenHBand="0" w:firstRowFirstColumn="0" w:firstRowLastColumn="0" w:lastRowFirstColumn="0" w:lastRowLastColumn="0"/>
+            <w:tcW w:w="3398" w:type="dxa"/>
+          </w:tcPr>
+          <w:p>
+            <w:pPr>
+              <w:spacing w:line="480" w:lineRule="auto"/>
+            </w:pPr>
+            <w:r>
+              <w:t>Optimizer</w:t>
+            </w:r>
+          </w:p>
+        </w:tc>
+        <w:tc>
+          <w:tcPr>
+            <w:tcW w:w="2971" w:type="dxa"/>
+          </w:tcPr>
+          <w:p>
+            <w:pPr>
+              <w:spacing w:line="480" w:lineRule="auto"/>
+              <w:cnfStyle w:val="000000000000" w:firstRow="0" w:lastRow="0" w:firstColumn="0" w:lastColumn="0" w:oddVBand="0" w:evenVBand="0" w:oddHBand="0" w:evenHBand="0" w:firstRowFirstColumn="0" w:firstRowLastColumn="0" w:lastRowFirstColumn="0" w:lastRowLastColumn="0"/>
+            </w:pPr>
+            <w:r>
+              <w:t>Used to perform gradient descent optimizer</w:t>
+            </w:r>
+          </w:p>
+        </w:tc>
+        <w:tc>
+          <w:tcPr>
+            <w:tcW w:w="3207" w:type="dxa"/>
+          </w:tcPr>
+          <w:p>
+            <w:pPr>
+              <w:spacing w:line="480" w:lineRule="auto"/>
+              <w:cnfStyle w:val="000000000000" w:firstRow="0" w:lastRow="0" w:firstColumn="0" w:lastColumn="0" w:oddVBand="0" w:evenVBand="0" w:oddHBand="0" w:evenHBand="0" w:firstRowFirstColumn="0" w:firstRowLastColumn="0" w:lastRowFirstColumn="0" w:lastRowLastColumn="0"/>
+            </w:pPr>
+            <w:proofErr w:type="spellStart"/>
+            <w:r>
+              <w:t>AdamW</w:t>
+            </w:r>
+            <w:proofErr w:type="spellEnd"/>
+          </w:p>
+        </w:tc>
+      </w:tr>
+    </w:tbl>
+    <w:p>
+      <w:pPr>
+        <w:spacing w:line="480" w:lineRule="auto"/>
+      </w:pPr>
+    </w:p>
+    <w:p>
+      <w:pPr>
+        <w:spacing w:line="480" w:lineRule="auto"/>
+      </w:pPr>
+    </w:p>
+    <w:p>
+      <w:pPr>
+        <w:spacing w:line="480" w:lineRule="auto"/>
+      </w:pPr>
+      <w:r>
+        <w:rPr>
+          <w:noProof/>
+        </w:rPr>
+        <w:lastRenderedPageBreak/>
+        <w:drawing>
+          <wp:inline distT="0" distB="0" distL="0" distR="0" wp14:anchorId="1419257A" wp14:editId="23BF642E">
+            <wp:extent cx="5853430" cy="4391025"/>
+            <wp:effectExtent l="0" t="0" r="0" b="0"/>
+            <wp:docPr id="1942210741" name="Picture 1"/>
+            <wp:cNvGraphicFramePr>
+              <a:graphicFrameLocks xmlns:a="http://schemas.openxmlformats.org/drawingml/2006/main" noChangeAspect="1"/>
+            </wp:cNvGraphicFramePr>
+            <a:graphic xmlns:a="http://schemas.openxmlformats.org/drawingml/2006/main">
+              <a:graphicData uri="http://schemas.openxmlformats.org/drawingml/2006/picture">
+                <pic:pic xmlns:pic="http://schemas.openxmlformats.org/drawingml/2006/picture">
+                  <pic:nvPicPr>
+                    <pic:cNvPr id="0" name="Picture 1"/>
+                    <pic:cNvPicPr>
+                      <a:picLocks noChangeAspect="1" noChangeArrowheads="1"/>
+                    </pic:cNvPicPr>
+                  </pic:nvPicPr>
+                  <pic:blipFill>
+                    <a:blip r:embed="rId11">
+                      <a:extLst>
+                        <a:ext uri="{28A0092B-C50C-407E-A947-70E740481C1C}">
+                          <a14:useLocalDpi xmlns:a14="http://schemas.microsoft.com/office/drawing/2010/main" val="0"/>
+                        </a:ext>
+                      </a:extLst>
+                    </a:blip>
+                    <a:srcRect/>
+                    <a:stretch>
+                      <a:fillRect/>
+                    </a:stretch>
+                  </pic:blipFill>
+                  <pic:spPr bwMode="auto">
+                    <a:xfrm>
+                      <a:off x="0" y="0"/>
+                      <a:ext cx="5853430" cy="4391025"/>
+                    </a:xfrm>
+                    <a:prstGeom prst="rect">
+                      <a:avLst/>
+                    </a:prstGeom>
+                    <a:noFill/>
+                    <a:ln>
+                      <a:noFill/>
+                    </a:ln>
+                  </pic:spPr>
+                </pic:pic>
+              </a:graphicData>
+            </a:graphic>
+          </wp:inline>
+        </w:drawing>
+      </w:r>
+    </w:p>
+    <w:p>
+      <w:pPr>
+        <w:spacing w:line="480" w:lineRule="auto"/>
+        <w:jc w:val="center"/>
+        <w:rPr>
+          <w:b/>
+        </w:rPr>
+      </w:pPr>
+      <w:r>
+        <w:rPr>
+          <w:b/>
+        </w:rPr>
+        <w:t>Output Evaluation and Interpretation</w:t>
+      </w:r>
+    </w:p>
+    <w:p>
+      <w:pPr>
+        <w:spacing w:line="480" w:lineRule="auto"/>
+        <w:ind w:firstLine="720"/>
+      </w:pPr>
+      <w:r>
+        <w:t>We evaluated the model by having it attempt the task ten times and looking for the maximum reward it achieved.</w:t>
+      </w:r>
+      <w:r>
+        <w:t xml:space="preserve"> Maximum reward was chosen to mitigate the stochastic nature of the task – the ball and target can be anywhere on the board, which could lead the model to have to try situations that are still too difficult for it to generalize to. </w:t>
+      </w:r>
+    </w:p>
+    <w:p>
+      <w:pPr>
+        <w:spacing w:line="480" w:lineRule="auto"/>
+        <w:ind w:firstLine="720"/>
+      </w:pPr>
+      <w:r>
+        <w:t>After training, the final version of the model we used achieved a maximum reward of</w:t>
+      </w:r>
+      <w:r>
+        <w:t xml:space="preserve"> 1247</w:t>
+      </w:r>
+      <w:r>
+        <w:t>.</w:t>
+      </w:r>
+    </w:p>
+    <w:p>
+      <w:pPr>
+        <w:spacing w:line="480" w:lineRule="auto"/>
+        <w:ind w:firstLine="720"/>
+      </w:pPr>
+      <w:r>
+        <w:t xml:space="preserve">Outputs from the model are not human readable – the sequence generated is a collection of high-dimensional vectors. Rather than try and interpret these directly, we recorded the model interacting with the environment and saved the results in mp4 files. These mp4 files have been </w:t>
+      </w:r>
+      <w:r>
+        <w:lastRenderedPageBreak/>
+        <w:t xml:space="preserve">included with this project’s </w:t>
+      </w:r>
+      <w:proofErr w:type="spellStart"/>
+      <w:r>
+        <w:t>github</w:t>
+      </w:r>
+      <w:proofErr w:type="spellEnd"/>
+      <w:r>
+        <w:t xml:space="preserve"> repo. We recorded four distinct interactions of the model with the environment. Snapshots from each interaction have been collated into figure 4:</w:t>
+      </w:r>
+    </w:p>
+    <w:p>
+      <w:pPr>
+        <w:spacing w:line="480" w:lineRule="auto"/>
+        <w:ind w:firstLine="720"/>
+      </w:pPr>
+    </w:p>
+    <w:p>
+      <w:pPr>
+        <w:spacing w:line="480" w:lineRule="auto"/>
+        <w:ind w:firstLine="720"/>
+      </w:pPr>
+      <w:r>
+        <w:t>&lt;FIGURE 4: SNAPSHOTS&gt;</w:t>
+      </w:r>
+    </w:p>
+    <w:p>
+      <w:pPr>
+        <w:spacing w:line="480" w:lineRule="auto"/>
+        <w:ind w:firstLine="720"/>
+      </w:pPr>
+    </w:p>
+    <w:p>
+      <w:pPr>
+        <w:spacing w:line="480" w:lineRule="auto"/>
+        <w:ind w:firstLine="720"/>
+      </w:pPr>
+      <w:r>
+        <w:t xml:space="preserve"> </w:t>
+      </w:r>
+      <w:r>
+        <w:t>While the model is still not able to consistently solve the problem, it is able to perform the key actuations that would be needed to pick up the ball itself. The largest issue is that the system is cloning the locational behavior of the example trajectories – i.e. it is performing the correct hand motions to pick up the ball and move it, but in the wrong locations. This is likely caused by the model overfitting the small number of examples we have.</w:t>
+      </w:r>
+    </w:p>
+    <w:p>
+      <w:pPr>
+        <w:spacing w:line="480" w:lineRule="auto"/>
+        <w:ind w:firstLine="720"/>
+      </w:pPr>
+      <w:r>
+        <w:t>Compared to the jerky and random responses of the untrained model, however, this version is still a significant improvement and may still be useful for some applications. We will discuss how this problem could be mitigated further in the Limitations and Future Improvements section.</w:t>
+      </w:r>
+    </w:p>
+    <w:p>
+      <w:pPr>
+        <w:spacing w:line="480" w:lineRule="auto"/>
+        <w:ind w:firstLine="720"/>
+      </w:pPr>
+    </w:p>
+    <w:p>
+      <w:pPr>
+        <w:spacing w:line="480" w:lineRule="auto"/>
+        <w:jc w:val="center"/>
+        <w:rPr>
+          <w:b/>
+        </w:rPr>
+      </w:pPr>
+      <w:r>
+        <w:rPr>
+          <w:b/>
+        </w:rPr>
+        <w:t>Ethical Considerations and Responsible Use</w:t>
+      </w:r>
+    </w:p>
+    <w:p>
+      <w:pPr>
+        <w:spacing w:line="480" w:lineRule="auto"/>
+        <w:ind w:firstLine="720"/>
+      </w:pPr>
+      <w:r>
+        <w:t>Ethical consideration…</w:t>
+      </w:r>
+    </w:p>
+    <w:p>
+      <w:pPr>
+        <w:spacing w:line="480" w:lineRule="auto"/>
+        <w:ind w:firstLine="720"/>
+      </w:pPr>
+      <w:r>
+        <w:t>Responsible use…</w:t>
+      </w:r>
+    </w:p>
+    <w:p>
+      <w:pPr>
+        <w:spacing w:line="480" w:lineRule="auto"/>
+        <w:ind w:firstLine="720"/>
+      </w:pPr>
+    </w:p>
+    <w:p>
+      <w:pPr>
+        <w:spacing w:line="480" w:lineRule="auto"/>
+        <w:jc w:val="center"/>
+        <w:rPr>
+          <w:b/>
+        </w:rPr>
+      </w:pPr>
+      <w:r>
+        <w:rPr>
+          <w:b/>
+        </w:rPr>
+        <w:t>Limitations and Future Improvements</w:t>
+      </w:r>
+    </w:p>
+    <w:p>
+      <w:pPr>
+        <w:spacing w:line="480" w:lineRule="auto"/>
+        <w:ind w:firstLine="720"/>
+      </w:pPr>
+      <w:r>
+        <w:t xml:space="preserve">As can be seen from the videos (and might be expected from the small number of full trajectories) the model has overfit the data. The primary side effect of this is that while it is </w:t>
+      </w:r>
+      <w:r>
+        <w:lastRenderedPageBreak/>
+        <w:t xml:space="preserve">performing the correct grasp action (which would be locationally invariant), it tends to perform those actions at the wrong locations. </w:t>
+      </w:r>
+    </w:p>
+    <w:p>
+      <w:pPr>
+        <w:spacing w:line="480" w:lineRule="auto"/>
+        <w:ind w:firstLine="720"/>
+      </w:pPr>
+      <w:r>
+        <w:t>One future improvement we could make would be to build a hybrid model. The system knows the positional location of the ball (it is provided as part of the observation vector), rather than allow this system to control the full action space, we could limit it to only learn the grasping action, and use a traditional approach to place the palm of the hand over top of the ball.</w:t>
+      </w:r>
+    </w:p>
+    <w:p>
+      <w:pPr>
+        <w:spacing w:line="480" w:lineRule="auto"/>
+        <w:ind w:firstLine="720"/>
+      </w:pPr>
+      <w:r>
+        <w:t>We could also take a hybrid approach to training the system. We could split the training into two phases: Phase 1 teaches it to model human actions using the algorithm presented above. In phase 2 we would refine the model using a TD-Learning or Monte Carlo approach, allowing the system to learn from own experiences interacting with the environment.</w:t>
+      </w:r>
+    </w:p>
+    <w:p>
+      <w:pPr>
+        <w:spacing w:line="480" w:lineRule="auto"/>
+        <w:ind w:firstLine="720"/>
+      </w:pPr>
+      <w:r>
+        <w:t>Finally, we could drop the Human generated data only restricted and use the large amount of synthetic data available for solving this problem. Perhaps by combining the human dataset with a synthetically generated expert dataset we can encourage the system to generalize further.</w:t>
+      </w:r>
+    </w:p>
+    <w:p>
+      <w:pPr>
+        <w:spacing w:line="480" w:lineRule="auto"/>
+      </w:pPr>
+    </w:p>
+    <w:p>
+      <w:pPr>
+        <w:spacing w:line="480" w:lineRule="auto"/>
+      </w:pPr>
+    </w:p>
+    <w:p>
+      <w:pPr>
+        <w:spacing w:line="480" w:lineRule="auto"/>
+        <w:ind w:left="720"/>
+        <w:jc w:val="center"/>
+        <w:rPr>
+          <w:b/>
+        </w:rPr>
+      </w:pPr>
+    </w:p>
+    <w:p>
+      <w:pPr>
+        <w:spacing w:line="480" w:lineRule="auto"/>
+        <w:ind w:left="720"/>
+        <w:jc w:val="center"/>
+        <w:rPr>
+          <w:b/>
+        </w:rPr>
+      </w:pPr>
+    </w:p>
+    <w:p>
+      <w:pPr>
+        <w:spacing w:line="480" w:lineRule="auto"/>
+        <w:ind w:left="720"/>
+        <w:jc w:val="center"/>
+        <w:rPr>
+          <w:b/>
+        </w:rPr>
+      </w:pPr>
+    </w:p>
+    <w:p>
+      <w:pPr>
+        <w:spacing w:line="480" w:lineRule="auto"/>
+        <w:ind w:left="720"/>
+        <w:jc w:val="center"/>
+        <w:rPr>
+          <w:b/>
+        </w:rPr>
+      </w:pPr>
+    </w:p>
+    <w:p>
+      <w:pPr>
+        <w:spacing w:line="480" w:lineRule="auto"/>
+        <w:ind w:left="720"/>
+        <w:jc w:val="center"/>
+        <w:rPr>
+          <w:b/>
+        </w:rPr>
+      </w:pPr>
+    </w:p>
+    <w:p>
+      <w:pPr>
+        <w:spacing w:line="480" w:lineRule="auto"/>
+        <w:ind w:left="720"/>
+        <w:jc w:val="center"/>
+        <w:rPr>
+          <w:b/>
+        </w:rPr>
+      </w:pPr>
+    </w:p>
+    <w:p>
+      <w:pPr>
+        <w:spacing w:line="480" w:lineRule="auto"/>
+        <w:ind w:left="720"/>
+        <w:jc w:val="center"/>
+        <w:rPr>
+          <w:b/>
+        </w:rPr>
+      </w:pPr>
+    </w:p>
+    <w:p>
+      <w:pPr>
+        <w:spacing w:line="480" w:lineRule="auto"/>
+        <w:ind w:left="720"/>
+        <w:jc w:val="center"/>
+        <w:rPr>
+          <w:b/>
+        </w:rPr>
+      </w:pPr>
+    </w:p>
+    <w:p>
+      <w:pPr>
+        <w:spacing w:line="480" w:lineRule="auto"/>
+        <w:ind w:left="720"/>
+        <w:jc w:val="center"/>
+        <w:rPr>
+          <w:b/>
+        </w:rPr>
+      </w:pPr>
+    </w:p>
+    <w:p>
+      <w:pPr>
+        <w:spacing w:line="480" w:lineRule="auto"/>
+        <w:ind w:left="720"/>
+        <w:jc w:val="center"/>
+      </w:pPr>
+      <w:r>
+        <w:rPr>
+          <w:b/>
+        </w:rPr>
+        <w:t>References</w:t>
+      </w:r>
+    </w:p>
+    <w:p>
+      <w:pPr>
+        <w:spacing w:line="480" w:lineRule="auto"/>
+        <w:ind w:left="720"/>
+      </w:pPr>
+      <w:r>
+        <w:rPr>
+          <w:lang w:val="en-CA"/>
+        </w:rPr>
+        <w:t xml:space="preserve">Andrychowicz, M., Wolski, F., Ray, A., Schneider, J., Fong, R., </w:t>
+      </w:r>
+      <w:proofErr w:type="spellStart"/>
+      <w:r>
+        <w:rPr>
+          <w:lang w:val="en-CA"/>
+        </w:rPr>
+        <w:t>Welinder</w:t>
+      </w:r>
+      <w:proofErr w:type="spellEnd"/>
+      <w:r>
+        <w:rPr>
+          <w:lang w:val="en-CA"/>
+        </w:rPr>
+        <w:t xml:space="preserve">, P., McGrew, B., Tobin, J., </w:t>
+      </w:r>
+      <w:proofErr w:type="spellStart"/>
+      <w:r>
+        <w:rPr>
+          <w:lang w:val="en-CA"/>
+        </w:rPr>
+        <w:t>Abbeel</w:t>
+      </w:r>
+      <w:proofErr w:type="spellEnd"/>
+      <w:r>
+        <w:rPr>
+          <w:lang w:val="en-CA"/>
+        </w:rPr>
+        <w:t xml:space="preserve">, P., &amp; Zaremba, W. (2017). </w:t>
+      </w:r>
+      <w:r>
+        <w:rPr>
+          <w:i/>
+          <w:iCs/>
           <w:lang w:val="en-CA"/>
         </w:rPr>
         <w:t>Hindsight experience replay</w:t>
@@ -945,7 +2410,7 @@
         </w:rPr>
         <w:t xml:space="preserve">. </w:t>
       </w:r>
-      <w:hyperlink r:id="rId9" w:tgtFrame="_blank">
+      <w:hyperlink r:id="rId12" w:tgtFrame="_blank">
         <w:r>
           <w:rPr>
             <w:rStyle w:val="Hyperlink"/>
@@ -1087,267 +2552,46 @@
     <w:p>
       <w:pPr>
         <w:spacing w:line="480" w:lineRule="auto"/>
+        <w:rPr>
+          <w:lang w:val="en-CA"/>
+        </w:rPr>
+      </w:pPr>
+    </w:p>
+    <w:p>
+      <w:pPr>
+        <w:spacing w:line="480" w:lineRule="auto"/>
         <w:ind w:left="720"/>
         <w:rPr>
           <w:lang w:val="en-CA"/>
         </w:rPr>
       </w:pPr>
-    </w:p>
-    <w:p>
-      <w:pPr>
-        <w:spacing w:line="480" w:lineRule="auto"/>
-        <w:ind w:left="720"/>
-        <w:rPr>
-          <w:lang w:val="en-CA"/>
-        </w:rPr>
-      </w:pPr>
+      <w:r>
+        <w:rPr>
+          <w:lang w:val="en-CA"/>
+        </w:rPr>
+        <w:t xml:space="preserve">Rajeswaran, Aravind, et al. ‘Learning Complex Dexterous Manipulation with Deep Reinforcement Learning and Demonstrations’. </w:t>
+      </w:r>
       <w:proofErr w:type="spellStart"/>
       <w:r>
         <w:rPr>
           <w:lang w:val="en-CA"/>
         </w:rPr>
-        <w:t>Mnih</w:t>
+        <w:t>CoRR</w:t>
       </w:r>
       <w:proofErr w:type="spellEnd"/>
       <w:r>
         <w:rPr>
           <w:lang w:val="en-CA"/>
         </w:rPr>
-        <w:t xml:space="preserve">, V., Kavukcuoglu, K., Silver, D., Rusu, A. A., Veness, J., Bellemare, M. G., Graves, A., Riedmiller, M., Fidjeland, A. K., Ostrovski, G., Petersen, S., Beattie, C., Sadik, A., </w:t>
-      </w:r>
-      <w:proofErr w:type="spellStart"/>
-      <w:r>
-        <w:rPr>
-          <w:lang w:val="en-CA"/>
-        </w:rPr>
-        <w:t>Antonoglou</w:t>
-      </w:r>
-      <w:proofErr w:type="spellEnd"/>
-      <w:r>
-        <w:rPr>
-          <w:lang w:val="en-CA"/>
-        </w:rPr>
-        <w:t xml:space="preserve">, I., King, H., Kumaran, D., </w:t>
-      </w:r>
-      <w:proofErr w:type="spellStart"/>
-      <w:r>
-        <w:rPr>
-          <w:lang w:val="en-CA"/>
-        </w:rPr>
-        <w:t>Wierstra</w:t>
-      </w:r>
-      <w:proofErr w:type="spellEnd"/>
-      <w:r>
-        <w:rPr>
-          <w:lang w:val="en-CA"/>
-        </w:rPr>
-        <w:t xml:space="preserve">, D., Legg, S., &amp; Hassabis, D. (2015). Human-level control through deep reinforcement learning. </w:t>
-      </w:r>
-      <w:r>
-        <w:rPr>
-          <w:i/>
-          <w:iCs/>
-          <w:lang w:val="en-CA"/>
-        </w:rPr>
-        <w:t>Nature</w:t>
-      </w:r>
-      <w:r>
-        <w:rPr>
-          <w:lang w:val="en-CA"/>
-        </w:rPr>
-        <w:t xml:space="preserve">, </w:t>
-      </w:r>
-      <w:r>
-        <w:rPr>
-          <w:i/>
-          <w:iCs/>
-          <w:lang w:val="en-CA"/>
-        </w:rPr>
-        <w:t>518</w:t>
-      </w:r>
-      <w:r>
-        <w:rPr>
-          <w:lang w:val="en-CA"/>
-        </w:rPr>
-        <w:t xml:space="preserve">(7540), 529–533. </w:t>
-      </w:r>
-      <w:hyperlink r:id="rId10">
-        <w:r>
-          <w:rPr>
-            <w:rStyle w:val="Hyperlink"/>
-            <w:lang w:val="en-CA"/>
-          </w:rPr>
-          <w:t>https://doi.org/10.1038/nature14236</w:t>
-        </w:r>
-      </w:hyperlink>
-    </w:p>
-    <w:p>
-      <w:pPr>
-        <w:spacing w:line="480" w:lineRule="auto"/>
-        <w:ind w:left="720"/>
-        <w:rPr>
-          <w:lang w:val="en-CA"/>
-        </w:rPr>
-      </w:pPr>
-    </w:p>
-    <w:p>
-      <w:pPr>
-        <w:spacing w:line="480" w:lineRule="auto"/>
-        <w:ind w:left="720"/>
-        <w:rPr>
-          <w:lang w:val="en-CA"/>
-        </w:rPr>
-      </w:pPr>
-      <w:r>
-        <w:rPr>
-          <w:lang w:val="en-CA"/>
-        </w:rPr>
-        <w:t xml:space="preserve">Rajeswaran, Aravind, et al. ‘Learning Complex Dexterous Manipulation with Deep Reinforcement Learning and Demonstrations’. </w:t>
-      </w:r>
-      <w:proofErr w:type="spellStart"/>
-      <w:r>
-        <w:rPr>
-          <w:lang w:val="en-CA"/>
-        </w:rPr>
-        <w:t>CoRR</w:t>
-      </w:r>
-      <w:proofErr w:type="spellEnd"/>
-      <w:r>
-        <w:rPr>
-          <w:lang w:val="en-CA"/>
-        </w:rPr>
         <w:t xml:space="preserve">, vol. abs/1709.10087, 2017, </w:t>
       </w:r>
-      <w:hyperlink r:id="rId11">
+      <w:hyperlink r:id="rId13">
         <w:r>
           <w:rPr>
             <w:rStyle w:val="Hyperlink"/>
             <w:lang w:val="en-CA"/>
           </w:rPr>
           <w:t>http://arxiv.org/abs/1709.10087</w:t>
-        </w:r>
-      </w:hyperlink>
-    </w:p>
-    <w:p>
-      <w:pPr>
-        <w:spacing w:line="480" w:lineRule="auto"/>
-        <w:ind w:left="720"/>
-        <w:rPr>
-          <w:lang w:val="en-CA"/>
-        </w:rPr>
-      </w:pPr>
-    </w:p>
-    <w:p>
-      <w:pPr>
-        <w:spacing w:line="480" w:lineRule="auto"/>
-        <w:ind w:left="720"/>
-        <w:rPr>
-          <w:lang w:val="en-CA"/>
-        </w:rPr>
-      </w:pPr>
-      <w:r>
-        <w:rPr>
-          <w:lang w:val="en-CA"/>
-        </w:rPr>
-        <w:lastRenderedPageBreak/>
-        <w:t xml:space="preserve">Schaul, T., Quan, J., </w:t>
-      </w:r>
-      <w:proofErr w:type="spellStart"/>
-      <w:r>
-        <w:rPr>
-          <w:lang w:val="en-CA"/>
-        </w:rPr>
-        <w:t>Antonoglou</w:t>
-      </w:r>
-      <w:proofErr w:type="spellEnd"/>
-      <w:r>
-        <w:rPr>
-          <w:lang w:val="en-CA"/>
-        </w:rPr>
-        <w:t xml:space="preserve">, I., &amp; Silver, D. (2016). </w:t>
-      </w:r>
-      <w:r>
-        <w:rPr>
-          <w:i/>
-          <w:iCs/>
-          <w:lang w:val="en-CA"/>
-        </w:rPr>
-        <w:t>Prioritized experience replay</w:t>
-      </w:r>
-      <w:r>
-        <w:rPr>
-          <w:lang w:val="en-CA"/>
-        </w:rPr>
-        <w:t xml:space="preserve">. Proceedings of the 4th International Conference on Learning Representations (ICLR). </w:t>
-      </w:r>
-      <w:hyperlink r:id="rId12" w:tgtFrame="_blank">
-        <w:r>
-          <w:rPr>
-            <w:rStyle w:val="Hyperlink"/>
-            <w:lang w:val="en-CA"/>
-          </w:rPr>
-          <w:t>https://doi.org/10.48550/arXiv.1511.05952</w:t>
-        </w:r>
-      </w:hyperlink>
-    </w:p>
-    <w:p>
-      <w:pPr>
-        <w:spacing w:line="480" w:lineRule="auto"/>
-        <w:ind w:left="720"/>
-        <w:rPr>
-          <w:lang w:val="en-CA"/>
-        </w:rPr>
-      </w:pPr>
-    </w:p>
-    <w:p>
-      <w:pPr>
-        <w:spacing w:line="480" w:lineRule="auto"/>
-        <w:ind w:left="720"/>
-        <w:rPr>
-          <w:lang w:val="en-CA"/>
-        </w:rPr>
-      </w:pPr>
-      <w:r>
-        <w:rPr>
-          <w:lang w:val="en-CA"/>
-        </w:rPr>
-        <w:t xml:space="preserve">Schulman, J., Wolski, F., Dhariwal, P., Radford, A., &amp; Klimov, O. (2017). </w:t>
-      </w:r>
-      <w:r>
-        <w:rPr>
-          <w:i/>
-          <w:iCs/>
-          <w:lang w:val="en-CA"/>
-        </w:rPr>
-        <w:t>Proximal Policy Optimization Algorithms</w:t>
-      </w:r>
-      <w:r>
-        <w:rPr>
-          <w:lang w:val="en-CA"/>
-        </w:rPr>
-        <w:t xml:space="preserve">. </w:t>
-      </w:r>
-      <w:proofErr w:type="spellStart"/>
-      <w:r>
-        <w:rPr>
-          <w:lang w:val="en-CA"/>
-        </w:rPr>
-        <w:t>arXiv</w:t>
-      </w:r>
-      <w:proofErr w:type="spellEnd"/>
-      <w:r>
-        <w:rPr>
-          <w:lang w:val="en-CA"/>
-        </w:rPr>
-        <w:t xml:space="preserve">. </w:t>
-      </w:r>
-      <w:hyperlink r:id="rId13" w:tgtFrame="_blank">
-        <w:r>
-          <w:rPr>
-            <w:rStyle w:val="Hyperlink"/>
-            <w:lang w:val="en-CA"/>
-          </w:rPr>
-          <w:t>https://doi.org/10.48550/arXiv.1707.06347</w:t>
         </w:r>
       </w:hyperlink>
     </w:p>
@@ -1456,33 +2700,6 @@
           <w:t>https://doi.org/10.48550/arXiv.1706.03762</w:t>
         </w:r>
       </w:hyperlink>
-    </w:p>
-    <w:p>
-      <w:pPr>
-        <w:spacing w:line="480" w:lineRule="auto"/>
-        <w:ind w:left="720"/>
-        <w:rPr>
-          <w:lang w:val="en-CA"/>
-        </w:rPr>
-      </w:pPr>
-    </w:p>
-    <w:p>
-      <w:pPr>
-        <w:spacing w:line="480" w:lineRule="auto"/>
-        <w:ind w:left="720"/>
-        <w:rPr>
-          <w:lang w:val="en-CA"/>
-        </w:rPr>
-      </w:pPr>
-    </w:p>
-    <w:p>
-      <w:pPr>
-        <w:spacing w:line="480" w:lineRule="auto"/>
-        <w:ind w:left="720"/>
-        <w:rPr>
-          <w:lang w:val="en-CA"/>
-        </w:rPr>
-      </w:pPr>
     </w:p>
     <w:p>
       <w:pPr>
@@ -1538,6 +2755,66 @@
       <w:r>
         <w:continuationSeparator/>
       </w:r>
+    </w:p>
+  </w:footnote>
+  <w:footnote w:id="1">
+    <w:p>
+      <w:pPr>
+        <w:pStyle w:val="FootnoteText"/>
+        <w:rPr>
+          <w:lang w:val="en-CA"/>
+        </w:rPr>
+      </w:pPr>
+      <w:r>
+        <w:rPr>
+          <w:rStyle w:val="FootnoteReference"/>
+        </w:rPr>
+        <w:footnoteRef/>
+      </w:r>
+      <w:r>
+        <w:t xml:space="preserve"> </w:t>
+      </w:r>
+      <w:proofErr w:type="spellStart"/>
+      <w:r>
+        <w:t>CyberGlove</w:t>
+      </w:r>
+      <w:proofErr w:type="spellEnd"/>
+      <w:r>
+        <w:t xml:space="preserve"> III</w:t>
+      </w:r>
+      <w:r>
+        <w:t xml:space="preserve"> </w:t>
+      </w:r>
+      <w:hyperlink r:id="rId1" w:history="1">
+        <w:proofErr w:type="spellStart"/>
+        <w:r>
+          <w:rPr>
+            <w:rStyle w:val="Hyperlink"/>
+          </w:rPr>
+          <w:t>CyberGlove</w:t>
+        </w:r>
+        <w:proofErr w:type="spellEnd"/>
+        <w:r>
+          <w:rPr>
+            <w:rStyle w:val="Hyperlink"/>
+          </w:rPr>
+          <w:t xml:space="preserve"> III — </w:t>
+        </w:r>
+        <w:proofErr w:type="spellStart"/>
+        <w:r>
+          <w:rPr>
+            <w:rStyle w:val="Hyperlink"/>
+          </w:rPr>
+          <w:t>CyberGlove</w:t>
+        </w:r>
+        <w:proofErr w:type="spellEnd"/>
+        <w:r>
+          <w:rPr>
+            <w:rStyle w:val="Hyperlink"/>
+          </w:rPr>
+          <w:t xml:space="preserve"> Systems LLC</w:t>
+        </w:r>
+      </w:hyperlink>
     </w:p>
   </w:footnote>
 </w:footnotes>
@@ -1981,6 +3258,92 @@
     </w:lvl>
   </w:abstractNum>
   <w:abstractNum w:abstractNumId="2" w15:restartNumberingAfterBreak="0">
+    <w:nsid w:val="64624813"/>
+    <w:multiLevelType w:val="hybridMultilevel"/>
+    <w:tmpl w:val="97205110"/>
+    <w:lvl w:ilvl="0" w:tplc="1009000F">
+      <w:start w:val="1"/>
+      <w:numFmt w:val="decimal"/>
+      <w:lvlText w:val="%1."/>
+      <w:lvlJc w:val="left"/>
+      <w:pPr>
+        <w:ind w:left="720" w:hanging="360"/>
+      </w:pPr>
+    </w:lvl>
+    <w:lvl w:ilvl="1" w:tplc="10090019" w:tentative="1">
+      <w:start w:val="1"/>
+      <w:numFmt w:val="lowerLetter"/>
+      <w:lvlText w:val="%2."/>
+      <w:lvlJc w:val="left"/>
+      <w:pPr>
+        <w:ind w:left="1440" w:hanging="360"/>
+      </w:pPr>
+    </w:lvl>
+    <w:lvl w:ilvl="2" w:tplc="1009001B" w:tentative="1">
+      <w:start w:val="1"/>
+      <w:numFmt w:val="lowerRoman"/>
+      <w:lvlText w:val="%3."/>
+      <w:lvlJc w:val="right"/>
+      <w:pPr>
+        <w:ind w:left="2160" w:hanging="180"/>
+      </w:pPr>
+    </w:lvl>
+    <w:lvl w:ilvl="3" w:tplc="1009000F" w:tentative="1">
+      <w:start w:val="1"/>
+      <w:numFmt w:val="decimal"/>
+      <w:lvlText w:val="%4."/>
+      <w:lvlJc w:val="left"/>
+      <w:pPr>
+        <w:ind w:left="2880" w:hanging="360"/>
+      </w:pPr>
+    </w:lvl>
+    <w:lvl w:ilvl="4" w:tplc="10090019" w:tentative="1">
+      <w:start w:val="1"/>
+      <w:numFmt w:val="lowerLetter"/>
+      <w:lvlText w:val="%5."/>
+      <w:lvlJc w:val="left"/>
+      <w:pPr>
+        <w:ind w:left="3600" w:hanging="360"/>
+      </w:pPr>
+    </w:lvl>
+    <w:lvl w:ilvl="5" w:tplc="1009001B" w:tentative="1">
+      <w:start w:val="1"/>
+      <w:numFmt w:val="lowerRoman"/>
+      <w:lvlText w:val="%6."/>
+      <w:lvlJc w:val="right"/>
+      <w:pPr>
+        <w:ind w:left="4320" w:hanging="180"/>
+      </w:pPr>
+    </w:lvl>
+    <w:lvl w:ilvl="6" w:tplc="1009000F" w:tentative="1">
+      <w:start w:val="1"/>
+      <w:numFmt w:val="decimal"/>
+      <w:lvlText w:val="%7."/>
+      <w:lvlJc w:val="left"/>
+      <w:pPr>
+        <w:ind w:left="5040" w:hanging="360"/>
+      </w:pPr>
+    </w:lvl>
+    <w:lvl w:ilvl="7" w:tplc="10090019" w:tentative="1">
+      <w:start w:val="1"/>
+      <w:numFmt w:val="lowerLetter"/>
+      <w:lvlText w:val="%8."/>
+      <w:lvlJc w:val="left"/>
+      <w:pPr>
+        <w:ind w:left="5760" w:hanging="360"/>
+      </w:pPr>
+    </w:lvl>
+    <w:lvl w:ilvl="8" w:tplc="1009001B" w:tentative="1">
+      <w:start w:val="1"/>
+      <w:numFmt w:val="lowerRoman"/>
+      <w:lvlText w:val="%9."/>
+      <w:lvlJc w:val="right"/>
+      <w:pPr>
+        <w:ind w:left="6480" w:hanging="180"/>
+      </w:pPr>
+    </w:lvl>
+  </w:abstractNum>
+  <w:abstractNum w:abstractNumId="3" w15:restartNumberingAfterBreak="0">
     <w:nsid w:val="74EF516E"/>
     <w:multiLevelType w:val="multilevel"/>
     <w:tmpl w:val="5DC6DD5A"/>
@@ -2109,6 +3472,9 @@
     <w:abstractNumId w:val="0"/>
   </w:num>
   <w:num w:numId="3" w16cid:durableId="82992955">
+    <w:abstractNumId w:val="3"/>
+  </w:num>
+  <w:num w:numId="4" w16cid:durableId="193033209">
     <w:abstractNumId w:val="2"/>
   </w:num>
 </w:numbering>
@@ -2632,7 +3998,6 @@
   <w:style w:type="character" w:default="1" w:styleId="DefaultParagraphFont">
     <w:name w:val="Default Paragraph Font"/>
     <w:uiPriority w:val="1"/>
-    <w:semiHidden/>
     <w:unhideWhenUsed/>
   </w:style>
   <w:style w:type="table" w:default="1" w:styleId="TableNormal">
@@ -2794,6 +4159,130 @@
   <w:style w:type="paragraph" w:styleId="Header">
     <w:name w:val="header"/>
     <w:basedOn w:val="HeaderandFooter"/>
+  </w:style>
+  <w:style w:type="paragraph" w:styleId="NormalWeb">
+    <w:name w:val="Normal (Web)"/>
+    <w:basedOn w:val="Normal"/>
+    <w:uiPriority w:val="99"/>
+    <w:semiHidden/>
+    <w:unhideWhenUsed/>
+    <w:rsid w:val="00564C36"/>
+  </w:style>
+  <w:style w:type="paragraph" w:styleId="FootnoteText">
+    <w:name w:val="footnote text"/>
+    <w:basedOn w:val="Normal"/>
+    <w:link w:val="FootnoteTextChar"/>
+    <w:uiPriority w:val="99"/>
+    <w:semiHidden/>
+    <w:unhideWhenUsed/>
+    <w:rsid w:val="008C351E"/>
+    <w:rPr>
+      <w:sz w:val="20"/>
+      <w:szCs w:val="20"/>
+    </w:rPr>
+  </w:style>
+  <w:style w:type="character" w:customStyle="1" w:styleId="FootnoteTextChar">
+    <w:name w:val="Footnote Text Char"/>
+    <w:basedOn w:val="DefaultParagraphFont"/>
+    <w:link w:val="FootnoteText"/>
+    <w:uiPriority w:val="99"/>
+    <w:semiHidden/>
+    <w:rsid w:val="008C351E"/>
+    <w:rPr>
+      <w:sz w:val="20"/>
+      <w:szCs w:val="20"/>
+    </w:rPr>
+  </w:style>
+  <w:style w:type="character" w:styleId="FootnoteReference">
+    <w:name w:val="footnote reference"/>
+    <w:basedOn w:val="DefaultParagraphFont"/>
+    <w:uiPriority w:val="99"/>
+    <w:semiHidden/>
+    <w:unhideWhenUsed/>
+    <w:rsid w:val="008C351E"/>
+    <w:rPr>
+      <w:vertAlign w:val="superscript"/>
+    </w:rPr>
+  </w:style>
+  <w:style w:type="character" w:styleId="PlaceholderText">
+    <w:name w:val="Placeholder Text"/>
+    <w:basedOn w:val="DefaultParagraphFont"/>
+    <w:uiPriority w:val="99"/>
+    <w:semiHidden/>
+    <w:rsid w:val="001A4535"/>
+    <w:rPr>
+      <w:color w:val="666666"/>
+    </w:rPr>
+  </w:style>
+  <w:style w:type="table" w:styleId="TableGrid">
+    <w:name w:val="Table Grid"/>
+    <w:basedOn w:val="TableNormal"/>
+    <w:uiPriority w:val="39"/>
+    <w:rsid w:val="001662A7"/>
+    <w:tblPr>
+      <w:tblBorders>
+        <w:top w:val="single" w:sz="4" w:space="0" w:color="auto"/>
+        <w:left w:val="single" w:sz="4" w:space="0" w:color="auto"/>
+        <w:bottom w:val="single" w:sz="4" w:space="0" w:color="auto"/>
+        <w:right w:val="single" w:sz="4" w:space="0" w:color="auto"/>
+        <w:insideH w:val="single" w:sz="4" w:space="0" w:color="auto"/>
+        <w:insideV w:val="single" w:sz="4" w:space="0" w:color="auto"/>
+      </w:tblBorders>
+    </w:tblPr>
+  </w:style>
+  <w:style w:type="table" w:styleId="GridTable1Light">
+    <w:name w:val="Grid Table 1 Light"/>
+    <w:basedOn w:val="TableNormal"/>
+    <w:uiPriority w:val="46"/>
+    <w:rsid w:val="001662A7"/>
+    <w:tblPr>
+      <w:tblStyleRowBandSize w:val="1"/>
+      <w:tblStyleColBandSize w:val="1"/>
+      <w:tblBorders>
+        <w:top w:val="single" w:sz="4" w:space="0" w:color="999999" w:themeColor="text1" w:themeTint="66"/>
+        <w:left w:val="single" w:sz="4" w:space="0" w:color="999999" w:themeColor="text1" w:themeTint="66"/>
+        <w:bottom w:val="single" w:sz="4" w:space="0" w:color="999999" w:themeColor="text1" w:themeTint="66"/>
+        <w:right w:val="single" w:sz="4" w:space="0" w:color="999999" w:themeColor="text1" w:themeTint="66"/>
+        <w:insideH w:val="single" w:sz="4" w:space="0" w:color="999999" w:themeColor="text1" w:themeTint="66"/>
+        <w:insideV w:val="single" w:sz="4" w:space="0" w:color="999999" w:themeColor="text1" w:themeTint="66"/>
+      </w:tblBorders>
+    </w:tblPr>
+    <w:tblStylePr w:type="firstRow">
+      <w:rPr>
+        <w:b/>
+        <w:bCs/>
+      </w:rPr>
+      <w:tblPr/>
+      <w:tcPr>
+        <w:tcBorders>
+          <w:bottom w:val="single" w:sz="12" w:space="0" w:color="666666" w:themeColor="text1" w:themeTint="99"/>
+        </w:tcBorders>
+      </w:tcPr>
+    </w:tblStylePr>
+    <w:tblStylePr w:type="lastRow">
+      <w:rPr>
+        <w:b/>
+        <w:bCs/>
+      </w:rPr>
+      <w:tblPr/>
+      <w:tcPr>
+        <w:tcBorders>
+          <w:top w:val="double" w:sz="2" w:space="0" w:color="666666" w:themeColor="text1" w:themeTint="99"/>
+        </w:tcBorders>
+      </w:tcPr>
+    </w:tblStylePr>
+    <w:tblStylePr w:type="firstCol">
+      <w:rPr>
+        <w:b/>
+        <w:bCs/>
+      </w:rPr>
+    </w:tblStylePr>
+    <w:tblStylePr w:type="lastCol">
+      <w:rPr>
+        <w:b/>
+        <w:bCs/>
+      </w:rPr>
+    </w:tblStylePr>
   </w:style>
 </w:styles>
 </file>
@@ -2970,4 +4459,16 @@
   <a:objectDefaults/>
   <a:extraClrSchemeLst/>
 </a:theme>
+</file>
+
+<file path=customXml/item1.xml><?xml version="1.0" encoding="utf-8"?>
+<b:Sources xmlns:b="http://schemas.openxmlformats.org/officeDocument/2006/bibliography" xmlns="http://schemas.openxmlformats.org/officeDocument/2006/bibliography" SelectedStyle="\APASixthEditionOfficeOnline.xsl" StyleName="APA" Version="6"/>
+</file>
+
+<file path=customXml/itemProps1.xml><?xml version="1.0" encoding="utf-8"?>
+<ds:datastoreItem xmlns:ds="http://schemas.openxmlformats.org/officeDocument/2006/customXml" ds:itemID="{896C77D9-2CAE-47A9-ABE4-4AEDC748AE1B}">
+  <ds:schemaRefs>
+    <ds:schemaRef ds:uri="http://schemas.openxmlformats.org/officeDocument/2006/bibliography"/>
+  </ds:schemaRefs>
+</ds:datastoreItem>
 </file>
</xml_diff>

<commit_message>
(update): added images to report
</commit_message>
<xml_diff>
--- a/Generative_AI_Analysis_Report.docx
+++ b/Generative_AI_Analysis_Report.docx
@@ -105,7 +105,13 @@
         <w:ind w:firstLine="720"/>
       </w:pPr>
       <w:r>
-        <w:t>This project looks at applying Transformer architecture to generate trajectories to solve the ADROIT Hand Relocate Reinforcement Learning problem. We will approach this problem using the human generated trajectories in D4RL dataset. We’ll explain this dataset how our model design was done, as well as our training approach. We will also cover the various methods we employed to work around the limited number of trajectories available in the dataset. Finally, we’ll discuss ethical / bias considerations for this model and future steps for improvement.</w:t>
+        <w:t xml:space="preserve">This project looks at applying </w:t>
+      </w:r>
+      <w:r>
+        <w:t xml:space="preserve">Generative AI Techniques via the </w:t>
+      </w:r>
+      <w:r>
+        <w:t>Transformer architecture to generate trajectories to solve the ADROIT Hand Relocate Reinforcement Learning problem. We will approach this problem using the human generated trajectories in D4RL dataset. We’ll explain this dataset how our model design was done, as well as our training approach. We will also cover the various methods we employed to work around the limited number of trajectories available in the dataset. Finally, we’ll discuss ethical / bias considerations for this model and future steps for improvement.</w:t>
       </w:r>
     </w:p>
     <w:p>
@@ -116,6 +122,9 @@
         <w:jc w:val="center"/>
       </w:pPr>
       <w:r>
+        <w:rPr>
+          <w:noProof/>
+        </w:rPr>
         <w:drawing>
           <wp:inline distT="0" distB="0" distL="0" distR="0" wp14:anchorId="40D55FB6" wp14:editId="1861F04B">
             <wp:extent cx="2604138" cy="2577402"/>
@@ -249,11 +258,11 @@
       </w:r>
       <w:proofErr w:type="spellEnd"/>
       <w:r>
-        <w:t xml:space="preserve"> robotic hand is tasked with picking up a small ball off a table and placing it down at a target location.  We control the hand by providing a sequence of joint angles for each of the actuators as well as positional / rotational angles for the hand’s overall location in the world. For this problem, the </w:t>
+        <w:t xml:space="preserve"> robotic hand is tasked with picking up a small ball off a table and placing it down at a target location.  We control the hand by providing a sequence of joint angles for each of the actuators as well as </w:t>
       </w:r>
       <w:r>
         <w:lastRenderedPageBreak/>
-        <w:t xml:space="preserve">D4RL group collected 25 human generated trajectories using a virtual environment combined with a </w:t>
+        <w:t xml:space="preserve">positional / rotational angles for the hand’s overall location in the world. For this problem, the D4RL group collected 25 human generated trajectories using a virtual environment combined with a </w:t>
       </w:r>
       <w:proofErr w:type="spellStart"/>
       <w:r>
@@ -436,6 +445,7 @@
         <w:spacing w:line="480" w:lineRule="auto"/>
       </w:pPr>
       <w:r>
+        <w:lastRenderedPageBreak/>
         <w:t>Increase negative reward the further the hand is from the ball.</w:t>
       </w:r>
     </w:p>
@@ -449,7 +459,6 @@
         <w:spacing w:line="480" w:lineRule="auto"/>
       </w:pPr>
       <w:r>
-        <w:lastRenderedPageBreak/>
         <w:t>A reward of 1 if the ball is off the table.</w:t>
       </w:r>
     </w:p>
@@ -818,13 +827,7 @@
                 <w:rPr>
                   <w:rFonts w:ascii="Cambria Math" w:hAnsi="Cambria Math"/>
                 </w:rPr>
-                <m:t>3</m:t>
-              </m:r>
-              <m:r>
-                <w:rPr>
-                  <w:rFonts w:ascii="Cambria Math" w:hAnsi="Cambria Math"/>
-                </w:rPr>
-                <m:t xml:space="preserve">, </m:t>
+                <m:t xml:space="preserve">3, </m:t>
               </m:r>
             </m:sub>
           </m:sSub>
@@ -920,13 +923,7 @@
                 <w:rPr>
                   <w:rFonts w:ascii="Cambria Math" w:hAnsi="Cambria Math"/>
                 </w:rPr>
-                <m:t>N</m:t>
-              </m:r>
-              <m:r>
-                <w:rPr>
-                  <w:rFonts w:ascii="Cambria Math" w:hAnsi="Cambria Math"/>
-                </w:rPr>
-                <m:t xml:space="preserve">, </m:t>
+                <m:t xml:space="preserve">N, </m:t>
               </m:r>
             </m:sub>
           </m:sSub>
@@ -971,14 +968,11 @@
         <w:ind w:firstLine="720"/>
       </w:pPr>
       <w:r>
+        <w:lastRenderedPageBreak/>
         <w:t xml:space="preserve">The Decisions Transformer uses the underlying Transformer to predict the next action </w:t>
       </w:r>
       <w:r>
-        <w:t xml:space="preserve">and return in the sequence. We use the action to generate the next state from the environment. </w:t>
-      </w:r>
-      <w:r>
-        <w:lastRenderedPageBreak/>
-        <w:t>Predicted returns are only used during the training phase as part of the loss function. Once we have the action, state, and true return we append these to our context window and feed the new sequence back into the Decision Transformer to generate the next steps in our policy.</w:t>
+        <w:t>and return in the sequence. We use the action to generate the next state from the environment. Predicted returns are only used during the training phase as part of the loss function. Once we have the action, state, and true return we append these to our context window and feed the new sequence back into the Decision Transformer to generate the next steps in our policy.</w:t>
       </w:r>
     </w:p>
     <w:p>
@@ -1044,6 +1038,26 @@
     </w:p>
     <w:p>
       <w:pPr>
+        <w:pStyle w:val="Caption"/>
+        <w:jc w:val="center"/>
+      </w:pPr>
+      <w:r>
+        <w:t xml:space="preserve">Figure </w:t>
+      </w:r>
+      <w:fldSimple w:instr=" SEQ Figure \* ARABIC ">
+        <w:r>
+          <w:rPr>
+            <w:noProof/>
+          </w:rPr>
+          <w:t>2</w:t>
+        </w:r>
+      </w:fldSimple>
+      <w:r>
+        <w:t xml:space="preserve"> Decision Transformer</w:t>
+      </w:r>
+    </w:p>
+    <w:p>
+      <w:pPr>
         <w:spacing w:line="480" w:lineRule="auto"/>
       </w:pPr>
       <w:r>
@@ -1090,6 +1104,7 @@
         <w:spacing w:line="480" w:lineRule="auto"/>
       </w:pPr>
       <w:r>
+        <w:lastRenderedPageBreak/>
         <w:t xml:space="preserve">We used Hindsight Experience Replay </w:t>
       </w:r>
       <w:r>
@@ -1111,11 +1126,7 @@
         <w:t xml:space="preserve"> </w:t>
       </w:r>
       <w:r>
-        <w:t xml:space="preserve">We do this in two stages. In stage 1 we extract milestones from the sub-trajectory: Is the ball near the </w:t>
-      </w:r>
-      <w:r>
-        <w:lastRenderedPageBreak/>
-        <w:t xml:space="preserve">hand? Is the ball near the target? In stage 2, </w:t>
+        <w:t xml:space="preserve">We do this in two stages. In stage 1 we extract milestones from the sub-trajectory: Is the ball near the hand? Is the ball near the target? In stage 2, </w:t>
       </w:r>
       <w:r>
         <w:t xml:space="preserve">if a milestone was predicted in the previous stage, then </w:t>
@@ -1416,11 +1427,11 @@
               <w:cnfStyle w:val="000000000000" w:firstRow="0" w:lastRow="0" w:firstColumn="0" w:lastColumn="0" w:oddVBand="0" w:evenVBand="0" w:oddHBand="0" w:evenHBand="0" w:firstRowFirstColumn="0" w:firstRowLastColumn="0" w:lastRowFirstColumn="0" w:lastRowLastColumn="0"/>
             </w:pPr>
             <w:r>
-              <w:t xml:space="preserve">Size of the embedding layers used for positional embedding and embedding the state, actions, and </w:t>
+              <w:t xml:space="preserve">Size of the embedding </w:t>
             </w:r>
             <w:r>
               <w:lastRenderedPageBreak/>
-              <w:t>rewards.</w:t>
+              <w:t>layers used for positional embedding and embedding the state, actions, and rewards.</w:t>
             </w:r>
           </w:p>
         </w:tc>
@@ -1468,15 +1479,7 @@
               <w:cnfStyle w:val="000000000000" w:firstRow="0" w:lastRow="0" w:firstColumn="0" w:lastColumn="0" w:oddVBand="0" w:evenVBand="0" w:oddHBand="0" w:evenHBand="0" w:firstRowFirstColumn="0" w:firstRowLastColumn="0" w:lastRowFirstColumn="0" w:lastRowLastColumn="0"/>
             </w:pPr>
             <w:r>
-              <w:t>How many “</w:t>
-            </w:r>
-            <w:proofErr w:type="gramStart"/>
-            <w:r>
-              <w:t>Attention</w:t>
-            </w:r>
-            <w:proofErr w:type="gramEnd"/>
-            <w:r>
-              <w:t xml:space="preserve">” blocks the </w:t>
+              <w:t xml:space="preserve">How many “Attention” blocks the </w:t>
             </w:r>
             <w:proofErr w:type="spellStart"/>
             <w:r>
@@ -1528,15 +1531,7 @@
               <w:cnfStyle w:val="000000000000" w:firstRow="0" w:lastRow="0" w:firstColumn="0" w:lastColumn="0" w:oddVBand="0" w:evenVBand="0" w:oddHBand="0" w:evenHBand="0" w:firstRowFirstColumn="0" w:firstRowLastColumn="0" w:lastRowFirstColumn="0" w:lastRowLastColumn="0"/>
             </w:pPr>
             <w:r>
-              <w:t xml:space="preserve">Number of independent </w:t>
-            </w:r>
-            <w:proofErr w:type="gramStart"/>
-            <w:r>
-              <w:t>attention</w:t>
-            </w:r>
-            <w:proofErr w:type="gramEnd"/>
-            <w:r>
-              <w:t xml:space="preserve"> heads each Attention Block in the transformer has.</w:t>
+              <w:t>Number of independent attention heads each Attention Block in the transformer has.</w:t>
             </w:r>
           </w:p>
         </w:tc>
@@ -1668,7 +1663,11 @@
               <w:cnfStyle w:val="000000000000" w:firstRow="0" w:lastRow="0" w:firstColumn="0" w:lastColumn="0" w:oddVBand="0" w:evenVBand="0" w:oddHBand="0" w:evenHBand="0" w:firstRowFirstColumn="0" w:firstRowLastColumn="0" w:lastRowFirstColumn="0" w:lastRowLastColumn="0"/>
             </w:pPr>
             <w:r>
-              <w:t>Number of tokens the Transformer will take as input. The maximum length of a trajectory that the system can take in the context is context size / 3 (as each entry in the sequence requires three tokens)</w:t>
+              <w:t xml:space="preserve">Number of tokens the Transformer will take as input. The maximum length of a trajectory that the system can take in the context is context size / 3 (as each entry in the sequence requires three </w:t>
+            </w:r>
+            <w:r>
+              <w:lastRenderedPageBreak/>
+              <w:t>tokens)</w:t>
             </w:r>
           </w:p>
         </w:tc>
@@ -1682,6 +1681,7 @@
               <w:cnfStyle w:val="000000000000" w:firstRow="0" w:lastRow="0" w:firstColumn="0" w:lastColumn="0" w:oddVBand="0" w:evenVBand="0" w:oddHBand="0" w:evenHBand="0" w:firstRowFirstColumn="0" w:firstRowLastColumn="0" w:lastRowFirstColumn="0" w:lastRowLastColumn="0"/>
             </w:pPr>
             <w:r>
+              <w:lastRenderedPageBreak/>
               <w:t>30</w:t>
             </w:r>
           </w:p>
@@ -1712,11 +1712,7 @@
               <w:cnfStyle w:val="000000000000" w:firstRow="0" w:lastRow="0" w:firstColumn="0" w:lastColumn="0" w:oddVBand="0" w:evenVBand="0" w:oddHBand="0" w:evenHBand="0" w:firstRowFirstColumn="0" w:firstRowLastColumn="0" w:lastRowFirstColumn="0" w:lastRowLastColumn="0"/>
             </w:pPr>
             <w:r>
-              <w:t xml:space="preserve">Number of sub-trajectories considered for each training </w:t>
-            </w:r>
-            <w:r>
-              <w:lastRenderedPageBreak/>
-              <w:t>loop.</w:t>
+              <w:t>Number of sub-trajectories considered for each training loop.</w:t>
             </w:r>
           </w:p>
         </w:tc>
@@ -1730,7 +1726,6 @@
               <w:cnfStyle w:val="000000000000" w:firstRow="0" w:lastRow="0" w:firstColumn="0" w:lastColumn="0" w:oddVBand="0" w:evenVBand="0" w:oddHBand="0" w:evenHBand="0" w:firstRowFirstColumn="0" w:firstRowLastColumn="0" w:lastRowFirstColumn="0" w:lastRowLastColumn="0"/>
             </w:pPr>
             <w:r>
-              <w:lastRenderedPageBreak/>
               <w:t>64</w:t>
             </w:r>
           </w:p>
@@ -1968,6 +1963,7 @@
     </w:p>
     <w:p>
       <w:pPr>
+        <w:keepNext/>
         <w:spacing w:line="480" w:lineRule="auto"/>
       </w:pPr>
       <w:r>
@@ -2027,8 +2023,29 @@
     </w:p>
     <w:p>
       <w:pPr>
-        <w:spacing w:line="480" w:lineRule="auto"/>
+        <w:pStyle w:val="Caption"/>
         <w:jc w:val="center"/>
+      </w:pPr>
+      <w:r>
+        <w:t xml:space="preserve">Figure </w:t>
+      </w:r>
+      <w:fldSimple w:instr=" SEQ Figure \* ARABIC ">
+        <w:r>
+          <w:rPr>
+            <w:noProof/>
+          </w:rPr>
+          <w:t>3</w:t>
+        </w:r>
+      </w:fldSimple>
+      <w:r>
+        <w:t xml:space="preserve"> Rewards and Losses from Training</w:t>
+      </w:r>
+    </w:p>
+    <w:p/>
+    <w:p>
+      <w:pPr>
+        <w:spacing w:line="480" w:lineRule="auto"/>
+        <w:jc w:val="center"/>
         <w:rPr>
           <w:b/>
         </w:rPr>
@@ -2073,11 +2090,11 @@
         <w:ind w:firstLine="720"/>
       </w:pPr>
       <w:r>
-        <w:t xml:space="preserve">Outputs from the model are not human readable – the sequence generated is a collection of high-dimensional vectors. Rather than try and interpret these directly, we recorded the model interacting with the environment and saved the results in mp4 files. These mp4 files have been </w:t>
+        <w:t xml:space="preserve">Outputs from the model are not human readable – the sequence generated is a collection of high-dimensional vectors. Rather than try and interpret these directly, we recorded the model </w:t>
       </w:r>
       <w:r>
         <w:lastRenderedPageBreak/>
-        <w:t xml:space="preserve">included with this project’s </w:t>
+        <w:t xml:space="preserve">interacting with the environment and saved the results in mp4 files. These mp4 files have been included with this project’s </w:t>
       </w:r>
       <w:proofErr w:type="spellStart"/>
       <w:r>
@@ -2091,6 +2108,91 @@
     <w:p>
       <w:pPr>
         <w:spacing w:line="480" w:lineRule="auto"/>
+      </w:pPr>
+    </w:p>
+    <w:p>
+      <w:pPr>
+        <w:keepNext/>
+        <w:spacing w:line="480" w:lineRule="auto"/>
+        <w:jc w:val="center"/>
+      </w:pPr>
+      <w:r>
+        <w:rPr>
+          <w:noProof/>
+        </w:rPr>
+        <w:drawing>
+          <wp:inline distT="0" distB="0" distL="0" distR="0" wp14:anchorId="75A305C0" wp14:editId="5D242E91">
+            <wp:extent cx="3806002" cy="5973745"/>
+            <wp:effectExtent l="0" t="0" r="0" b="0"/>
+            <wp:docPr id="287000187" name="Picture 1"/>
+            <wp:cNvGraphicFramePr>
+              <a:graphicFrameLocks xmlns:a="http://schemas.openxmlformats.org/drawingml/2006/main" noChangeAspect="1"/>
+            </wp:cNvGraphicFramePr>
+            <a:graphic xmlns:a="http://schemas.openxmlformats.org/drawingml/2006/main">
+              <a:graphicData uri="http://schemas.openxmlformats.org/drawingml/2006/picture">
+                <pic:pic xmlns:pic="http://schemas.openxmlformats.org/drawingml/2006/picture">
+                  <pic:nvPicPr>
+                    <pic:cNvPr id="0" name="Picture 1"/>
+                    <pic:cNvPicPr>
+                      <a:picLocks noChangeAspect="1" noChangeArrowheads="1"/>
+                    </pic:cNvPicPr>
+                  </pic:nvPicPr>
+                  <pic:blipFill>
+                    <a:blip r:embed="rId12">
+                      <a:extLst>
+                        <a:ext uri="{28A0092B-C50C-407E-A947-70E740481C1C}">
+                          <a14:useLocalDpi xmlns:a14="http://schemas.microsoft.com/office/drawing/2010/main" val="0"/>
+                        </a:ext>
+                      </a:extLst>
+                    </a:blip>
+                    <a:srcRect/>
+                    <a:stretch>
+                      <a:fillRect/>
+                    </a:stretch>
+                  </pic:blipFill>
+                  <pic:spPr bwMode="auto">
+                    <a:xfrm>
+                      <a:off x="0" y="0"/>
+                      <a:ext cx="3810008" cy="5980033"/>
+                    </a:xfrm>
+                    <a:prstGeom prst="rect">
+                      <a:avLst/>
+                    </a:prstGeom>
+                    <a:noFill/>
+                    <a:ln>
+                      <a:noFill/>
+                    </a:ln>
+                  </pic:spPr>
+                </pic:pic>
+              </a:graphicData>
+            </a:graphic>
+          </wp:inline>
+        </w:drawing>
+      </w:r>
+    </w:p>
+    <w:p>
+      <w:pPr>
+        <w:pStyle w:val="Caption"/>
+        <w:jc w:val="center"/>
+      </w:pPr>
+      <w:r>
+        <w:t xml:space="preserve">Figure </w:t>
+      </w:r>
+      <w:fldSimple w:instr=" SEQ Figure \* ARABIC ">
+        <w:r>
+          <w:rPr>
+            <w:noProof/>
+          </w:rPr>
+          <w:t>4</w:t>
+        </w:r>
+      </w:fldSimple>
+      <w:r>
+        <w:t xml:space="preserve"> Model interacting with Environment</w:t>
+      </w:r>
+    </w:p>
+    <w:p>
+      <w:pPr>
+        <w:spacing w:line="480" w:lineRule="auto"/>
         <w:ind w:firstLine="720"/>
       </w:pPr>
     </w:p>
@@ -2100,7 +2202,11 @@
         <w:ind w:firstLine="720"/>
       </w:pPr>
       <w:r>
-        <w:t>&lt;FIGURE 4: SNAPSHOTS&gt;</w:t>
+        <w:lastRenderedPageBreak/>
+        <w:t xml:space="preserve"> </w:t>
+      </w:r>
+      <w:r>
+        <w:t>While the model is still not able to consistently solve the problem, it is able to perform the key actuations that would be needed to pick up the ball itself. The largest issue is that the system is cloning the locational behavior of the example trajectories – i.e. it is performing the correct hand motions to pick up the ball and move it, but in the wrong locations. This is likely caused by the model overfitting the small number of examples we have.</w:t>
       </w:r>
     </w:p>
     <w:p>
@@ -2108,17 +2214,29 @@
         <w:spacing w:line="480" w:lineRule="auto"/>
         <w:ind w:firstLine="720"/>
       </w:pPr>
+      <w:r>
+        <w:t>Compared to the jerky and random responses of the untrained model, however, this version is still a significant improvement and may still be useful for some applications. We will discuss how this problem could be mitigated further in the Limitations and Future Improvements section.</w:t>
+      </w:r>
     </w:p>
     <w:p>
       <w:pPr>
         <w:spacing w:line="480" w:lineRule="auto"/>
         <w:ind w:firstLine="720"/>
       </w:pPr>
-      <w:r>
-        <w:t xml:space="preserve"> </w:t>
-      </w:r>
-      <w:r>
-        <w:t>While the model is still not able to consistently solve the problem, it is able to perform the key actuations that would be needed to pick up the ball itself. The largest issue is that the system is cloning the locational behavior of the example trajectories – i.e. it is performing the correct hand motions to pick up the ball and move it, but in the wrong locations. This is likely caused by the model overfitting the small number of examples we have.</w:t>
+    </w:p>
+    <w:p>
+      <w:pPr>
+        <w:spacing w:line="480" w:lineRule="auto"/>
+        <w:jc w:val="center"/>
+        <w:rPr>
+          <w:b/>
+        </w:rPr>
+      </w:pPr>
+      <w:r>
+        <w:rPr>
+          <w:b/>
+        </w:rPr>
+        <w:t>Ethical Considerations and Responsible Use</w:t>
       </w:r>
     </w:p>
     <w:p>
@@ -2127,7 +2245,7 @@
         <w:ind w:firstLine="720"/>
       </w:pPr>
       <w:r>
-        <w:t>Compared to the jerky and random responses of the untrained model, however, this version is still a significant improvement and may still be useful for some applications. We will discuss how this problem could be mitigated further in the Limitations and Future Improvements section.</w:t>
+        <w:t>Ethical consideration…</w:t>
       </w:r>
     </w:p>
     <w:p>
@@ -2135,6 +2253,15 @@
         <w:spacing w:line="480" w:lineRule="auto"/>
         <w:ind w:firstLine="720"/>
       </w:pPr>
+      <w:r>
+        <w:t>Responsible use…</w:t>
+      </w:r>
+    </w:p>
+    <w:p>
+      <w:pPr>
+        <w:spacing w:line="480" w:lineRule="auto"/>
+        <w:ind w:firstLine="720"/>
+      </w:pPr>
     </w:p>
     <w:p>
       <w:pPr>
@@ -2148,7 +2275,7 @@
         <w:rPr>
           <w:b/>
         </w:rPr>
-        <w:t>Ethical Considerations and Responsible Use</w:t>
+        <w:t>Limitations and Future Improvements</w:t>
       </w:r>
     </w:p>
     <w:p>
@@ -2157,7 +2284,7 @@
         <w:ind w:firstLine="720"/>
       </w:pPr>
       <w:r>
-        <w:t>Ethical consideration…</w:t>
+        <w:t xml:space="preserve">As can be seen from the videos (and might be expected from the small number of full trajectories) the model has overfit the data. The primary side effect of this is that while it is performing the correct grasp action (which would be locationally invariant), it tends to perform those actions at the wrong locations. </w:t>
       </w:r>
     </w:p>
     <w:p>
@@ -2166,7 +2293,7 @@
         <w:ind w:firstLine="720"/>
       </w:pPr>
       <w:r>
-        <w:t>Responsible use…</w:t>
+        <w:t>One future improvement we could make would be to build a hybrid model. The system knows the positional location of the ball (it is provided as part of the observation vector), rather than allow this system to control the full action space, we could limit it to only learn the grasping action, and use a traditional approach to place the palm of the hand over top of the ball.</w:t>
       </w:r>
     </w:p>
     <w:p>
@@ -2174,50 +2301,8 @@
         <w:spacing w:line="480" w:lineRule="auto"/>
         <w:ind w:firstLine="720"/>
       </w:pPr>
-    </w:p>
-    <w:p>
-      <w:pPr>
-        <w:spacing w:line="480" w:lineRule="auto"/>
-        <w:jc w:val="center"/>
-        <w:rPr>
-          <w:b/>
-        </w:rPr>
-      </w:pPr>
-      <w:r>
-        <w:rPr>
-          <w:b/>
-        </w:rPr>
-        <w:t>Limitations and Future Improvements</w:t>
-      </w:r>
-    </w:p>
-    <w:p>
-      <w:pPr>
-        <w:spacing w:line="480" w:lineRule="auto"/>
-        <w:ind w:firstLine="720"/>
-      </w:pPr>
-      <w:r>
-        <w:t xml:space="preserve">As can be seen from the videos (and might be expected from the small number of full trajectories) the model has overfit the data. The primary side effect of this is that while it is </w:t>
-      </w:r>
       <w:r>
         <w:lastRenderedPageBreak/>
-        <w:t xml:space="preserve">performing the correct grasp action (which would be locationally invariant), it tends to perform those actions at the wrong locations. </w:t>
-      </w:r>
-    </w:p>
-    <w:p>
-      <w:pPr>
-        <w:spacing w:line="480" w:lineRule="auto"/>
-        <w:ind w:firstLine="720"/>
-      </w:pPr>
-      <w:r>
-        <w:t>One future improvement we could make would be to build a hybrid model. The system knows the positional location of the ball (it is provided as part of the observation vector), rather than allow this system to control the full action space, we could limit it to only learn the grasping action, and use a traditional approach to place the palm of the hand over top of the ball.</w:t>
-      </w:r>
-    </w:p>
-    <w:p>
-      <w:pPr>
-        <w:spacing w:line="480" w:lineRule="auto"/>
-        <w:ind w:firstLine="720"/>
-      </w:pPr>
-      <w:r>
         <w:t>We could also take a hybrid approach to training the system. We could split the training into two phases: Phase 1 teaches it to model human actions using the algorithm presented above. In phase 2 we would refine the model using a TD-Learning or Monte Carlo approach, allowing the system to learn from own experiences interacting with the environment.</w:t>
       </w:r>
     </w:p>
@@ -2410,7 +2495,7 @@
         </w:rPr>
         <w:t xml:space="preserve">. </w:t>
       </w:r>
-      <w:hyperlink r:id="rId12" w:tgtFrame="_blank">
+      <w:hyperlink r:id="rId13" w:tgtFrame="_blank">
         <w:r>
           <w:rPr>
             <w:rStyle w:val="Hyperlink"/>
@@ -2585,7 +2670,7 @@
         </w:rPr>
         <w:t xml:space="preserve">, vol. abs/1709.10087, 2017, </w:t>
       </w:r>
-      <w:hyperlink r:id="rId13">
+      <w:hyperlink r:id="rId14">
         <w:r>
           <w:rPr>
             <w:rStyle w:val="Hyperlink"/>
@@ -2691,7 +2776,7 @@
         </w:rPr>
         <w:t xml:space="preserve">, 5998–6008. </w:t>
       </w:r>
-      <w:hyperlink r:id="rId14" w:tgtFrame="_blank">
+      <w:hyperlink r:id="rId15" w:tgtFrame="_blank">
         <w:r>
           <w:rPr>
             <w:rStyle w:val="Hyperlink"/>
@@ -2708,9 +2793,9 @@
       </w:pPr>
     </w:p>
     <w:sectPr>
-      <w:headerReference w:type="even" r:id="rId15"/>
-      <w:headerReference w:type="default" r:id="rId16"/>
-      <w:headerReference w:type="first" r:id="rId17"/>
+      <w:headerReference w:type="even" r:id="rId16"/>
+      <w:headerReference w:type="default" r:id="rId17"/>
+      <w:headerReference w:type="first" r:id="rId18"/>
       <w:pgSz w:w="12240" w:h="15840"/>
       <w:pgMar w:top="1440" w:right="1440" w:bottom="1440" w:left="1440" w:header="720" w:footer="0" w:gutter="0"/>
       <w:pgNumType w:start="1"/>
@@ -3998,6 +4083,7 @@
   <w:style w:type="character" w:default="1" w:styleId="DefaultParagraphFont">
     <w:name w:val="Default Paragraph Font"/>
     <w:uiPriority w:val="1"/>
+    <w:semiHidden/>
     <w:unhideWhenUsed/>
   </w:style>
   <w:style w:type="table" w:default="1" w:styleId="TableNormal">

</xml_diff>

<commit_message>
(update): first draft of report
</commit_message>
<xml_diff>
--- a/Generative_AI_Analysis_Report.docx
+++ b/Generative_AI_Analysis_Report.docx
@@ -250,25 +250,12 @@
         <w:t>2017</w:t>
       </w:r>
       <w:r>
-        <w:t xml:space="preserve">). In the ADROIT Relocate problem, a 24 </w:t>
-      </w:r>
-      <w:proofErr w:type="spellStart"/>
-      <w:r>
-        <w:t>DoF</w:t>
-      </w:r>
-      <w:proofErr w:type="spellEnd"/>
-      <w:r>
-        <w:t xml:space="preserve"> robotic hand is tasked with picking up a small ball off a table and placing it down at a target location.  We control the hand by providing a sequence of joint angles for each of the actuators as well as </w:t>
+        <w:t xml:space="preserve">). In the ADROIT Relocate problem, a 24 DoF robotic hand is tasked with picking up a small ball off a table and placing it down at a target location.  We control the hand by providing a sequence of joint angles for each of the actuators as well as </w:t>
       </w:r>
       <w:r>
         <w:lastRenderedPageBreak/>
-        <w:t xml:space="preserve">positional / rotational angles for the hand’s overall location in the world. For this problem, the D4RL group collected 25 human generated trajectories using a virtual environment combined with a </w:t>
-      </w:r>
-      <w:proofErr w:type="spellStart"/>
-      <w:r>
-        <w:t>CyberGlove</w:t>
-      </w:r>
-      <w:proofErr w:type="spellEnd"/>
+        <w:t>positional / rotational angles for the hand’s overall location in the world. For this problem, the D4RL group collected 25 human generated trajectories using a virtual environment combined with a CyberGlove</w:t>
+      </w:r>
       <w:r>
         <w:rPr>
           <w:rStyle w:val="FootnoteReference"/>
@@ -324,39 +311,7 @@
         <w:ind w:firstLine="720"/>
       </w:pPr>
       <w:r>
-        <w:t xml:space="preserve">As mentioned earlier, actions represent joint angles for the ADROIT Hand. Our system will learn to generate sequences of actions using a Transformer model. Actions are represented as a 30-dimensional vector space. These represent the 24 </w:t>
-      </w:r>
-      <w:proofErr w:type="spellStart"/>
-      <w:r>
-        <w:t>DoF</w:t>
-      </w:r>
-      <w:proofErr w:type="spellEnd"/>
-      <w:r>
-        <w:t xml:space="preserve"> for the hands – 4 </w:t>
-      </w:r>
-      <w:proofErr w:type="spellStart"/>
-      <w:r>
-        <w:t>DoF</w:t>
-      </w:r>
-      <w:proofErr w:type="spellEnd"/>
-      <w:r>
-        <w:t xml:space="preserve"> for the First, Middle, and Ring Fings, 5 </w:t>
-      </w:r>
-      <w:proofErr w:type="spellStart"/>
-      <w:r>
-        <w:t>DoF</w:t>
-      </w:r>
-      <w:proofErr w:type="spellEnd"/>
-      <w:r>
-        <w:t xml:space="preserve"> for the Little Finger, Thumb, 2 </w:t>
-      </w:r>
-      <w:proofErr w:type="spellStart"/>
-      <w:r>
-        <w:t>DoF</w:t>
-      </w:r>
-      <w:proofErr w:type="spellEnd"/>
-      <w:r>
-        <w:t xml:space="preserve"> for the write, 3 values for the hand’s global location (centered at the palm) and 3 values for the hand’s global rotation. All inputs are clipped between [-1, 1].</w:t>
+        <w:t>As mentioned earlier, actions represent joint angles for the ADROIT Hand. Our system will learn to generate sequences of actions using a Transformer model. Actions are represented as a 30-dimensional vector space. These represent the 24 DoF for the hands – 4 DoF for the First, Middle, and Ring Fings, 5 DoF for the Little Finger, Thumb, 2 DoF for the write, 3 values for the hand’s global location (centered at the palm) and 3 values for the hand’s global rotation. All inputs are clipped between [-1, 1].</w:t>
       </w:r>
     </w:p>
     <w:p>
@@ -553,15 +508,7 @@
         <w:spacing w:line="480" w:lineRule="auto"/>
       </w:pPr>
       <w:r>
-        <w:t>Calculated “</w:t>
-      </w:r>
-      <w:proofErr w:type="spellStart"/>
-      <w:r>
-        <w:t>returns_to_go</w:t>
-      </w:r>
-      <w:proofErr w:type="spellEnd"/>
-      <w:r>
-        <w:t>” – the cumulative reward for each timestep of a trajectory.</w:t>
+        <w:t>Calculated “returns_to_go” – the cumulative reward for each timestep of a trajectory.</w:t>
       </w:r>
     </w:p>
     <w:p>
@@ -574,15 +521,7 @@
         <w:spacing w:line="480" w:lineRule="auto"/>
       </w:pPr>
       <w:r>
-        <w:t>Scaled “</w:t>
-      </w:r>
-      <w:proofErr w:type="spellStart"/>
-      <w:r>
-        <w:t>returns_to_go</w:t>
-      </w:r>
-      <w:proofErr w:type="spellEnd"/>
-      <w:r>
-        <w:t>” by 3600 – the average reward humans received when performing this task using the virtual environment.</w:t>
+        <w:t>Scaled “returns_to_go” by 3600 – the average reward humans received when performing this task using the virtual environment.</w:t>
       </w:r>
     </w:p>
     <w:p>
@@ -1132,15 +1071,7 @@
         <w:t xml:space="preserve">if a milestone was predicted in the previous stage, then </w:t>
       </w:r>
       <w:r>
-        <w:t xml:space="preserve">we re-label the </w:t>
-      </w:r>
-      <w:proofErr w:type="spellStart"/>
-      <w:r>
-        <w:t>returns_to_go</w:t>
-      </w:r>
-      <w:proofErr w:type="spellEnd"/>
-      <w:r>
-        <w:t xml:space="preserve"> for that trajectory so that the goal for that run was the sub-goal represented by the milestone we found in stage 1.</w:t>
+        <w:t>we re-label the returns_to_go for that trajectory so that the goal for that run was the sub-goal represented by the milestone we found in stage 1.</w:t>
       </w:r>
     </w:p>
     <w:p>
@@ -1479,15 +1410,7 @@
               <w:cnfStyle w:val="000000000000" w:firstRow="0" w:lastRow="0" w:firstColumn="0" w:lastColumn="0" w:oddVBand="0" w:evenVBand="0" w:oddHBand="0" w:evenHBand="0" w:firstRowFirstColumn="0" w:firstRowLastColumn="0" w:lastRowFirstColumn="0" w:lastRowLastColumn="0"/>
             </w:pPr>
             <w:r>
-              <w:t xml:space="preserve">How many “Attention” blocks the </w:t>
-            </w:r>
-            <w:proofErr w:type="spellStart"/>
-            <w:r>
-              <w:t>Transfomer</w:t>
-            </w:r>
-            <w:proofErr w:type="spellEnd"/>
-            <w:r>
-              <w:t xml:space="preserve"> will have.</w:t>
+              <w:t>How many “Attention” blocks the Transfomer will have.</w:t>
             </w:r>
           </w:p>
         </w:tc>
@@ -1942,11 +1865,9 @@
               <w:spacing w:line="480" w:lineRule="auto"/>
               <w:cnfStyle w:val="000000000000" w:firstRow="0" w:lastRow="0" w:firstColumn="0" w:lastColumn="0" w:oddVBand="0" w:evenVBand="0" w:oddHBand="0" w:evenHBand="0" w:firstRowFirstColumn="0" w:firstRowLastColumn="0" w:lastRowFirstColumn="0" w:lastRowLastColumn="0"/>
             </w:pPr>
-            <w:proofErr w:type="spellStart"/>
             <w:r>
               <w:t>AdamW</w:t>
             </w:r>
-            <w:proofErr w:type="spellEnd"/>
           </w:p>
         </w:tc>
       </w:tr>
@@ -2094,15 +2015,7 @@
       </w:r>
       <w:r>
         <w:lastRenderedPageBreak/>
-        <w:t xml:space="preserve">interacting with the environment and saved the results in mp4 files. These mp4 files have been included with this project’s </w:t>
-      </w:r>
-      <w:proofErr w:type="spellStart"/>
-      <w:r>
-        <w:t>github</w:t>
-      </w:r>
-      <w:proofErr w:type="spellEnd"/>
-      <w:r>
-        <w:t xml:space="preserve"> repo. We recorded four distinct interactions of the model with the environment. Snapshots from each interaction have been collated into figure 4:</w:t>
+        <w:t>interacting with the environment and saved the results in mp4 files. These mp4 files have been included with this project’s github repo. We recorded four distinct interactions of the model with the environment. Snapshots from each interaction have been collated into figure 4:</w:t>
       </w:r>
     </w:p>
     <w:p>
@@ -2245,7 +2158,10 @@
         <w:ind w:firstLine="720"/>
       </w:pPr>
       <w:r>
-        <w:t>Ethical consideration…</w:t>
+        <w:t xml:space="preserve">Even with a more diverse training set to work with, there are safety considerations for deploying this system to a real environment. First, this system can only detect the presence of a single object – it has no way to differentiate that object from a human. This means if the system were deployed on a real robot, there would be a risk of harming nearby humans. </w:t>
+      </w:r>
+      <w:r>
+        <w:t>Also, as we have not modeled the material strength of the ball anywhere, there is also the risk of damaging the very object the model is trained to manipulate.</w:t>
       </w:r>
     </w:p>
     <w:p>
@@ -2254,7 +2170,7 @@
         <w:ind w:firstLine="720"/>
       </w:pPr>
       <w:r>
-        <w:t>Responsible use…</w:t>
+        <w:t>In its present form, the system has only been trained in a virtual environment. While one could experiment with working with the model directly in a real-world environment, it would be best to recollect the relevant training trajectories in the real world. It’s likely that in more complex real-world situations that this system would have a larger number of fail states.</w:t>
       </w:r>
     </w:p>
     <w:p>
@@ -2284,6 +2200,7 @@
         <w:ind w:firstLine="720"/>
       </w:pPr>
       <w:r>
+        <w:lastRenderedPageBreak/>
         <w:t xml:space="preserve">As can be seen from the videos (and might be expected from the small number of full trajectories) the model has overfit the data. The primary side effect of this is that while it is performing the correct grasp action (which would be locationally invariant), it tends to perform those actions at the wrong locations. </w:t>
       </w:r>
     </w:p>
@@ -2302,7 +2219,6 @@
         <w:ind w:firstLine="720"/>
       </w:pPr>
       <w:r>
-        <w:lastRenderedPageBreak/>
         <w:t>We could also take a hybrid approach to training the system. We could split the training into two phases: Phase 1 teaches it to model human actions using the algorithm presented above. In phase 2 we would refine the model using a TD-Learning or Monte Carlo approach, allowing the system to learn from own experiences interacting with the environment.</w:t>
       </w:r>
     </w:p>
@@ -2437,35 +2353,7 @@
         <w:rPr>
           <w:lang w:val="en-CA"/>
         </w:rPr>
-        <w:t xml:space="preserve">Andrychowicz, M., Wolski, F., Ray, A., Schneider, J., Fong, R., </w:t>
-      </w:r>
-      <w:proofErr w:type="spellStart"/>
-      <w:r>
-        <w:rPr>
-          <w:lang w:val="en-CA"/>
-        </w:rPr>
-        <w:t>Welinder</w:t>
-      </w:r>
-      <w:proofErr w:type="spellEnd"/>
-      <w:r>
-        <w:rPr>
-          <w:lang w:val="en-CA"/>
-        </w:rPr>
-        <w:t xml:space="preserve">, P., McGrew, B., Tobin, J., </w:t>
-      </w:r>
-      <w:proofErr w:type="spellStart"/>
-      <w:r>
-        <w:rPr>
-          <w:lang w:val="en-CA"/>
-        </w:rPr>
-        <w:t>Abbeel</w:t>
-      </w:r>
-      <w:proofErr w:type="spellEnd"/>
-      <w:r>
-        <w:rPr>
-          <w:lang w:val="en-CA"/>
-        </w:rPr>
-        <w:t xml:space="preserve">, P., &amp; Zaremba, W. (2017). </w:t>
+        <w:t xml:space="preserve">Andrychowicz, M., Wolski, F., Ray, A., Schneider, J., Fong, R., Welinder, P., McGrew, B., Tobin, J., Abbeel, P., &amp; Zaremba, W. (2017). </w:t>
       </w:r>
       <w:r>
         <w:rPr>
@@ -2479,21 +2367,7 @@
         <w:rPr>
           <w:lang w:val="en-CA"/>
         </w:rPr>
-        <w:t xml:space="preserve">. </w:t>
-      </w:r>
-      <w:proofErr w:type="spellStart"/>
-      <w:r>
-        <w:rPr>
-          <w:lang w:val="en-CA"/>
-        </w:rPr>
-        <w:t>arXiv</w:t>
-      </w:r>
-      <w:proofErr w:type="spellEnd"/>
-      <w:r>
-        <w:rPr>
-          <w:lang w:val="en-CA"/>
-        </w:rPr>
-        <w:t xml:space="preserve">. </w:t>
+        <w:t xml:space="preserve">. arXiv. </w:t>
       </w:r>
       <w:hyperlink r:id="rId13" w:tgtFrame="_blank">
         <w:r>
@@ -2523,35 +2397,7 @@
         <w:rPr>
           <w:lang w:val="en-CA"/>
         </w:rPr>
-        <w:t xml:space="preserve">Chen, L., Lu, K., Rajeswaran, A., Lee, K., Grover, A., Laskin, M., </w:t>
-      </w:r>
-      <w:proofErr w:type="spellStart"/>
-      <w:r>
-        <w:rPr>
-          <w:lang w:val="en-CA"/>
-        </w:rPr>
-        <w:t>Abbeel</w:t>
-      </w:r>
-      <w:proofErr w:type="spellEnd"/>
-      <w:r>
-        <w:rPr>
-          <w:lang w:val="en-CA"/>
-        </w:rPr>
-        <w:t xml:space="preserve">, P., Srinivas, A., &amp; </w:t>
-      </w:r>
-      <w:proofErr w:type="spellStart"/>
-      <w:r>
-        <w:rPr>
-          <w:lang w:val="en-CA"/>
-        </w:rPr>
-        <w:t>Mordatch</w:t>
-      </w:r>
-      <w:proofErr w:type="spellEnd"/>
-      <w:r>
-        <w:rPr>
-          <w:lang w:val="en-CA"/>
-        </w:rPr>
-        <w:t xml:space="preserve">, I. (2021). </w:t>
+        <w:t xml:space="preserve">Chen, L., Lu, K., Rajeswaran, A., Lee, K., Grover, A., Laskin, M., Abbeel, P., Srinivas, A., &amp; Mordatch, I. (2021). </w:t>
       </w:r>
       <w:r>
         <w:rPr>
@@ -2565,21 +2411,7 @@
         <w:rPr>
           <w:lang w:val="en-CA"/>
         </w:rPr>
-        <w:t xml:space="preserve">. </w:t>
-      </w:r>
-      <w:proofErr w:type="spellStart"/>
-      <w:r>
-        <w:rPr>
-          <w:lang w:val="en-CA"/>
-        </w:rPr>
-        <w:t>arXiv</w:t>
-      </w:r>
-      <w:proofErr w:type="spellEnd"/>
-      <w:r>
-        <w:rPr>
-          <w:lang w:val="en-CA"/>
-        </w:rPr>
-        <w:t>. https://doi.org/10.48550/arXiv.2106.01345</w:t>
+        <w:t>. arXiv. https://doi.org/10.48550/arXiv.2106.01345</w:t>
       </w:r>
     </w:p>
     <w:p>
@@ -2617,58 +2449,30 @@
         <w:rPr>
           <w:lang w:val="en-CA"/>
         </w:rPr>
-        <w:t xml:space="preserve">. </w:t>
-      </w:r>
-      <w:proofErr w:type="spellStart"/>
-      <w:r>
+        <w:t>. arXiv. https://doi.org/10.48550/arXiv.2004.07219</w:t>
+      </w:r>
+    </w:p>
+    <w:p>
+      <w:pPr>
+        <w:spacing w:line="480" w:lineRule="auto"/>
         <w:rPr>
           <w:lang w:val="en-CA"/>
         </w:rPr>
-        <w:t>arXiv</w:t>
-      </w:r>
-      <w:proofErr w:type="spellEnd"/>
-      <w:r>
+      </w:pPr>
+    </w:p>
+    <w:p>
+      <w:pPr>
+        <w:spacing w:line="480" w:lineRule="auto"/>
+        <w:ind w:left="720"/>
         <w:rPr>
           <w:lang w:val="en-CA"/>
         </w:rPr>
-        <w:t>. https://doi.org/10.48550/arXiv.2004.07219</w:t>
-      </w:r>
-    </w:p>
-    <w:p>
-      <w:pPr>
-        <w:spacing w:line="480" w:lineRule="auto"/>
+      </w:pPr>
+      <w:r>
         <w:rPr>
           <w:lang w:val="en-CA"/>
         </w:rPr>
-      </w:pPr>
-    </w:p>
-    <w:p>
-      <w:pPr>
-        <w:spacing w:line="480" w:lineRule="auto"/>
-        <w:ind w:left="720"/>
-        <w:rPr>
-          <w:lang w:val="en-CA"/>
-        </w:rPr>
-      </w:pPr>
-      <w:r>
-        <w:rPr>
-          <w:lang w:val="en-CA"/>
-        </w:rPr>
-        <w:t xml:space="preserve">Rajeswaran, Aravind, et al. ‘Learning Complex Dexterous Manipulation with Deep Reinforcement Learning and Demonstrations’. </w:t>
-      </w:r>
-      <w:proofErr w:type="spellStart"/>
-      <w:r>
-        <w:rPr>
-          <w:lang w:val="en-CA"/>
-        </w:rPr>
-        <w:t>CoRR</w:t>
-      </w:r>
-      <w:proofErr w:type="spellEnd"/>
-      <w:r>
-        <w:rPr>
-          <w:lang w:val="en-CA"/>
-        </w:rPr>
-        <w:t xml:space="preserve">, vol. abs/1709.10087, 2017, </w:t>
+        <w:t xml:space="preserve">Rajeswaran, Aravind, et al. ‘Learning Complex Dexterous Manipulation with Deep Reinforcement Learning and Demonstrations’. CoRR, vol. abs/1709.10087, 2017, </w:t>
       </w:r>
       <w:hyperlink r:id="rId14">
         <w:r>
@@ -2700,49 +2504,8 @@
         <w:rPr>
           <w:lang w:val="en-CA"/>
         </w:rPr>
-        <w:t xml:space="preserve">Vaswani, A., </w:t>
-      </w:r>
-      <w:proofErr w:type="spellStart"/>
-      <w:r>
-        <w:rPr>
-          <w:lang w:val="en-CA"/>
-        </w:rPr>
-        <w:t>Shazeer</w:t>
-      </w:r>
-      <w:proofErr w:type="spellEnd"/>
-      <w:r>
-        <w:rPr>
-          <w:lang w:val="en-CA"/>
-        </w:rPr>
-        <w:t xml:space="preserve">, N., Parmar, N., </w:t>
-      </w:r>
-      <w:proofErr w:type="spellStart"/>
-      <w:r>
-        <w:rPr>
-          <w:lang w:val="en-CA"/>
-        </w:rPr>
-        <w:t>Uszkoreit</w:t>
-      </w:r>
-      <w:proofErr w:type="spellEnd"/>
-      <w:r>
-        <w:rPr>
-          <w:lang w:val="en-CA"/>
-        </w:rPr>
-        <w:t xml:space="preserve">, J., Jones, L., Gomez, A. N., Kaiser, Ł., &amp; </w:t>
-      </w:r>
-      <w:proofErr w:type="spellStart"/>
-      <w:r>
-        <w:rPr>
-          <w:lang w:val="en-CA"/>
-        </w:rPr>
-        <w:t>Polosukhin</w:t>
-      </w:r>
-      <w:proofErr w:type="spellEnd"/>
-      <w:r>
-        <w:rPr>
-          <w:lang w:val="en-CA"/>
-        </w:rPr>
-        <w:t xml:space="preserve">, Illia. (2017). Attention is all you need. </w:t>
+        <w:lastRenderedPageBreak/>
+        <w:t xml:space="preserve">Vaswani, A., Shazeer, N., Parmar, N., Uszkoreit, J., Jones, L., Gomez, A. N., Kaiser, Ł., &amp; Polosukhin, Illia. (2017). Attention is all you need. </w:t>
       </w:r>
       <w:r>
         <w:rPr>
@@ -2750,25 +2513,7 @@
           <w:iCs/>
           <w:lang w:val="en-CA"/>
         </w:rPr>
-        <w:t>Advances in Neural Information Processing Systems (</w:t>
-      </w:r>
-      <w:proofErr w:type="spellStart"/>
-      <w:r>
-        <w:rPr>
-          <w:i/>
-          <w:iCs/>
-          <w:lang w:val="en-CA"/>
-        </w:rPr>
-        <w:t>NeurIPS</w:t>
-      </w:r>
-      <w:proofErr w:type="spellEnd"/>
-      <w:r>
-        <w:rPr>
-          <w:i/>
-          <w:iCs/>
-          <w:lang w:val="en-CA"/>
-        </w:rPr>
-        <w:t>)</w:t>
+        <w:t>Advances in Neural Information Processing Systems (NeurIPS)</w:t>
       </w:r>
       <w:r>
         <w:rPr>
@@ -2859,45 +2604,18 @@
       <w:r>
         <w:t xml:space="preserve"> </w:t>
       </w:r>
-      <w:proofErr w:type="spellStart"/>
-      <w:r>
-        <w:t>CyberGlove</w:t>
-      </w:r>
-      <w:proofErr w:type="spellEnd"/>
-      <w:r>
-        <w:t xml:space="preserve"> III</w:t>
+      <w:r>
+        <w:t>CyberGlove III</w:t>
       </w:r>
       <w:r>
         <w:t xml:space="preserve"> </w:t>
       </w:r>
       <w:hyperlink r:id="rId1" w:history="1">
-        <w:proofErr w:type="spellStart"/>
         <w:r>
           <w:rPr>
             <w:rStyle w:val="Hyperlink"/>
           </w:rPr>
-          <w:t>CyberGlove</w:t>
-        </w:r>
-        <w:proofErr w:type="spellEnd"/>
-        <w:r>
-          <w:rPr>
-            <w:rStyle w:val="Hyperlink"/>
-          </w:rPr>
-          <w:t xml:space="preserve"> III — </w:t>
-        </w:r>
-        <w:proofErr w:type="spellStart"/>
-        <w:r>
-          <w:rPr>
-            <w:rStyle w:val="Hyperlink"/>
-          </w:rPr>
-          <w:t>CyberGlove</w:t>
-        </w:r>
-        <w:proofErr w:type="spellEnd"/>
-        <w:r>
-          <w:rPr>
-            <w:rStyle w:val="Hyperlink"/>
-          </w:rPr>
-          <w:t xml:space="preserve"> Systems LLC</w:t>
+          <w:t>CyberGlove III — CyberGlove Systems LLC</w:t>
         </w:r>
       </w:hyperlink>
     </w:p>

</xml_diff>